<commit_message>
fix: actualiza el perfil del docente con los datos reales de su Curriculum Vitae
</commit_message>
<xml_diff>
--- a/Guia_Aprendizaje_General_V2.docx
+++ b/Guia_Aprendizaje_General_V2.docx
@@ -353,7 +353,7 @@
         </w:rPr>
       </w:pPr>
       <w:r>
-        <w:t>Presentación: Ingeniero y especialista en Ciencia de Datos. Apasionado por la inteligencia de negocios, la analítica de datos y la formación de profesionales Data-Driven. Mi objetivo en este curso es cerrar la brecha entre los aspectos puramente técnicos y la estrategia de negocios, enseñándoles no solo a construir tableros o mover datos, sino a contar historias persuasivas que resuelvan problemas organizacionales reales.</w:t>
+        <w:t>Presentación: Magíster en Física y Coordinador del programa de Ciencia de Datos en la UNAB. Poseo amplia experiencia en investigación cuantitativa (Óptica Cuántica, Análisis Multidimensional) y desarrollo tecnológico (Python, Machine Learning, Power BI, Thick Data). Mi objetivo en este curso es transmitirles una visión integral sobre cómo la Ciencia de Datos y la Inteligencia de Negocios se fusionan para resolver problemas organizacionales complejos, basándonos en metodologías rigurosas y storytelling efectivo.</w:t>
       </w:r>
     </w:p>
     <w:p>
@@ -366,9 +366,11 @@
       <w:r>
         <w:t>Enlaces a perfiles profesionales:</w:t>
         <w:br/>
-        <w:t>- LinkedIn: https://www.linkedin.com/in/dudbil-pabon-riano/</w:t>
+        <w:t>- LinkedIn: https://www.linkedin.com/in/dudbil-pabon-26b24a92/</w:t>
         <w:br/>
-        <w:t>- GitHub: https://github.com/dudbil</w:t>
+        <w:t>- Google Scholar: https://scholar.google.com/citations?user=HMVbVhcAAAAJ</w:t>
+        <w:br/>
+        <w:t>- ORCID: 0000-0001-7239-3497</w:t>
       </w:r>
     </w:p>
     <w:p>

</xml_diff>

<commit_message>
feat: add slide for structured vs unstructured data to align with learning guide
</commit_message>
<xml_diff>
--- a/Guia_Aprendizaje_General_V2.docx
+++ b/Guia_Aprendizaje_General_V2.docx
@@ -1,6 +1,6 @@
 
 <file path=word/document.xml><?xml version="1.0" encoding="utf-8"?>
-<w:document xmlns:wpc="http://schemas.microsoft.com/office/word/2010/wordprocessingCanvas" xmlns:cx="http://schemas.microsoft.com/office/drawing/2014/chartex" xmlns:cx1="http://schemas.microsoft.com/office/drawing/2015/9/8/chartex" xmlns:cx2="http://schemas.microsoft.com/office/drawing/2015/10/21/chartex" xmlns:cx3="http://schemas.microsoft.com/office/drawing/2016/5/9/chartex" xmlns:cx4="http://schemas.microsoft.com/office/drawing/2016/5/10/chartex" xmlns:cx5="http://schemas.microsoft.com/office/drawing/2016/5/11/chartex" xmlns:cx6="http://schemas.microsoft.com/office/drawing/2016/5/12/chartex" xmlns:cx7="http://schemas.microsoft.com/office/drawing/2016/5/13/chartex" xmlns:cx8="http://schemas.microsoft.com/office/drawing/2016/5/14/chartex" xmlns:mc="http://schemas.openxmlformats.org/markup-compatibility/2006" xmlns:aink="http://schemas.microsoft.com/office/drawing/2016/ink" xmlns:am3d="http://schemas.microsoft.com/office/drawing/2017/model3d" xmlns:o="urn:schemas-microsoft-com:office:office" xmlns:oel="http://schemas.microsoft.com/office/2019/extlst" xmlns:r="http://schemas.openxmlformats.org/officeDocument/2006/relationships" xmlns:m="http://schemas.openxmlformats.org/officeDocument/2006/math" xmlns:v="urn:schemas-microsoft-com:vml" xmlns:wp14="http://schemas.microsoft.com/office/word/2010/wordprocessingDrawing" xmlns:wp="http://schemas.openxmlformats.org/drawingml/2006/wordprocessingDrawing" xmlns:w10="urn:schemas-microsoft-com:office:word" xmlns:w="http://schemas.openxmlformats.org/wordprocessingml/2006/main" xmlns:w14="http://schemas.microsoft.com/office/word/2010/wordml" xmlns:w15="http://schemas.microsoft.com/office/word/2012/wordml" xmlns:w16cex="http://schemas.microsoft.com/office/word/2018/wordml/cex" xmlns:w16cid="http://schemas.microsoft.com/office/word/2016/wordml/cid" xmlns:w16="http://schemas.microsoft.com/office/word/2018/wordml" xmlns:w16du="http://schemas.microsoft.com/office/word/2023/wordml/word16du" xmlns:w16sdtdh="http://schemas.microsoft.com/office/word/2020/wordml/sdtdatahash" xmlns:w16sdtfl="http://schemas.microsoft.com/office/word/2024/wordml/sdtformatlock" xmlns:w16se="http://schemas.microsoft.com/office/word/2015/wordml/symex" xmlns:wpg="http://schemas.microsoft.com/office/word/2010/wordprocessingGroup" xmlns:wpi="http://schemas.microsoft.com/office/word/2010/wordprocessingInk" xmlns:wne="http://schemas.microsoft.com/office/word/2006/wordml" xmlns:wps="http://schemas.microsoft.com/office/word/2010/wordprocessingShape" mc:Ignorable="w14 w15 w16se w16cid w16 w16cex w16sdtdh w16sdtfl w16du wp14">
+<w:document xmlns:wpc="http://schemas.microsoft.com/office/word/2010/wordprocessingCanvas" xmlns:cx="http://schemas.microsoft.com/office/drawing/2014/chartex" xmlns:cx1="http://schemas.microsoft.com/office/drawing/2015/9/8/chartex" xmlns:cx2="http://schemas.microsoft.com/office/drawing/2015/10/21/chartex" xmlns:cx3="http://schemas.microsoft.com/office/drawing/2016/5/9/chartex" xmlns:cx4="http://schemas.microsoft.com/office/drawing/2016/5/10/chartex" xmlns:cx5="http://schemas.microsoft.com/office/drawing/2016/5/11/chartex" xmlns:cx6="http://schemas.microsoft.com/office/drawing/2016/5/12/chartex" xmlns:cx7="http://schemas.microsoft.com/office/drawing/2016/5/13/chartex" xmlns:cx8="http://schemas.microsoft.com/office/drawing/2016/5/14/chartex" xmlns:mc="http://schemas.openxmlformats.org/markup-compatibility/2006" xmlns:aink="http://schemas.microsoft.com/office/drawing/2016/ink" xmlns:am3d="http://schemas.microsoft.com/office/drawing/2017/model3d" xmlns:o="urn:schemas-microsoft-com:office:office" xmlns:oel="http://schemas.microsoft.com/office/2019/extlst" xmlns:r="http://schemas.openxmlformats.org/officeDocument/2006/relationships" xmlns:m="http://schemas.openxmlformats.org/officeDocument/2006/math" xmlns:v="urn:schemas-microsoft-com:vml" xmlns:wp14="http://schemas.microsoft.com/office/word/2010/wordprocessingDrawing" xmlns:wp="http://schemas.openxmlformats.org/drawingml/2006/wordprocessingDrawing" xmlns:w10="urn:schemas-microsoft-com:office:word" xmlns:w="http://schemas.openxmlformats.org/wordprocessingml/2006/main" xmlns:w14="http://schemas.microsoft.com/office/word/2010/wordml" xmlns:w15="http://schemas.microsoft.com/office/word/2012/wordml" xmlns:w16cei="http://schemas.microsoft.com/office/word/2026/wordml/cei" xmlns:w16cex="http://schemas.microsoft.com/office/word/2018/wordml/cex" xmlns:w16cid="http://schemas.microsoft.com/office/word/2016/wordml/cid" xmlns:w16="http://schemas.microsoft.com/office/word/2018/wordml" xmlns:w16du="http://schemas.microsoft.com/office/word/2023/wordml/word16du" xmlns:w16sdtdh="http://schemas.microsoft.com/office/word/2020/wordml/sdtdatahash" xmlns:w16sdtfl="http://schemas.microsoft.com/office/word/2024/wordml/sdtformatlock" xmlns:w16se="http://schemas.microsoft.com/office/word/2015/wordml/symex" xmlns:wpg="http://schemas.microsoft.com/office/word/2010/wordprocessingGroup" xmlns:wpi="http://schemas.microsoft.com/office/word/2010/wordprocessingInk" xmlns:wne="http://schemas.microsoft.com/office/word/2006/wordml" xmlns:wps="http://schemas.microsoft.com/office/word/2010/wordprocessingShape" mc:Ignorable="w14 w15 w16se w16cid w16 w16cex w16sdtdh w16sdtfl w16du wp14">
   <w:body>
     <w:p>
       <w:pPr>
@@ -127,6 +127,16 @@
               </w:rPr>
               <w:t>:</w:t>
             </w:r>
+            <w:r>
+              <w:rPr>
+                <w:b/>
+                <w:bCs/>
+              </w:rPr>
+              <w:t xml:space="preserve"> </w:t>
+            </w:r>
+            <w:r>
+              <w:t>2026-2</w:t>
+            </w:r>
           </w:p>
         </w:tc>
       </w:tr>
@@ -147,7 +157,51 @@
           </w:tcPr>
           <w:p>
             <w:r>
-              <w:t>Horario de atención a estudiantes: Miércoles de 4:00 PM a 6:00 PM (Modalidad Virtual vía Teams previo aviso).</w:t>
+              <w:t xml:space="preserve">Horario de atención a estudiantes: </w:t>
+            </w:r>
+            <w:r>
+              <w:t xml:space="preserve">martes </w:t>
+            </w:r>
+            <w:r>
+              <w:t xml:space="preserve">de </w:t>
+            </w:r>
+            <w:r>
+              <w:t>10:00</w:t>
+            </w:r>
+            <w:r>
+              <w:t xml:space="preserve"> </w:t>
+            </w:r>
+            <w:r>
+              <w:t>a. m.</w:t>
+            </w:r>
+            <w:r>
+              <w:t xml:space="preserve"> a </w:t>
+            </w:r>
+            <w:r>
+              <w:t>11</w:t>
+            </w:r>
+            <w:r>
+              <w:t xml:space="preserve">:00 </w:t>
+            </w:r>
+            <w:r>
+              <w:t>a. m.</w:t>
+            </w:r>
+            <w:r>
+              <w:t xml:space="preserve"> </w:t>
+            </w:r>
+            <w:r>
+              <w:t xml:space="preserve">y </w:t>
+            </w:r>
+            <w:proofErr w:type="spellStart"/>
+            <w:r>
+              <w:t>miercole</w:t>
+            </w:r>
+            <w:r>
+              <w:t>s</w:t>
+            </w:r>
+            <w:proofErr w:type="spellEnd"/>
+            <w:r>
+              <w:t xml:space="preserve"> de 10:00 a. m. a 11:00 a. m.</w:t>
             </w:r>
           </w:p>
         </w:tc>
@@ -322,6 +376,8 @@
           <w:p>
             <w:r>
               <w:t>Horas de Trabajo Independiente: 6</w:t>
+            </w:r>
+            <w:r>
               <w:br/>
             </w:r>
           </w:p>
@@ -343,17 +399,42 @@
         </w:rPr>
       </w:pPr>
       <w:r>
-        <w:t>Profesor (a): Dudbil Olvasada Pabon Riaño</w:t>
+        <w:t xml:space="preserve">Profesor (a): Dudbil </w:t>
+      </w:r>
+      <w:proofErr w:type="spellStart"/>
+      <w:r>
+        <w:t>Olvasada</w:t>
+      </w:r>
+      <w:proofErr w:type="spellEnd"/>
+      <w:r>
+        <w:t xml:space="preserve"> Pabon Riaño</w:t>
       </w:r>
     </w:p>
     <w:p>
       <w:pPr>
+        <w:jc w:val="both"/>
         <w:rPr>
           <w:color w:val="A6A6A6" w:themeColor="background1" w:themeShade="A6"/>
         </w:rPr>
       </w:pPr>
       <w:r>
-        <w:t>Presentación: Magíster en Física y Coordinador del programa de Ciencia de Datos en la UNAB. Poseo amplia experiencia en investigación cuantitativa (Óptica Cuántica, Análisis Multidimensional) y desarrollo tecnológico (Python, Machine Learning, Power BI, Thick Data). Mi objetivo en este curso es transmitirles una visión integral sobre cómo la Ciencia de Datos y la Inteligencia de Negocios se fusionan para resolver problemas organizacionales complejos, basándonos en metodologías rigurosas y storytelling efectivo.</w:t>
+        <w:t xml:space="preserve">Presentación: Magíster en Física y Coordinador del programa de Ciencia de Datos en la UNAB. Poseo amplia experiencia en investigación cuantitativa (Óptica Cuántica, Análisis Multidimensional) y desarrollo tecnológico (Python, Machine </w:t>
+      </w:r>
+      <w:proofErr w:type="spellStart"/>
+      <w:r>
+        <w:t>Learning</w:t>
+      </w:r>
+      <w:proofErr w:type="spellEnd"/>
+      <w:r>
+        <w:t xml:space="preserve">, Power BI, Thick Data). Mi objetivo en este curso es transmitirles una visión integral sobre cómo la Ciencia de Datos y la Inteligencia de Negocios se fusionan para resolver problemas organizacionales complejos, basándonos en metodologías rigurosas y </w:t>
+      </w:r>
+      <w:proofErr w:type="spellStart"/>
+      <w:r>
+        <w:t>storytelling</w:t>
+      </w:r>
+      <w:proofErr w:type="spellEnd"/>
+      <w:r>
+        <w:t xml:space="preserve"> efectivo.</w:t>
       </w:r>
     </w:p>
     <w:p>
@@ -361,14 +442,61 @@
         <w:rPr>
           <w:b/>
           <w:bCs/>
-        </w:rPr>
-      </w:pPr>
-      <w:r>
-        <w:t>Enlaces a perfiles profesionales:</w:t>
+          <w:lang w:val="en-US"/>
+        </w:rPr>
+      </w:pPr>
+      <w:r>
+        <w:rPr>
+          <w:lang w:val="en-US"/>
+        </w:rPr>
+        <w:t xml:space="preserve">Enlaces a </w:t>
+      </w:r>
+      <w:proofErr w:type="spellStart"/>
+      <w:r>
+        <w:rPr>
+          <w:lang w:val="en-US"/>
+        </w:rPr>
+        <w:t>perfiles</w:t>
+      </w:r>
+      <w:proofErr w:type="spellEnd"/>
+      <w:r>
+        <w:rPr>
+          <w:lang w:val="en-US"/>
+        </w:rPr>
+        <w:t xml:space="preserve"> </w:t>
+      </w:r>
+      <w:proofErr w:type="spellStart"/>
+      <w:r>
+        <w:rPr>
+          <w:lang w:val="en-US"/>
+        </w:rPr>
+        <w:t>profesionales</w:t>
+      </w:r>
+      <w:proofErr w:type="spellEnd"/>
+      <w:r>
+        <w:rPr>
+          <w:lang w:val="en-US"/>
+        </w:rPr>
+        <w:t>:</w:t>
+      </w:r>
+      <w:r>
+        <w:rPr>
+          <w:lang w:val="en-US"/>
+        </w:rPr>
         <w:br/>
         <w:t>- LinkedIn: https://www.linkedin.com/in/dudbil-pabon-26b24a92/</w:t>
+      </w:r>
+      <w:r>
+        <w:rPr>
+          <w:lang w:val="en-US"/>
+        </w:rPr>
         <w:br/>
         <w:t>- Google Scholar: https://scholar.google.com/citations?user=HMVbVhcAAAAJ</w:t>
+      </w:r>
+      <w:r>
+        <w:rPr>
+          <w:lang w:val="en-US"/>
+        </w:rPr>
         <w:br/>
         <w:t>- ORCID: 0000-0001-7239-3497</w:t>
       </w:r>
@@ -400,6 +528,23 @@
           <w:bCs/>
         </w:rPr>
         <w:t>De qué trata este curso y por qué es importante?</w:t>
+      </w:r>
+    </w:p>
+    <w:p>
+      <w:pPr>
+        <w:spacing w:after="0"/>
+        <w:jc w:val="both"/>
+      </w:pPr>
+      <w:r>
+        <w:t xml:space="preserve">Este curso tiene como propósito fundamental desarrollar en los estudiantes la capacidad técnica y estratégica para transformar datos crudos en información útil para la toma de decisiones empresariales de alto nivel. A través del uso de ecosistemas modernos de Inteligencia de Negocios (BI) como Power BI y SQL, los estudiantes aprenderán a diseñar arquitecturas de integración de datos (ETL), modelar esquemas relacionales escalables (Data </w:t>
+      </w:r>
+      <w:proofErr w:type="spellStart"/>
+      <w:r>
+        <w:t>Warehouses</w:t>
+      </w:r>
+      <w:proofErr w:type="spellEnd"/>
+      <w:r>
+        <w:t xml:space="preserve"> / Data Marts) y desarrollar visualizaciones interactivas.</w:t>
       </w:r>
     </w:p>
     <w:p>
@@ -413,10 +558,48 @@
         </w:rPr>
       </w:pPr>
       <w:r>
-        <w:t>Este curso tiene como propósito fundamental desarrollar en los estudiantes la capacidad técnica y estratégica para transformar datos crudos en información útil para la toma de decisiones empresariales de alto nivel. A través del uso de ecosistemas modernos de Inteligencia de Negocios (BI) como Power BI y SQL, los estudiantes aprenderán a diseñar arquitecturas de integración de datos (ETL), modelar esquemas relacionales escalables (Data Warehouses / Data Marts) y desarrollar visualizaciones interactivas.</w:t>
         <w:br/>
-        <w:br/>
-        <w:t>Más allá de la técnica, el curso tiene un enfoque gerencial y de comunicación. Inspirados en los principios de 'Storytelling with Data', los estudiantes aprenderán a interpretar métricas clave (KPIs), aplicar principios de diseño (Gestalt, Decluttering) para crear Dashboards de alto impacto y comunicar hallazgos de manera efectiva a públicos no técnicos, conectando la analítica descriptiva y predictiva con la estrategia corporativa.</w:t>
+        <w:t>Más allá de la técnica, el curso tiene un enfoque gerencial y de comunicación. Inspirados en los principios de '</w:t>
+      </w:r>
+      <w:proofErr w:type="spellStart"/>
+      <w:r>
+        <w:t>Storytelling</w:t>
+      </w:r>
+      <w:proofErr w:type="spellEnd"/>
+      <w:r>
+        <w:t xml:space="preserve"> </w:t>
+      </w:r>
+      <w:proofErr w:type="spellStart"/>
+      <w:r>
+        <w:t>with</w:t>
+      </w:r>
+      <w:proofErr w:type="spellEnd"/>
+      <w:r>
+        <w:t xml:space="preserve"> Data', los estudiantes aprenderán a interpretar métricas clave (</w:t>
+      </w:r>
+      <w:proofErr w:type="spellStart"/>
+      <w:r>
+        <w:t>KPIs</w:t>
+      </w:r>
+      <w:proofErr w:type="spellEnd"/>
+      <w:r>
+        <w:t xml:space="preserve">), aplicar principios de diseño (Gestalt, </w:t>
+      </w:r>
+      <w:proofErr w:type="spellStart"/>
+      <w:r>
+        <w:t>Decluttering</w:t>
+      </w:r>
+      <w:proofErr w:type="spellEnd"/>
+      <w:r>
+        <w:t xml:space="preserve">) para crear </w:t>
+      </w:r>
+      <w:proofErr w:type="spellStart"/>
+      <w:r>
+        <w:t>Dashboards</w:t>
+      </w:r>
+      <w:proofErr w:type="spellEnd"/>
+      <w:r>
+        <w:t xml:space="preserve"> de alto impacto y comunicar hallazgos de manera efectiva a públicos no técnicos, conectando la analítica descriptiva y predictiva con la estrategia corporativa.</w:t>
       </w:r>
     </w:p>
     <w:p>
@@ -474,7 +657,7 @@
     </w:p>
     <w:p>
       <w:pPr>
-        <w:pStyle w:val="Prrafodelista"/>
+        <w:pStyle w:val="ListParagraph"/>
         <w:numPr>
           <w:ilvl w:val="0"/>
           <w:numId w:val="18"/>
@@ -520,7 +703,7 @@
         <w:sdtContent>
           <w:r>
             <w:rPr>
-              <w:rStyle w:val="Textodelmarcadordeposicin"/>
+              <w:rStyle w:val="PlaceholderText"/>
             </w:rPr>
             <w:t>Elija un elemento.</w:t>
           </w:r>
@@ -529,7 +712,7 @@
     </w:p>
     <w:p>
       <w:pPr>
-        <w:pStyle w:val="Prrafodelista"/>
+        <w:pStyle w:val="ListParagraph"/>
         <w:numPr>
           <w:ilvl w:val="0"/>
           <w:numId w:val="17"/>
@@ -542,12 +725,54 @@
       </w:pPr>
       <w:r>
         <w:t>Competencias Disciplinares:</w:t>
+      </w:r>
+      <w:r>
         <w:br/>
         <w:t>1. Integra y transforma datos provenientes de diversas fuentes organizacionales (estructuradas y no estructuradas) mediante procesos ETL, para generar información confiable que apoye la toma de decisiones.</w:t>
+      </w:r>
+      <w:r>
         <w:br/>
-        <w:t>2. Desarrolla visualizaciones dinámicas, reportes y dashboards utilizando herramientas líderes de BI (ej. Power BI), enfocadas en el seguimiento riguroso de Indicadores Clave de Desempeño (KPIs).</w:t>
+        <w:t xml:space="preserve">2. Desarrolla visualizaciones dinámicas, reportes y </w:t>
+      </w:r>
+      <w:proofErr w:type="spellStart"/>
+      <w:r>
+        <w:t>dashboards</w:t>
+      </w:r>
+      <w:proofErr w:type="spellEnd"/>
+      <w:r>
+        <w:t xml:space="preserve"> utilizando herramientas líderes de BI (ej. Power </w:t>
+      </w:r>
+      <w:r>
+        <w:lastRenderedPageBreak/>
+        <w:t>BI), enfocadas en el seguimiento riguroso de Indicadores Clave de Desempeño (</w:t>
+      </w:r>
+      <w:proofErr w:type="spellStart"/>
+      <w:r>
+        <w:t>KPIs</w:t>
+      </w:r>
+      <w:proofErr w:type="spellEnd"/>
+      <w:r>
+        <w:t>).</w:t>
+      </w:r>
+      <w:r>
         <w:br/>
-        <w:t>3. Comunica hallazgos analíticos a públicos gerenciales mediante narrativas visuales basadas en datos (Storytelling with Data), adaptando el lenguaje técnico a contextos de negocio.</w:t>
+        <w:t>3. Comunica hallazgos analíticos a públicos gerenciales mediante narrativas visuales basadas en datos (</w:t>
+      </w:r>
+      <w:proofErr w:type="spellStart"/>
+      <w:r>
+        <w:t>Storytelling</w:t>
+      </w:r>
+      <w:proofErr w:type="spellEnd"/>
+      <w:r>
+        <w:t xml:space="preserve"> </w:t>
+      </w:r>
+      <w:proofErr w:type="spellStart"/>
+      <w:r>
+        <w:t>with</w:t>
+      </w:r>
+      <w:proofErr w:type="spellEnd"/>
+      <w:r>
+        <w:t xml:space="preserve"> Data), adaptando el lenguaje técnico a contextos de negocio.</w:t>
       </w:r>
     </w:p>
     <w:p>
@@ -559,11 +784,40 @@
         </w:rPr>
       </w:pPr>
       <w:r>
-        <w:t>3. ¿Es un curso tipo EHLE? Sí___ No_X_</w:t>
+        <w:t xml:space="preserve">3. ¿Es un curso tipo EHLE? Sí___ </w:t>
+      </w:r>
+      <w:proofErr w:type="spellStart"/>
+      <w:r>
+        <w:t>No_X</w:t>
+      </w:r>
+      <w:proofErr w:type="spellEnd"/>
+      <w:r>
+        <w:t>_</w:t>
       </w:r>
     </w:p>
     <w:p>
       <w:pPr>
+        <w:rPr>
+          <w:b/>
+          <w:bCs/>
+          <w:color w:val="000000" w:themeColor="text1"/>
+        </w:rPr>
+      </w:pPr>
+      <w:r>
+        <w:t xml:space="preserve">4. ¿Este curso integra recursos o actividades en inglés?  </w:t>
+      </w:r>
+      <w:proofErr w:type="spellStart"/>
+      <w:r>
+        <w:t>Sí_X</w:t>
+      </w:r>
+      <w:proofErr w:type="spellEnd"/>
+      <w:r>
+        <w:t>_ No___</w:t>
+      </w:r>
+    </w:p>
+    <w:p>
+      <w:pPr>
+        <w:jc w:val="both"/>
         <w:rPr>
           <w:i/>
           <w:iCs/>
@@ -571,133 +825,69 @@
         </w:rPr>
       </w:pPr>
       <w:r>
-        <w:rPr>
-          <w:i/>
-          <w:iCs/>
-          <w:color w:val="A6A6A6" w:themeColor="background1" w:themeShade="A6"/>
-        </w:rPr>
-        <w:t xml:space="preserve">Recuerde que </w:t>
-      </w:r>
-      <w:r>
-        <w:rPr>
-          <w:i/>
-          <w:iCs/>
-          <w:color w:val="A6A6A6" w:themeColor="background1" w:themeShade="A6"/>
-        </w:rPr>
-        <w:t xml:space="preserve">los cursos tipo EHLE </w:t>
-      </w:r>
-      <w:r>
-        <w:rPr>
-          <w:i/>
-          <w:iCs/>
-          <w:color w:val="A6A6A6" w:themeColor="background1" w:themeShade="A6"/>
-        </w:rPr>
-        <w:t xml:space="preserve">son aquellos </w:t>
-      </w:r>
-      <w:r>
-        <w:rPr>
-          <w:i/>
-          <w:iCs/>
-          <w:color w:val="A6A6A6" w:themeColor="background1" w:themeShade="A6"/>
-        </w:rPr>
-        <w:t>en los que se rediseñan los aspectos</w:t>
-      </w:r>
-      <w:r>
-        <w:rPr>
-          <w:i/>
-          <w:iCs/>
-          <w:color w:val="A6A6A6" w:themeColor="background1" w:themeShade="A6"/>
-        </w:rPr>
-        <w:t xml:space="preserve"> disciplinares</w:t>
-      </w:r>
-      <w:r>
-        <w:rPr>
-          <w:i/>
-          <w:iCs/>
-          <w:color w:val="A6A6A6" w:themeColor="background1" w:themeShade="A6"/>
-        </w:rPr>
-        <w:t xml:space="preserve"> in</w:t>
-      </w:r>
-      <w:r>
-        <w:rPr>
-          <w:i/>
-          <w:iCs/>
-          <w:color w:val="A6A6A6" w:themeColor="background1" w:themeShade="A6"/>
-        </w:rPr>
-        <w:t xml:space="preserve">tegrando la </w:t>
-      </w:r>
-      <w:r>
-        <w:rPr>
-          <w:i/>
-          <w:iCs/>
-          <w:color w:val="A6A6A6" w:themeColor="background1" w:themeShade="A6"/>
-        </w:rPr>
-        <w:t xml:space="preserve">didáctica de la escucha, el habla, la lectura y la escritura </w:t>
-      </w:r>
-      <w:r>
-        <w:rPr>
-          <w:i/>
-          <w:iCs/>
-          <w:color w:val="A6A6A6" w:themeColor="background1" w:themeShade="A6"/>
-        </w:rPr>
-        <w:t>para fortalecer de manera intencionada las competencias comunicativas de los estudiantes.</w:t>
+        <w:t xml:space="preserve">Se implementará la estrategia EMI (English Medium </w:t>
+      </w:r>
+      <w:proofErr w:type="spellStart"/>
+      <w:r>
+        <w:t>Instruction</w:t>
+      </w:r>
+      <w:proofErr w:type="spellEnd"/>
+      <w:r>
+        <w:t xml:space="preserve">) durante 10 a 15 minutos en cada sesión presencial. Esto incluirá lectura de bibliografía especializada (Sharda et al., </w:t>
+      </w:r>
+      <w:proofErr w:type="spellStart"/>
+      <w:r>
+        <w:t>Knaflic</w:t>
+      </w:r>
+      <w:proofErr w:type="spellEnd"/>
+      <w:r>
+        <w:t xml:space="preserve">), análisis de glosario técnico (Data </w:t>
+      </w:r>
+      <w:proofErr w:type="spellStart"/>
+      <w:r>
+        <w:t>Warehouse</w:t>
+      </w:r>
+      <w:proofErr w:type="spellEnd"/>
+      <w:r>
+        <w:t xml:space="preserve">, ETL, OLAP, </w:t>
+      </w:r>
+      <w:proofErr w:type="spellStart"/>
+      <w:r>
+        <w:t>Insights</w:t>
+      </w:r>
+      <w:proofErr w:type="spellEnd"/>
+      <w:r>
+        <w:t xml:space="preserve">) y </w:t>
+      </w:r>
+      <w:proofErr w:type="spellStart"/>
+      <w:r>
+        <w:t>quizzes</w:t>
+      </w:r>
+      <w:proofErr w:type="spellEnd"/>
+      <w:r>
+        <w:t xml:space="preserve"> interactivos en inglés para fomentar el bilingüismo en entornos corporativos globales.</w:t>
       </w:r>
     </w:p>
     <w:p>
       <w:pPr>
         <w:rPr>
-          <w:i/>
-          <w:iCs/>
-          <w:color w:val="A6A6A6" w:themeColor="background1" w:themeShade="A6"/>
-        </w:rPr>
-      </w:pPr>
-      <w:r/>
+          <w:b/>
+          <w:bCs/>
+        </w:rPr>
+      </w:pPr>
     </w:p>
     <w:p>
       <w:pPr>
         <w:rPr>
           <w:b/>
           <w:bCs/>
-          <w:color w:val="000000" w:themeColor="text1"/>
-        </w:rPr>
-      </w:pPr>
-      <w:r>
-        <w:t>4. ¿Este curso integra recursos o actividades en inglés?  Sí_X_ No___</w:t>
-      </w:r>
-    </w:p>
-    <w:p>
-      <w:pPr>
-        <w:rPr>
-          <w:i/>
-          <w:iCs/>
-          <w:color w:val="A6A6A6" w:themeColor="background1" w:themeShade="A6"/>
-        </w:rPr>
-      </w:pPr>
-      <w:r>
-        <w:t>Se implementará la estrategia EMI (English Medium Instruction) durante 10 a 15 minutos en cada sesión presencial. Esto incluirá lectura de bibliografía especializada (Sharda et al., Knaflic), análisis de glosario técnico (Data Warehouse, ETL, OLAP, Insights) y quizzes interactivos en inglés para fomentar el bilingüismo en entornos corporativos globales.</w:t>
-      </w:r>
-    </w:p>
-    <w:p>
-      <w:pPr>
+        </w:rPr>
+      </w:pPr>
+      <w:r>
         <w:rPr>
           <w:b/>
           <w:bCs/>
         </w:rPr>
-      </w:pPr>
-    </w:p>
-    <w:p>
-      <w:pPr>
-        <w:rPr>
-          <w:b/>
-          <w:bCs/>
-        </w:rPr>
-      </w:pPr>
-      <w:r>
-        <w:rPr>
-          <w:b/>
-          <w:bCs/>
-        </w:rPr>
-        <w:lastRenderedPageBreak/>
         <w:t>5</w:t>
       </w:r>
       <w:r>
@@ -887,7 +1077,7 @@
       <w:tr>
         <w:tc>
           <w:tcPr>
-            <w:tcW w:type="dxa" w:w="1268"/>
+            <w:tcW w:w="1268" w:type="dxa"/>
           </w:tcPr>
           <w:p>
             <w:r>
@@ -897,15 +1087,37 @@
         </w:tc>
         <w:tc>
           <w:tcPr>
-            <w:tcW w:type="dxa" w:w="2837"/>
+            <w:tcW w:w="2837" w:type="dxa"/>
           </w:tcPr>
           <w:p>
             <w:r>
               <w:t>Unidad 1: Introducción a la Inteligencia de Negocios.</w:t>
+            </w:r>
+            <w:r>
               <w:br/>
-              <w:t>- Concepto y evolución del BI (De reportes estáticos a Augmented BI).</w:t>
+              <w:t xml:space="preserve">- Concepto y evolución del BI (De reportes estáticos a </w:t>
+            </w:r>
+            <w:proofErr w:type="spellStart"/>
+            <w:r>
+              <w:t>Augmented</w:t>
+            </w:r>
+            <w:proofErr w:type="spellEnd"/>
+            <w:r>
+              <w:t xml:space="preserve"> BI).</w:t>
+            </w:r>
+            <w:r>
               <w:br/>
-              <w:t>- Glosario Técnico: ETL, OLTP, OLAP, Data Warehouse, Data Marts.</w:t>
+              <w:t xml:space="preserve">- Glosario Técnico: ETL, OLTP, OLAP, Data </w:t>
+            </w:r>
+            <w:proofErr w:type="spellStart"/>
+            <w:r>
+              <w:t>Warehouse</w:t>
+            </w:r>
+            <w:proofErr w:type="spellEnd"/>
+            <w:r>
+              <w:t>, Data Marts.</w:t>
+            </w:r>
+            <w:r>
               <w:br/>
               <w:t>- Tipos de datos en entornos empresariales (estructurados vs no estructurados).</w:t>
             </w:r>
@@ -913,15 +1125,43 @@
         </w:tc>
         <w:tc>
           <w:tcPr>
-            <w:tcW w:type="dxa" w:w="6235"/>
-          </w:tcPr>
-          <w:p>
-            <w:r>
-              <w:t>Clase Magistral Interactiva (Reveal.js).</w:t>
+            <w:tcW w:w="6235" w:type="dxa"/>
+          </w:tcPr>
+          <w:p>
+            <w:r>
+              <w:t>Clase Magistral Interactiva.</w:t>
+            </w:r>
+            <w:r>
               <w:br/>
               <w:t>Estrategia EMI: Quiz interactivo de vocabulario base.</w:t>
+            </w:r>
+            <w:r>
               <w:br/>
-              <w:t>Taller Pair Programming: Análisis crítico en GitHub de Dashboards reales de empresas Data-Driven (Netflix, Amazon), identificando principios básicos de diseño visual.</w:t>
+              <w:t xml:space="preserve">Taller Pair </w:t>
+            </w:r>
+            <w:proofErr w:type="spellStart"/>
+            <w:r>
+              <w:t>Programming</w:t>
+            </w:r>
+            <w:proofErr w:type="spellEnd"/>
+            <w:r>
+              <w:t xml:space="preserve">: Análisis crítico en GitHub de </w:t>
+            </w:r>
+            <w:proofErr w:type="spellStart"/>
+            <w:r>
+              <w:t>Dashboards</w:t>
+            </w:r>
+            <w:proofErr w:type="spellEnd"/>
+            <w:r>
+              <w:t xml:space="preserve"> reales de empresas Data-</w:t>
+            </w:r>
+            <w:proofErr w:type="spellStart"/>
+            <w:r>
+              <w:t>Driven</w:t>
+            </w:r>
+            <w:proofErr w:type="spellEnd"/>
+            <w:r>
+              <w:t xml:space="preserve"> (Netflix, Amazon), identificando principios básicos de diseño visual.</w:t>
             </w:r>
           </w:p>
         </w:tc>
@@ -929,7 +1169,7 @@
       <w:tr>
         <w:tc>
           <w:tcPr>
-            <w:tcW w:type="dxa" w:w="1268"/>
+            <w:tcW w:w="1268" w:type="dxa"/>
           </w:tcPr>
           <w:p>
             <w:r>
@@ -939,15 +1179,29 @@
         </w:tc>
         <w:tc>
           <w:tcPr>
-            <w:tcW w:type="dxa" w:w="2837"/>
+            <w:tcW w:w="2837" w:type="dxa"/>
           </w:tcPr>
           <w:p>
             <w:r>
               <w:t>Unidad 1: Analítica para la Toma de Decisiones.</w:t>
+            </w:r>
+            <w:r>
               <w:br/>
               <w:t>- Analítica Descriptiva, Predictiva y Prescriptiva.</w:t>
+            </w:r>
+            <w:r>
               <w:br/>
-              <w:t>- Fundamentos de KPIs: Qué medir y por qué (Métricas de vanidad vs accionables).</w:t>
+              <w:t xml:space="preserve">- Fundamentos de </w:t>
+            </w:r>
+            <w:proofErr w:type="spellStart"/>
+            <w:r>
+              <w:t>KPIs</w:t>
+            </w:r>
+            <w:proofErr w:type="spellEnd"/>
+            <w:r>
+              <w:t>: Qué medir y por qué (Métricas de vanidad vs accionables).</w:t>
+            </w:r>
+            <w:r>
               <w:br/>
               <w:t>- Arquitectura tecnológica del BI en organizaciones.</w:t>
             </w:r>
@@ -955,13 +1209,17 @@
         </w:tc>
         <w:tc>
           <w:tcPr>
-            <w:tcW w:type="dxa" w:w="6235"/>
+            <w:tcW w:w="6235" w:type="dxa"/>
           </w:tcPr>
           <w:p>
             <w:r>
               <w:t>Laboratorio Práctico:</w:t>
+            </w:r>
+            <w:r>
               <w:br/>
               <w:t>- Caso de Estudio de Harvard: Fallas en la adopción de BI por malas métricas.</w:t>
+            </w:r>
+            <w:r>
               <w:br/>
               <w:t>- Taller de formulación de métricas (Metodología SMART) usando datos abiertos de la organización.</w:t>
             </w:r>
@@ -971,7 +1229,7 @@
       <w:tr>
         <w:tc>
           <w:tcPr>
-            <w:tcW w:type="dxa" w:w="1268"/>
+            <w:tcW w:w="1268" w:type="dxa"/>
           </w:tcPr>
           <w:p>
             <w:r>
@@ -981,13 +1239,17 @@
         </w:tc>
         <w:tc>
           <w:tcPr>
-            <w:tcW w:type="dxa" w:w="2837"/>
+            <w:tcW w:w="2837" w:type="dxa"/>
           </w:tcPr>
           <w:p>
             <w:r>
               <w:t>Unidad 1: Trabajo Autónomo - Diseño de Métricas Base (18 de Septiembre).</w:t>
+            </w:r>
+            <w:r>
               <w:br/>
               <w:t>- Alineación de métricas con la estrategia de negocio.</w:t>
+            </w:r>
+            <w:r>
               <w:br/>
               <w:t>- Estructuración inicial del Proyecto Final.</w:t>
             </w:r>
@@ -995,15 +1257,43 @@
         </w:tc>
         <w:tc>
           <w:tcPr>
-            <w:tcW w:type="dxa" w:w="6235"/>
+            <w:tcW w:w="6235" w:type="dxa"/>
           </w:tcPr>
           <w:p>
             <w:r>
               <w:t>Actividad Asincrónica (Espacio sin salón L55):</w:t>
+            </w:r>
+            <w:r>
               <w:br/>
-              <w:t>- Desarrollo de un documento Markdown en el repositorio definiendo los KPIs para el conjunto de datos del Proyecto Final.</w:t>
+              <w:t xml:space="preserve">- Desarrollo de un documento </w:t>
+            </w:r>
+            <w:proofErr w:type="spellStart"/>
+            <w:r>
+              <w:t>Markdown</w:t>
+            </w:r>
+            <w:proofErr w:type="spellEnd"/>
+            <w:r>
+              <w:t xml:space="preserve"> en el repositorio definiendo los </w:t>
+            </w:r>
+            <w:proofErr w:type="spellStart"/>
+            <w:r>
+              <w:t>KPIs</w:t>
+            </w:r>
+            <w:proofErr w:type="spellEnd"/>
+            <w:r>
+              <w:t xml:space="preserve"> para el conjunto de datos del Proyecto Final.</w:t>
+            </w:r>
+            <w:r>
               <w:br/>
-              <w:t>- Revisión de literatura: Capítulo 1 y 2 de 'Business Intelligence' (Sharda et al.).</w:t>
+              <w:t xml:space="preserve">- Revisión de literatura: Capítulo 1 y 2 de 'Business </w:t>
+            </w:r>
+            <w:proofErr w:type="spellStart"/>
+            <w:r>
+              <w:t>Intelligence</w:t>
+            </w:r>
+            <w:proofErr w:type="spellEnd"/>
+            <w:r>
+              <w:t>' (Sharda et al.).</w:t>
             </w:r>
           </w:p>
         </w:tc>
@@ -1011,25 +1301,48 @@
       <w:tr>
         <w:tc>
           <w:tcPr>
-            <w:tcW w:type="dxa" w:w="1268"/>
-          </w:tcPr>
-          <w:p>
-            <w:r>
+            <w:tcW w:w="1268" w:type="dxa"/>
+          </w:tcPr>
+          <w:p>
+            <w:r>
+              <w:lastRenderedPageBreak/>
               <w:t>Semana 4</w:t>
             </w:r>
           </w:p>
         </w:tc>
         <w:tc>
           <w:tcPr>
-            <w:tcW w:type="dxa" w:w="2837"/>
+            <w:tcW w:w="2837" w:type="dxa"/>
           </w:tcPr>
           <w:p>
             <w:r>
               <w:t>Unidad 2: Modelado e Integración de Datos.</w:t>
+            </w:r>
+            <w:r>
               <w:br/>
-              <w:t>- Conexiones a fuentes de datos múltiples (APIs, Bases de datos SQL, Hojas de cálculo).</w:t>
+              <w:t>- Conexiones a fuentes de datos múltiples (</w:t>
+            </w:r>
+            <w:proofErr w:type="spellStart"/>
+            <w:r>
+              <w:t>APIs</w:t>
+            </w:r>
+            <w:proofErr w:type="spellEnd"/>
+            <w:r>
+              <w:t>, Bases de datos SQL, Hojas de cálculo).</w:t>
+            </w:r>
+            <w:r>
               <w:br/>
-              <w:t>- Modelado relacional: Esquemas de Estrella (Star Schema) y Copo de Nieve (Snowflake).</w:t>
+              <w:t>- Modelado relacional: Esquemas de Estrella (Star Schema) y Copo de Nieve (</w:t>
+            </w:r>
+            <w:proofErr w:type="spellStart"/>
+            <w:r>
+              <w:t>Snowflake</w:t>
+            </w:r>
+            <w:proofErr w:type="spellEnd"/>
+            <w:r>
+              <w:t>).</w:t>
+            </w:r>
+            <w:r>
               <w:br/>
               <w:t>- Introducción a Tablas de Hechos y Dimensiones.</w:t>
             </w:r>
@@ -1037,15 +1350,29 @@
         </w:tc>
         <w:tc>
           <w:tcPr>
-            <w:tcW w:type="dxa" w:w="6235"/>
+            <w:tcW w:w="6235" w:type="dxa"/>
           </w:tcPr>
           <w:p>
             <w:r>
               <w:t>Laboratorio Práctico en Power BI Desktop:</w:t>
+            </w:r>
+            <w:r>
               <w:br/>
-              <w:t>- Conexión a la base de datos SQL de ejemplo (AdventureWorks).</w:t>
+              <w:t>- Conexión a la base de datos SQL de ejemplo (</w:t>
+            </w:r>
+            <w:proofErr w:type="spellStart"/>
+            <w:r>
+              <w:t>AdventureWorks</w:t>
+            </w:r>
+            <w:proofErr w:type="spellEnd"/>
+            <w:r>
+              <w:t>).</w:t>
+            </w:r>
+            <w:r>
               <w:br/>
               <w:t>- Creación de un esquema de estrella básico identificando dimensiones y hechos.</w:t>
+            </w:r>
+            <w:r>
               <w:br/>
               <w:t>- Evaluación Formativa: Quiz 1 (10%).</w:t>
             </w:r>
@@ -1055,7 +1382,7 @@
       <w:tr>
         <w:tc>
           <w:tcPr>
-            <w:tcW w:type="dxa" w:w="1268"/>
+            <w:tcW w:w="1268" w:type="dxa"/>
           </w:tcPr>
           <w:p>
             <w:r>
@@ -1065,15 +1392,21 @@
         </w:tc>
         <w:tc>
           <w:tcPr>
-            <w:tcW w:type="dxa" w:w="2837"/>
+            <w:tcW w:w="2837" w:type="dxa"/>
           </w:tcPr>
           <w:p>
             <w:r>
               <w:t>Unidad 2: Transformación de Datos (Proceso ETL).</w:t>
+            </w:r>
+            <w:r>
               <w:br/>
               <w:t>- Principios de extracción y carga de datos.</w:t>
+            </w:r>
+            <w:r>
               <w:br/>
               <w:t>- Fundamentos de Power Query y Lenguaje M.</w:t>
+            </w:r>
+            <w:r>
               <w:br/>
               <w:t>- Limpieza de datos organizacionales: Manejo de nulos, duplicados y tipos de datos.</w:t>
             </w:r>
@@ -1081,15 +1414,51 @@
         </w:tc>
         <w:tc>
           <w:tcPr>
-            <w:tcW w:type="dxa" w:w="6235"/>
+            <w:tcW w:w="6235" w:type="dxa"/>
           </w:tcPr>
           <w:p>
             <w:r>
               <w:t>Taller de Transformación de Datos:</w:t>
+            </w:r>
+            <w:r>
               <w:br/>
-              <w:t>- Práctica intensiva de limpieza de un dataset sucio (Dirty Data) utilizando Power Query.</w:t>
+              <w:t xml:space="preserve">- Práctica intensiva de limpieza de un </w:t>
+            </w:r>
+            <w:proofErr w:type="spellStart"/>
+            <w:r>
+              <w:t>dataset</w:t>
+            </w:r>
+            <w:proofErr w:type="spellEnd"/>
+            <w:r>
+              <w:t xml:space="preserve"> sucio (</w:t>
+            </w:r>
+            <w:proofErr w:type="spellStart"/>
+            <w:r>
+              <w:t>Dirty</w:t>
+            </w:r>
+            <w:proofErr w:type="spellEnd"/>
+            <w:r>
+              <w:t xml:space="preserve"> Data) utilizando Power Query.</w:t>
+            </w:r>
+            <w:r>
               <w:br/>
-              <w:t>- Combinación de consultas (Merge / Append) para estructurar el modelo tabular.</w:t>
+              <w:t>- Combinación de consultas (</w:t>
+            </w:r>
+            <w:proofErr w:type="spellStart"/>
+            <w:r>
+              <w:t>Merge</w:t>
+            </w:r>
+            <w:proofErr w:type="spellEnd"/>
+            <w:r>
+              <w:t xml:space="preserve"> / </w:t>
+            </w:r>
+            <w:proofErr w:type="spellStart"/>
+            <w:r>
+              <w:t>Append</w:t>
+            </w:r>
+            <w:proofErr w:type="spellEnd"/>
+            <w:r>
+              <w:t>) para estructurar el modelo tabular.</w:t>
             </w:r>
           </w:p>
         </w:tc>
@@ -1097,7 +1466,7 @@
       <w:tr>
         <w:tc>
           <w:tcPr>
-            <w:tcW w:type="dxa" w:w="1268"/>
+            <w:tcW w:w="1268" w:type="dxa"/>
           </w:tcPr>
           <w:p>
             <w:r>
@@ -1107,29 +1476,63 @@
         </w:tc>
         <w:tc>
           <w:tcPr>
-            <w:tcW w:type="dxa" w:w="2837"/>
+            <w:tcW w:w="2837" w:type="dxa"/>
           </w:tcPr>
           <w:p>
             <w:r>
               <w:t>Unidad 2: Creación de Modelos Escalables.</w:t>
+            </w:r>
+            <w:r>
               <w:br/>
-              <w:t>- Introducción a DAX (Data Analysis Expressions).</w:t>
+              <w:t xml:space="preserve">- Introducción a DAX (Data </w:t>
+            </w:r>
+            <w:proofErr w:type="spellStart"/>
+            <w:r>
+              <w:t>Analysis</w:t>
+            </w:r>
+            <w:proofErr w:type="spellEnd"/>
+            <w:r>
+              <w:t xml:space="preserve"> </w:t>
+            </w:r>
+            <w:proofErr w:type="spellStart"/>
+            <w:r>
+              <w:t>Expressions</w:t>
+            </w:r>
+            <w:proofErr w:type="spellEnd"/>
+            <w:r>
+              <w:t>).</w:t>
+            </w:r>
+            <w:r>
               <w:br/>
               <w:t>- Columnas calculadas vs Medidas (Measures).</w:t>
+            </w:r>
+            <w:r>
               <w:br/>
-              <w:t>- Tablas de Calendario (Time Intelligence).</w:t>
-            </w:r>
-          </w:p>
-        </w:tc>
-        <w:tc>
-          <w:tcPr>
-            <w:tcW w:type="dxa" w:w="6235"/>
+              <w:t xml:space="preserve">- Tablas de Calendario (Time </w:t>
+            </w:r>
+            <w:proofErr w:type="spellStart"/>
+            <w:r>
+              <w:t>Intelligence</w:t>
+            </w:r>
+            <w:proofErr w:type="spellEnd"/>
+            <w:r>
+              <w:t>).</w:t>
+            </w:r>
+          </w:p>
+        </w:tc>
+        <w:tc>
+          <w:tcPr>
+            <w:tcW w:w="6235" w:type="dxa"/>
           </w:tcPr>
           <w:p>
             <w:r>
               <w:t>Laboratorio Avanzado de DAX:</w:t>
+            </w:r>
+            <w:r>
               <w:br/>
               <w:t>- Creación de medidas temporales (YTD, MTD, YoY) necesarias para análisis de ventas y finanzas.</w:t>
+            </w:r>
+            <w:r>
               <w:br/>
               <w:t>- Análisis de rendimiento del modelo.</w:t>
             </w:r>
@@ -1139,7 +1542,7 @@
       <w:tr>
         <w:tc>
           <w:tcPr>
-            <w:tcW w:type="dxa" w:w="1268"/>
+            <w:tcW w:w="1268" w:type="dxa"/>
           </w:tcPr>
           <w:p>
             <w:r>
@@ -1149,13 +1552,17 @@
         </w:tc>
         <w:tc>
           <w:tcPr>
-            <w:tcW w:type="dxa" w:w="2837"/>
+            <w:tcW w:w="2837" w:type="dxa"/>
           </w:tcPr>
           <w:p>
             <w:r>
               <w:t>Unidad 2: Trabajo Autónomo - ETL y Modelado (16 de Octubre).</w:t>
+            </w:r>
+            <w:r>
               <w:br/>
               <w:t>- Consolidación del modelo de datos para el Proyecto 1.</w:t>
+            </w:r>
+            <w:r>
               <w:br/>
               <w:t>- Integración final del Pipeline de datos.</w:t>
             </w:r>
@@ -1163,13 +1570,25 @@
         </w:tc>
         <w:tc>
           <w:tcPr>
-            <w:tcW w:type="dxa" w:w="6235"/>
+            <w:tcW w:w="6235" w:type="dxa"/>
           </w:tcPr>
           <w:p>
             <w:r>
               <w:t>Actividad Asincrónica (Espacio sin salón L55):</w:t>
+            </w:r>
+            <w:r>
               <w:br/>
-              <w:t>- Los estudiantes conectarán, limpiarán y modelarán su set de datos propio usando Power BI, entregando el archivo .pbix como evidencia del avance del proyecto.</w:t>
+              <w:t>- Los estudiantes conectarán, limpiarán y modelarán su set de datos propio usando Power BI, entregando el archivo .</w:t>
+            </w:r>
+            <w:proofErr w:type="spellStart"/>
+            <w:r>
+              <w:t>pbix</w:t>
+            </w:r>
+            <w:proofErr w:type="spellEnd"/>
+            <w:r>
+              <w:t xml:space="preserve"> como evidencia del avance del proyecto.</w:t>
+            </w:r>
+            <w:r>
               <w:br/>
               <w:t>- Evaluación 1 (15%).</w:t>
             </w:r>
@@ -1179,7 +1598,7 @@
       <w:tr>
         <w:tc>
           <w:tcPr>
-            <w:tcW w:type="dxa" w:w="1268"/>
+            <w:tcW w:w="1268" w:type="dxa"/>
           </w:tcPr>
           <w:p>
             <w:r>
@@ -1189,25 +1608,35 @@
         </w:tc>
         <w:tc>
           <w:tcPr>
-            <w:tcW w:type="dxa" w:w="2837"/>
+            <w:tcW w:w="2837" w:type="dxa"/>
           </w:tcPr>
           <w:p>
             <w:r>
               <w:t>Evaluación de Medio Término.</w:t>
+            </w:r>
+            <w:r>
               <w:br/>
               <w:t>- Revisión rigurosa de los pipelines de datos creados.</w:t>
+            </w:r>
+            <w:r>
               <w:br/>
+            </w:r>
+            <w:r>
+              <w:lastRenderedPageBreak/>
               <w:t>- Optimización de modelos relacionales.</w:t>
             </w:r>
           </w:p>
         </w:tc>
         <w:tc>
           <w:tcPr>
-            <w:tcW w:type="dxa" w:w="6235"/>
-          </w:tcPr>
-          <w:p>
-            <w:r>
+            <w:tcW w:w="6235" w:type="dxa"/>
+          </w:tcPr>
+          <w:p>
+            <w:r>
+              <w:lastRenderedPageBreak/>
               <w:t>Sustentación de Proyecto 1 (25%):</w:t>
+            </w:r>
+            <w:r>
               <w:br/>
               <w:t>- Cada grupo defenderá las decisiones de arquitectura de datos, eficiencia del esquema de estrella y calidad de la limpieza de datos implementada.</w:t>
             </w:r>
@@ -1217,25 +1646,48 @@
       <w:tr>
         <w:tc>
           <w:tcPr>
-            <w:tcW w:type="dxa" w:w="1268"/>
-          </w:tcPr>
-          <w:p>
-            <w:r>
+            <w:tcW w:w="1268" w:type="dxa"/>
+          </w:tcPr>
+          <w:p>
+            <w:r>
+              <w:lastRenderedPageBreak/>
               <w:t>Semana 9</w:t>
             </w:r>
           </w:p>
         </w:tc>
         <w:tc>
           <w:tcPr>
-            <w:tcW w:type="dxa" w:w="2837"/>
+            <w:tcW w:w="2837" w:type="dxa"/>
           </w:tcPr>
           <w:p>
             <w:r>
               <w:t>Unidad 3: Diseño y Visualizaciones Efectivas.</w:t>
+            </w:r>
+            <w:r>
               <w:br/>
               <w:t>- La psicología de la visualización: Principios de la Gestalt (Proximidad, Similitud, Cierre).</w:t>
+            </w:r>
+            <w:r>
               <w:br/>
-              <w:t>- Carga Cognitiva y el concepto de 'Decluttering' (Knaflic).</w:t>
+              <w:t>- Carga Cognitiva y el concepto de '</w:t>
+            </w:r>
+            <w:proofErr w:type="spellStart"/>
+            <w:r>
+              <w:t>Decluttering</w:t>
+            </w:r>
+            <w:proofErr w:type="spellEnd"/>
+            <w:r>
+              <w:t>' (</w:t>
+            </w:r>
+            <w:proofErr w:type="spellStart"/>
+            <w:r>
+              <w:t>Knaflic</w:t>
+            </w:r>
+            <w:proofErr w:type="spellEnd"/>
+            <w:r>
+              <w:t>).</w:t>
+            </w:r>
+            <w:r>
               <w:br/>
               <w:t>- Elección correcta del gráfico según el tipo de datos.</w:t>
             </w:r>
@@ -1243,13 +1695,17 @@
         </w:tc>
         <w:tc>
           <w:tcPr>
-            <w:tcW w:type="dxa" w:w="6235"/>
+            <w:tcW w:w="6235" w:type="dxa"/>
           </w:tcPr>
           <w:p>
             <w:r>
               <w:t>Clase Magistral y Debate Crítico:</w:t>
+            </w:r>
+            <w:r>
               <w:br/>
               <w:t>- Ejercicios en vivo de refactorización de gráficos 'feos' (Ej. transformación de Pie Charts 3D a Barras Horizontales limpias).</w:t>
+            </w:r>
+            <w:r>
               <w:br/>
               <w:t>- Uso de la paleta de colores institucional para dirigir la atención.</w:t>
             </w:r>
@@ -1259,7 +1715,7 @@
       <w:tr>
         <w:tc>
           <w:tcPr>
-            <w:tcW w:type="dxa" w:w="1268"/>
+            <w:tcW w:w="1268" w:type="dxa"/>
           </w:tcPr>
           <w:p>
             <w:r>
@@ -1269,29 +1725,79 @@
         </w:tc>
         <w:tc>
           <w:tcPr>
-            <w:tcW w:type="dxa" w:w="2837"/>
-          </w:tcPr>
-          <w:p>
-            <w:r>
-              <w:t>Unidad 3: Dashboards Dinámicos e Interactivos.</w:t>
+            <w:tcW w:w="2837" w:type="dxa"/>
+          </w:tcPr>
+          <w:p>
+            <w:r>
+              <w:t xml:space="preserve">Unidad 3: </w:t>
+            </w:r>
+            <w:proofErr w:type="spellStart"/>
+            <w:r>
+              <w:t>Dashboards</w:t>
+            </w:r>
+            <w:proofErr w:type="spellEnd"/>
+            <w:r>
+              <w:t xml:space="preserve"> Dinámicos e Interactivos.</w:t>
+            </w:r>
+            <w:r>
               <w:br/>
               <w:t>- Construcción de Reportes en Power BI.</w:t>
+            </w:r>
+            <w:r>
               <w:br/>
-              <w:t>- Interacciones visuales: Filtros cruzados, Tooltips personalizados.</w:t>
+              <w:t xml:space="preserve">- Interacciones visuales: Filtros cruzados, </w:t>
+            </w:r>
+            <w:proofErr w:type="spellStart"/>
+            <w:r>
+              <w:t>Tooltips</w:t>
+            </w:r>
+            <w:proofErr w:type="spellEnd"/>
+            <w:r>
+              <w:t xml:space="preserve"> personalizados.</w:t>
+            </w:r>
+            <w:r>
               <w:br/>
-              <w:t>- Segmentaciones avanzadas (Slicers) y marcadores (Bookmarks).</w:t>
-            </w:r>
-          </w:p>
-        </w:tc>
-        <w:tc>
-          <w:tcPr>
-            <w:tcW w:type="dxa" w:w="6235"/>
+              <w:t>- Segmentaciones avanzadas (</w:t>
+            </w:r>
+            <w:proofErr w:type="spellStart"/>
+            <w:r>
+              <w:t>Slicers</w:t>
+            </w:r>
+            <w:proofErr w:type="spellEnd"/>
+            <w:r>
+              <w:t>) y marcadores (</w:t>
+            </w:r>
+            <w:proofErr w:type="spellStart"/>
+            <w:r>
+              <w:t>Bookmarks</w:t>
+            </w:r>
+            <w:proofErr w:type="spellEnd"/>
+            <w:r>
+              <w:t>).</w:t>
+            </w:r>
+          </w:p>
+        </w:tc>
+        <w:tc>
+          <w:tcPr>
+            <w:tcW w:w="6235" w:type="dxa"/>
           </w:tcPr>
           <w:p>
             <w:r>
               <w:t>Laboratorio de Visualización:</w:t>
+            </w:r>
+            <w:r>
               <w:br/>
-              <w:t>- Diseño de la primera versión del Dashboard utilizando el modelo del Proyecto 1.</w:t>
+              <w:t xml:space="preserve">- Diseño de la primera versión del </w:t>
+            </w:r>
+            <w:proofErr w:type="spellStart"/>
+            <w:r>
+              <w:t>Dashboard</w:t>
+            </w:r>
+            <w:proofErr w:type="spellEnd"/>
+            <w:r>
+              <w:t xml:space="preserve"> utilizando el modelo del Proyecto 1.</w:t>
+            </w:r>
+            <w:r>
               <w:br/>
               <w:t>- Aplicación estricta de las reglas de contraste de color y jerarquía visual.</w:t>
             </w:r>
@@ -1301,7 +1807,7 @@
       <w:tr>
         <w:tc>
           <w:tcPr>
-            <w:tcW w:type="dxa" w:w="1268"/>
+            <w:tcW w:w="1268" w:type="dxa"/>
           </w:tcPr>
           <w:p>
             <w:r>
@@ -1311,13 +1817,41 @@
         </w:tc>
         <w:tc>
           <w:tcPr>
-            <w:tcW w:type="dxa" w:w="2837"/>
-          </w:tcPr>
-          <w:p>
-            <w:r>
-              <w:t>Unidad 3: Trabajo Autónomo - Alertas y Drill-down (13 de Noviembre).</w:t>
+            <w:tcW w:w="2837" w:type="dxa"/>
+          </w:tcPr>
+          <w:p>
+            <w:r>
+              <w:t>Unidad 3: Trabajo Autónomo - Alertas y Drill-</w:t>
+            </w:r>
+            <w:proofErr w:type="spellStart"/>
+            <w:r>
+              <w:t>down</w:t>
+            </w:r>
+            <w:proofErr w:type="spellEnd"/>
+            <w:r>
+              <w:t xml:space="preserve"> (13 de Noviembre).</w:t>
+            </w:r>
+            <w:r>
               <w:br/>
-              <w:t>- Profundización en los niveles de análisis (Drill-down / Drill-through).</w:t>
+              <w:t>- Profundización en los niveles de análisis (Drill-</w:t>
+            </w:r>
+            <w:proofErr w:type="spellStart"/>
+            <w:r>
+              <w:t>down</w:t>
+            </w:r>
+            <w:proofErr w:type="spellEnd"/>
+            <w:r>
+              <w:t xml:space="preserve"> / Drill-</w:t>
+            </w:r>
+            <w:proofErr w:type="spellStart"/>
+            <w:r>
+              <w:t>through</w:t>
+            </w:r>
+            <w:proofErr w:type="spellEnd"/>
+            <w:r>
+              <w:t>).</w:t>
+            </w:r>
+            <w:r>
               <w:br/>
               <w:t>- Parametrización y alertas de KPI.</w:t>
             </w:r>
@@ -1325,13 +1859,23 @@
         </w:tc>
         <w:tc>
           <w:tcPr>
-            <w:tcW w:type="dxa" w:w="6235"/>
+            <w:tcW w:w="6235" w:type="dxa"/>
           </w:tcPr>
           <w:p>
             <w:r>
               <w:t>Actividad Asincrónica (Espacio sin salón L55):</w:t>
+            </w:r>
+            <w:r>
               <w:br/>
-              <w:t>- Implementación de jerarquías de fechas y categorías en el dashboard para permitir a los usuarios navegar desde un panorama general hasta el detalle transaccional.</w:t>
+              <w:t xml:space="preserve">- Implementación de jerarquías de fechas y categorías en el </w:t>
+            </w:r>
+            <w:proofErr w:type="spellStart"/>
+            <w:r>
+              <w:t>dashboard</w:t>
+            </w:r>
+            <w:proofErr w:type="spellEnd"/>
+            <w:r>
+              <w:t xml:space="preserve"> para permitir a los usuarios navegar desde un panorama general hasta el detalle transaccional.</w:t>
             </w:r>
           </w:p>
         </w:tc>
@@ -1339,7 +1883,7 @@
       <w:tr>
         <w:tc>
           <w:tcPr>
-            <w:tcW w:type="dxa" w:w="1268"/>
+            <w:tcW w:w="1268" w:type="dxa"/>
           </w:tcPr>
           <w:p>
             <w:r>
@@ -1349,29 +1893,71 @@
         </w:tc>
         <w:tc>
           <w:tcPr>
-            <w:tcW w:type="dxa" w:w="2837"/>
-          </w:tcPr>
-          <w:p>
-            <w:r>
-              <w:t>Unidad 3: Storytelling y Contexto Empresarial.</w:t>
+            <w:tcW w:w="2837" w:type="dxa"/>
+          </w:tcPr>
+          <w:p>
+            <w:r>
+              <w:t xml:space="preserve">Unidad 3: </w:t>
+            </w:r>
+            <w:proofErr w:type="spellStart"/>
+            <w:r>
+              <w:t>Storytelling</w:t>
+            </w:r>
+            <w:proofErr w:type="spellEnd"/>
+            <w:r>
+              <w:t xml:space="preserve"> y Contexto Empresarial.</w:t>
+            </w:r>
+            <w:r>
               <w:br/>
-              <w:t>- Adaptación del Dashboard al público objetivo (CEO vs Analista Táctico).</w:t>
+              <w:t xml:space="preserve">- Adaptación del </w:t>
+            </w:r>
+            <w:proofErr w:type="spellStart"/>
+            <w:r>
+              <w:t>Dashboard</w:t>
+            </w:r>
+            <w:proofErr w:type="spellEnd"/>
+            <w:r>
+              <w:t xml:space="preserve"> al público objetivo (CEO vs Analista Táctico).</w:t>
+            </w:r>
+            <w:r>
               <w:br/>
               <w:t>- Construcción de narrativas visuales coherentes.</w:t>
+            </w:r>
+            <w:r>
               <w:br/>
-              <w:t>- Presentación de insights de impacto.</w:t>
-            </w:r>
-          </w:p>
-        </w:tc>
-        <w:tc>
-          <w:tcPr>
-            <w:tcW w:type="dxa" w:w="6235"/>
+              <w:t xml:space="preserve">- Presentación de </w:t>
+            </w:r>
+            <w:proofErr w:type="spellStart"/>
+            <w:r>
+              <w:t>insights</w:t>
+            </w:r>
+            <w:proofErr w:type="spellEnd"/>
+            <w:r>
+              <w:t xml:space="preserve"> de impacto.</w:t>
+            </w:r>
+          </w:p>
+        </w:tc>
+        <w:tc>
+          <w:tcPr>
+            <w:tcW w:w="6235" w:type="dxa"/>
           </w:tcPr>
           <w:p>
             <w:r>
               <w:t>Taller de Narrativa Visual:</w:t>
+            </w:r>
+            <w:r>
               <w:br/>
-              <w:t>- Los estudiantes jugarán roles (Ejecutivo vs Analista) y probarán si el dashboard actual responde las preguntas críticas de negocio en menos de 10 segundos.</w:t>
+              <w:t xml:space="preserve">- Los estudiantes jugarán roles (Ejecutivo vs Analista) y probarán si el </w:t>
+            </w:r>
+            <w:proofErr w:type="spellStart"/>
+            <w:r>
+              <w:t>dashboard</w:t>
+            </w:r>
+            <w:proofErr w:type="spellEnd"/>
+            <w:r>
+              <w:t xml:space="preserve"> actual responde las preguntas críticas de negocio en menos de 10 segundos.</w:t>
+            </w:r>
+            <w:r>
               <w:br/>
               <w:t>- Quiz 2 (10%).</w:t>
             </w:r>
@@ -1381,25 +1967,32 @@
       <w:tr>
         <w:tc>
           <w:tcPr>
-            <w:tcW w:type="dxa" w:w="1268"/>
-          </w:tcPr>
-          <w:p>
-            <w:r>
+            <w:tcW w:w="1268" w:type="dxa"/>
+          </w:tcPr>
+          <w:p>
+            <w:r>
+              <w:lastRenderedPageBreak/>
               <w:t>Semana 13</w:t>
             </w:r>
           </w:p>
         </w:tc>
         <w:tc>
           <w:tcPr>
-            <w:tcW w:type="dxa" w:w="2837"/>
+            <w:tcW w:w="2837" w:type="dxa"/>
           </w:tcPr>
           <w:p>
             <w:r>
               <w:t>Unidad 4: Casos Empresariales y BI en la Nube.</w:t>
+            </w:r>
+            <w:r>
               <w:br/>
               <w:t>- Publicación de reportes (Power BI Service).</w:t>
+            </w:r>
+            <w:r>
               <w:br/>
               <w:t>- Seguridad a nivel de fila (RLS) para distribución corporativa.</w:t>
+            </w:r>
+            <w:r>
               <w:br/>
               <w:t>- Análisis de casos reales de adopción de BI en la industria.</w:t>
             </w:r>
@@ -1407,13 +2000,17 @@
         </w:tc>
         <w:tc>
           <w:tcPr>
-            <w:tcW w:type="dxa" w:w="6235"/>
+            <w:tcW w:w="6235" w:type="dxa"/>
           </w:tcPr>
           <w:p>
             <w:r>
               <w:t>Laboratorio de Despliegue:</w:t>
+            </w:r>
+            <w:r>
               <w:br/>
               <w:t>- Configuración de áreas de trabajo y publicación del reporte en la nube.</w:t>
+            </w:r>
+            <w:r>
               <w:br/>
               <w:t>- Implementación de roles de seguridad para restringir el acceso a la información confidencial.</w:t>
             </w:r>
@@ -1423,7 +2020,7 @@
       <w:tr>
         <w:tc>
           <w:tcPr>
-            <w:tcW w:type="dxa" w:w="1268"/>
+            <w:tcW w:w="1268" w:type="dxa"/>
           </w:tcPr>
           <w:p>
             <w:r>
@@ -1433,13 +2030,49 @@
         </w:tc>
         <w:tc>
           <w:tcPr>
-            <w:tcW w:type="dxa" w:w="2837"/>
-          </w:tcPr>
-          <w:p>
-            <w:r>
-              <w:t>Unidad 4: Refinamiento Final y Feedback Clínico.</w:t>
+            <w:tcW w:w="2837" w:type="dxa"/>
+          </w:tcPr>
+          <w:p>
+            <w:r>
+              <w:t xml:space="preserve">Unidad 4: Refinamiento Final y </w:t>
+            </w:r>
+            <w:proofErr w:type="spellStart"/>
+            <w:r>
+              <w:t>Feedback</w:t>
+            </w:r>
+            <w:proofErr w:type="spellEnd"/>
+            <w:r>
+              <w:t xml:space="preserve"> Clínico.</w:t>
+            </w:r>
+            <w:r>
               <w:br/>
-              <w:t>- Sesiones de co-evaluación (Peer Review) de Dashboards.</w:t>
+              <w:t xml:space="preserve">- Sesiones de </w:t>
+            </w:r>
+            <w:proofErr w:type="spellStart"/>
+            <w:r>
+              <w:t>co-evaluación</w:t>
+            </w:r>
+            <w:proofErr w:type="spellEnd"/>
+            <w:r>
+              <w:t xml:space="preserve"> (Peer </w:t>
+            </w:r>
+            <w:proofErr w:type="spellStart"/>
+            <w:r>
+              <w:t>Review</w:t>
+            </w:r>
+            <w:proofErr w:type="spellEnd"/>
+            <w:r>
+              <w:t xml:space="preserve">) de </w:t>
+            </w:r>
+            <w:proofErr w:type="spellStart"/>
+            <w:r>
+              <w:t>Dashboards</w:t>
+            </w:r>
+            <w:proofErr w:type="spellEnd"/>
+            <w:r>
+              <w:t>.</w:t>
+            </w:r>
+            <w:r>
               <w:br/>
               <w:t>- Identificación de cuellos de botella en la comunicación de datos.</w:t>
             </w:r>
@@ -1447,13 +2080,33 @@
         </w:tc>
         <w:tc>
           <w:tcPr>
-            <w:tcW w:type="dxa" w:w="6235"/>
-          </w:tcPr>
-          <w:p>
-            <w:r>
-              <w:t>Clínica de Dashboards:</w:t>
+            <w:tcW w:w="6235" w:type="dxa"/>
+          </w:tcPr>
+          <w:p>
+            <w:r>
+              <w:t xml:space="preserve">Clínica de </w:t>
+            </w:r>
+            <w:proofErr w:type="spellStart"/>
+            <w:r>
+              <w:t>Dashboards</w:t>
+            </w:r>
+            <w:proofErr w:type="spellEnd"/>
+            <w:r>
+              <w:t>:</w:t>
+            </w:r>
+            <w:r>
               <w:br/>
-              <w:t>- Los estudiantes intercambiarán sus proyectos y emitirán juicios críticos constructivos sobre usabilidad, diseño visual (Decluttering) y rendimiento técnico.</w:t>
+              <w:t>- Los estudiantes intercambiarán sus proyectos y emitirán juicios críticos constructivos sobre usabilidad, diseño visual (</w:t>
+            </w:r>
+            <w:proofErr w:type="spellStart"/>
+            <w:r>
+              <w:t>Decluttering</w:t>
+            </w:r>
+            <w:proofErr w:type="spellEnd"/>
+            <w:r>
+              <w:t>) y rendimiento técnico.</w:t>
+            </w:r>
+            <w:r>
               <w:br/>
               <w:t>- Evaluación 2 (15%).</w:t>
             </w:r>
@@ -1463,7 +2116,7 @@
       <w:tr>
         <w:tc>
           <w:tcPr>
-            <w:tcW w:type="dxa" w:w="1268"/>
+            <w:tcW w:w="1268" w:type="dxa"/>
           </w:tcPr>
           <w:p>
             <w:r>
@@ -1473,13 +2126,17 @@
         </w:tc>
         <w:tc>
           <w:tcPr>
-            <w:tcW w:type="dxa" w:w="2837"/>
+            <w:tcW w:w="2837" w:type="dxa"/>
           </w:tcPr>
           <w:p>
             <w:r>
               <w:t>Unidad 4: Preparación para Sustentaciones Ejecutivas.</w:t>
+            </w:r>
+            <w:r>
               <w:br/>
               <w:t>- Redacción de informes ejecutivos de respaldo.</w:t>
+            </w:r>
+            <w:r>
               <w:br/>
               <w:t>- Técnicas de oratoria para presentación de datos.</w:t>
             </w:r>
@@ -1487,11 +2144,13 @@
         </w:tc>
         <w:tc>
           <w:tcPr>
-            <w:tcW w:type="dxa" w:w="6235"/>
+            <w:tcW w:w="6235" w:type="dxa"/>
           </w:tcPr>
           <w:p>
             <w:r>
               <w:t>Simulacro de Presentación:</w:t>
+            </w:r>
+            <w:r>
               <w:br/>
               <w:t>- Ensayo de la sustentación frente a los compañeros para ajustar tiempos y narrativa.</w:t>
             </w:r>
@@ -1501,7 +2160,7 @@
       <w:tr>
         <w:tc>
           <w:tcPr>
-            <w:tcW w:type="dxa" w:w="1268"/>
+            <w:tcW w:w="1268" w:type="dxa"/>
           </w:tcPr>
           <w:p>
             <w:r>
@@ -1511,11 +2170,13 @@
         </w:tc>
         <w:tc>
           <w:tcPr>
-            <w:tcW w:type="dxa" w:w="2837"/>
+            <w:tcW w:w="2837" w:type="dxa"/>
           </w:tcPr>
           <w:p>
             <w:r>
               <w:t>Cierre de Curso: Sustentación Proyecto Final.</w:t>
+            </w:r>
+            <w:r>
               <w:br/>
               <w:t>- Evaluación integral del modelo de datos, diseño visual y narrativa estratégica.</w:t>
             </w:r>
@@ -1523,13 +2184,23 @@
         </w:tc>
         <w:tc>
           <w:tcPr>
-            <w:tcW w:type="dxa" w:w="6235"/>
+            <w:tcW w:w="6235" w:type="dxa"/>
           </w:tcPr>
           <w:p>
             <w:r>
               <w:t>Sustentación Ejecutiva (25%):</w:t>
+            </w:r>
+            <w:r>
               <w:br/>
-              <w:t>- Presentación oficial del Dashboard Final ante el 'Board Directivo' (Docente e Invitados), demostrando el impacto en la toma de decisiones.</w:t>
+              <w:t xml:space="preserve">- Presentación oficial del </w:t>
+            </w:r>
+            <w:proofErr w:type="spellStart"/>
+            <w:r>
+              <w:t>Dashboard</w:t>
+            </w:r>
+            <w:proofErr w:type="spellEnd"/>
+            <w:r>
+              <w:t xml:space="preserve"> Final ante el 'Board Directivo' (Docente e Invitados), demostrando el impacto en la toma de decisiones.</w:t>
             </w:r>
           </w:p>
         </w:tc>
@@ -1551,70 +2222,6 @@
       <w:r>
         <w:t>  </w:t>
       </w:r>
-      <w:r>
-        <w:rPr>
-          <w:b/>
-          <w:bCs/>
-          <w:i/>
-          <w:iCs/>
-        </w:rPr>
-        <w:t>Nota:</w:t>
-      </w:r>
-      <w:r>
-        <w:rPr>
-          <w:i/>
-          <w:iCs/>
-        </w:rPr>
-        <w:t xml:space="preserve"> </w:t>
-      </w:r>
-      <w:r>
-        <w:rPr>
-          <w:i/>
-          <w:iCs/>
-          <w:color w:val="A6A6A6" w:themeColor="background1" w:themeShade="A6"/>
-        </w:rPr>
-        <w:t>duplique las filas según el número de sesiones plan</w:t>
-      </w:r>
-      <w:r>
-        <w:rPr>
-          <w:i/>
-          <w:iCs/>
-          <w:color w:val="A6A6A6" w:themeColor="background1" w:themeShade="A6"/>
-        </w:rPr>
-        <w:t>eadas</w:t>
-      </w:r>
-      <w:r>
-        <w:rPr>
-          <w:i/>
-          <w:iCs/>
-          <w:color w:val="A6A6A6" w:themeColor="background1" w:themeShade="A6"/>
-        </w:rPr>
-        <w:t xml:space="preserve"> para su curs</w:t>
-      </w:r>
-      <w:r>
-        <w:rPr>
-          <w:i/>
-          <w:iCs/>
-          <w:color w:val="A6A6A6" w:themeColor="background1" w:themeShade="A6"/>
-        </w:rPr>
-        <w:t>o</w:t>
-      </w:r>
-      <w:r>
-        <w:rPr>
-          <w:i/>
-          <w:iCs/>
-          <w:color w:val="A6A6A6" w:themeColor="background1" w:themeShade="A6"/>
-        </w:rPr>
-        <w:t>, puede ajustar la tabla como considere.</w:t>
-      </w:r>
-    </w:p>
-    <w:p>
-      <w:pPr>
-        <w:rPr>
-          <w:i/>
-          <w:iCs/>
-        </w:rPr>
-      </w:pPr>
     </w:p>
     <w:p>
       <w:pPr>
@@ -1660,33 +2267,6 @@
           <w:bCs/>
         </w:rPr>
         <w:t>?</w:t>
-      </w:r>
-    </w:p>
-    <w:p>
-      <w:pPr>
-        <w:tabs>
-          <w:tab w:val="left" w:pos="3384"/>
-        </w:tabs>
-        <w:rPr>
-          <w:b/>
-          <w:bCs/>
-        </w:rPr>
-      </w:pPr>
-      <w:r>
-        <w:rPr>
-          <w:i/>
-          <w:iCs/>
-          <w:color w:val="A6A6A6" w:themeColor="background1" w:themeShade="A6"/>
-        </w:rPr>
-        <w:t xml:space="preserve">Si quiere precisar algún aspecto particular sobre el proceso evaluativo, puede escribirlo antes de la </w:t>
-      </w:r>
-      <w:r>
-        <w:rPr>
-          <w:i/>
-          <w:iCs/>
-          <w:color w:val="A6A6A6" w:themeColor="background1" w:themeShade="A6"/>
-        </w:rPr>
-        <w:t>tabla.</w:t>
       </w:r>
     </w:p>
     <w:tbl>
@@ -1890,7 +2470,7 @@
       <w:tr>
         <w:tc>
           <w:tcPr>
-            <w:tcW w:type="dxa" w:w="1251"/>
+            <w:tcW w:w="580" w:type="pct"/>
           </w:tcPr>
           <w:p>
             <w:r>
@@ -1900,17 +2480,25 @@
         </w:tc>
         <w:tc>
           <w:tcPr>
-            <w:tcW w:type="dxa" w:w="5306"/>
-          </w:tcPr>
-          <w:p>
-            <w:r>
-              <w:t>Quiz 1: Conceptos de BI, KPIs y Glosario EMI.</w:t>
-            </w:r>
-          </w:p>
-        </w:tc>
-        <w:tc>
-          <w:tcPr>
-            <w:tcW w:type="dxa" w:w="2081"/>
+            <w:tcW w:w="2460" w:type="pct"/>
+          </w:tcPr>
+          <w:p>
+            <w:r>
+              <w:t xml:space="preserve">Quiz 1: Conceptos de BI, </w:t>
+            </w:r>
+            <w:proofErr w:type="spellStart"/>
+            <w:r>
+              <w:t>KPIs</w:t>
+            </w:r>
+            <w:proofErr w:type="spellEnd"/>
+            <w:r>
+              <w:t xml:space="preserve"> y Glosario EMI.</w:t>
+            </w:r>
+          </w:p>
+        </w:tc>
+        <w:tc>
+          <w:tcPr>
+            <w:tcW w:w="965" w:type="pct"/>
           </w:tcPr>
           <w:p>
             <w:r>
@@ -1920,7 +2508,7 @@
         </w:tc>
         <w:tc>
           <w:tcPr>
-            <w:tcW w:type="dxa" w:w="1277"/>
+            <w:tcW w:w="592" w:type="pct"/>
           </w:tcPr>
           <w:p>
             <w:r>
@@ -1930,7 +2518,7 @@
         </w:tc>
         <w:tc>
           <w:tcPr>
-            <w:tcW w:type="dxa" w:w="869"/>
+            <w:tcW w:w="403" w:type="pct"/>
           </w:tcPr>
           <w:p>
             <w:r>
@@ -1942,7 +2530,7 @@
       <w:tr>
         <w:tc>
           <w:tcPr>
-            <w:tcW w:type="dxa" w:w="1251"/>
+            <w:tcW w:w="580" w:type="pct"/>
           </w:tcPr>
           <w:p>
             <w:r>
@@ -1952,7 +2540,7 @@
         </w:tc>
         <w:tc>
           <w:tcPr>
-            <w:tcW w:type="dxa" w:w="5306"/>
+            <w:tcW w:w="2460" w:type="pct"/>
           </w:tcPr>
           <w:p>
             <w:r>
@@ -1962,7 +2550,7 @@
         </w:tc>
         <w:tc>
           <w:tcPr>
-            <w:tcW w:type="dxa" w:w="2081"/>
+            <w:tcW w:w="965" w:type="pct"/>
           </w:tcPr>
           <w:p>
             <w:r>
@@ -1972,7 +2560,7 @@
         </w:tc>
         <w:tc>
           <w:tcPr>
-            <w:tcW w:type="dxa" w:w="1277"/>
+            <w:tcW w:w="592" w:type="pct"/>
           </w:tcPr>
           <w:p>
             <w:r>
@@ -1982,7 +2570,7 @@
         </w:tc>
         <w:tc>
           <w:tcPr>
-            <w:tcW w:type="dxa" w:w="869"/>
+            <w:tcW w:w="403" w:type="pct"/>
           </w:tcPr>
           <w:p>
             <w:r>
@@ -1994,7 +2582,7 @@
       <w:tr>
         <w:tc>
           <w:tcPr>
-            <w:tcW w:type="dxa" w:w="1251"/>
+            <w:tcW w:w="580" w:type="pct"/>
           </w:tcPr>
           <w:p>
             <w:r>
@@ -2004,7 +2592,7 @@
         </w:tc>
         <w:tc>
           <w:tcPr>
-            <w:tcW w:type="dxa" w:w="5306"/>
+            <w:tcW w:w="2460" w:type="pct"/>
           </w:tcPr>
           <w:p>
             <w:r>
@@ -2014,7 +2602,7 @@
         </w:tc>
         <w:tc>
           <w:tcPr>
-            <w:tcW w:type="dxa" w:w="2081"/>
+            <w:tcW w:w="965" w:type="pct"/>
           </w:tcPr>
           <w:p>
             <w:r>
@@ -2024,7 +2612,7 @@
         </w:tc>
         <w:tc>
           <w:tcPr>
-            <w:tcW w:type="dxa" w:w="1277"/>
+            <w:tcW w:w="592" w:type="pct"/>
           </w:tcPr>
           <w:p>
             <w:r>
@@ -2034,7 +2622,7 @@
         </w:tc>
         <w:tc>
           <w:tcPr>
-            <w:tcW w:type="dxa" w:w="869"/>
+            <w:tcW w:w="403" w:type="pct"/>
           </w:tcPr>
           <w:p>
             <w:r>
@@ -2046,7 +2634,7 @@
       <w:tr>
         <w:tc>
           <w:tcPr>
-            <w:tcW w:type="dxa" w:w="1251"/>
+            <w:tcW w:w="580" w:type="pct"/>
           </w:tcPr>
           <w:p>
             <w:r>
@@ -2056,17 +2644,25 @@
         </w:tc>
         <w:tc>
           <w:tcPr>
-            <w:tcW w:type="dxa" w:w="5306"/>
-          </w:tcPr>
-          <w:p>
-            <w:r>
-              <w:t>Quiz 2: Diseño Visual, Gestalt y Decluttering.</w:t>
-            </w:r>
-          </w:p>
-        </w:tc>
-        <w:tc>
-          <w:tcPr>
-            <w:tcW w:type="dxa" w:w="2081"/>
+            <w:tcW w:w="2460" w:type="pct"/>
+          </w:tcPr>
+          <w:p>
+            <w:r>
+              <w:t xml:space="preserve">Quiz 2: Diseño Visual, Gestalt y </w:t>
+            </w:r>
+            <w:proofErr w:type="spellStart"/>
+            <w:r>
+              <w:t>Decluttering</w:t>
+            </w:r>
+            <w:proofErr w:type="spellEnd"/>
+            <w:r>
+              <w:t>.</w:t>
+            </w:r>
+          </w:p>
+        </w:tc>
+        <w:tc>
+          <w:tcPr>
+            <w:tcW w:w="965" w:type="pct"/>
           </w:tcPr>
           <w:p>
             <w:r>
@@ -2076,7 +2672,7 @@
         </w:tc>
         <w:tc>
           <w:tcPr>
-            <w:tcW w:type="dxa" w:w="1277"/>
+            <w:tcW w:w="592" w:type="pct"/>
           </w:tcPr>
           <w:p>
             <w:r>
@@ -2086,7 +2682,7 @@
         </w:tc>
         <w:tc>
           <w:tcPr>
-            <w:tcW w:type="dxa" w:w="869"/>
+            <w:tcW w:w="403" w:type="pct"/>
           </w:tcPr>
           <w:p>
             <w:r>
@@ -2098,17 +2694,18 @@
       <w:tr>
         <w:tc>
           <w:tcPr>
-            <w:tcW w:type="dxa" w:w="1251"/>
-          </w:tcPr>
-          <w:p>
-            <w:r>
+            <w:tcW w:w="580" w:type="pct"/>
+          </w:tcPr>
+          <w:p>
+            <w:r>
+              <w:lastRenderedPageBreak/>
               <w:t>Semana 14</w:t>
             </w:r>
           </w:p>
         </w:tc>
         <w:tc>
           <w:tcPr>
-            <w:tcW w:type="dxa" w:w="5306"/>
+            <w:tcW w:w="2460" w:type="pct"/>
           </w:tcPr>
           <w:p>
             <w:r>
@@ -2118,7 +2715,7 @@
         </w:tc>
         <w:tc>
           <w:tcPr>
-            <w:tcW w:type="dxa" w:w="2081"/>
+            <w:tcW w:w="965" w:type="pct"/>
           </w:tcPr>
           <w:p>
             <w:r>
@@ -2128,7 +2725,7 @@
         </w:tc>
         <w:tc>
           <w:tcPr>
-            <w:tcW w:type="dxa" w:w="1277"/>
+            <w:tcW w:w="592" w:type="pct"/>
           </w:tcPr>
           <w:p>
             <w:r>
@@ -2138,7 +2735,7 @@
         </w:tc>
         <w:tc>
           <w:tcPr>
-            <w:tcW w:type="dxa" w:w="869"/>
+            <w:tcW w:w="403" w:type="pct"/>
           </w:tcPr>
           <w:p>
             <w:r>
@@ -2150,7 +2747,7 @@
       <w:tr>
         <w:tc>
           <w:tcPr>
-            <w:tcW w:type="dxa" w:w="1251"/>
+            <w:tcW w:w="580" w:type="pct"/>
           </w:tcPr>
           <w:p>
             <w:r>
@@ -2160,17 +2757,25 @@
         </w:tc>
         <w:tc>
           <w:tcPr>
-            <w:tcW w:type="dxa" w:w="5306"/>
-          </w:tcPr>
-          <w:p>
-            <w:r>
-              <w:t>Proyecto Final: Sustentación Ejecutiva del Dashboard interactivo completo.</w:t>
-            </w:r>
-          </w:p>
-        </w:tc>
-        <w:tc>
-          <w:tcPr>
-            <w:tcW w:type="dxa" w:w="2081"/>
+            <w:tcW w:w="2460" w:type="pct"/>
+          </w:tcPr>
+          <w:p>
+            <w:r>
+              <w:t xml:space="preserve">Proyecto Final: Sustentación Ejecutiva del </w:t>
+            </w:r>
+            <w:proofErr w:type="spellStart"/>
+            <w:r>
+              <w:t>Dashboard</w:t>
+            </w:r>
+            <w:proofErr w:type="spellEnd"/>
+            <w:r>
+              <w:t xml:space="preserve"> interactivo completo.</w:t>
+            </w:r>
+          </w:p>
+        </w:tc>
+        <w:tc>
+          <w:tcPr>
+            <w:tcW w:w="965" w:type="pct"/>
           </w:tcPr>
           <w:p>
             <w:r>
@@ -2180,7 +2785,7 @@
         </w:tc>
         <w:tc>
           <w:tcPr>
-            <w:tcW w:type="dxa" w:w="1277"/>
+            <w:tcW w:w="592" w:type="pct"/>
           </w:tcPr>
           <w:p>
             <w:r>
@@ -2190,7 +2795,7 @@
         </w:tc>
         <w:tc>
           <w:tcPr>
-            <w:tcW w:type="dxa" w:w="869"/>
+            <w:tcW w:w="403" w:type="pct"/>
           </w:tcPr>
           <w:p>
             <w:r>
@@ -2203,67 +2808,10 @@
     <w:p>
       <w:pPr>
         <w:rPr>
-          <w:i/>
-          <w:iCs/>
-          <w:color w:val="A6A6A6" w:themeColor="background1" w:themeShade="A6"/>
-        </w:rPr>
-      </w:pPr>
-      <w:r>
-        <w:rPr>
           <w:b/>
           <w:bCs/>
-          <w:i/>
-          <w:iCs/>
-        </w:rPr>
-        <w:t>Nota:</w:t>
-      </w:r>
-      <w:r>
-        <w:rPr>
-          <w:i/>
-          <w:iCs/>
-        </w:rPr>
-        <w:t xml:space="preserve"> </w:t>
-      </w:r>
-      <w:r>
-        <w:rPr>
-          <w:i/>
-          <w:iCs/>
-          <w:color w:val="A6A6A6" w:themeColor="background1" w:themeShade="A6"/>
-        </w:rPr>
-        <w:t xml:space="preserve">duplique las filas según el número de </w:t>
-      </w:r>
-      <w:r>
-        <w:rPr>
-          <w:i/>
-          <w:iCs/>
-          <w:color w:val="A6A6A6" w:themeColor="background1" w:themeShade="A6"/>
-        </w:rPr>
-        <w:t>actividades de evaluación</w:t>
-      </w:r>
-      <w:r>
-        <w:rPr>
-          <w:i/>
-          <w:iCs/>
-          <w:color w:val="A6A6A6" w:themeColor="background1" w:themeShade="A6"/>
-        </w:rPr>
-        <w:t xml:space="preserve"> plan</w:t>
-      </w:r>
-      <w:r>
-        <w:rPr>
-          <w:i/>
-          <w:iCs/>
-          <w:color w:val="A6A6A6" w:themeColor="background1" w:themeShade="A6"/>
-        </w:rPr>
-        <w:t>eadas</w:t>
-      </w:r>
-      <w:r>
-        <w:rPr>
-          <w:i/>
-          <w:iCs/>
-          <w:color w:val="A6A6A6" w:themeColor="background1" w:themeShade="A6"/>
-        </w:rPr>
-        <w:t xml:space="preserve"> para su curso.</w:t>
-      </w:r>
+        </w:rPr>
+      </w:pPr>
     </w:p>
     <w:p>
       <w:pPr>
@@ -2272,280 +2820,305 @@
           <w:bCs/>
         </w:rPr>
       </w:pPr>
+      <w:r>
+        <w:rPr>
+          <w:b/>
+          <w:bCs/>
+        </w:rPr>
+        <w:t>7</w:t>
+      </w:r>
+      <w:r>
+        <w:rPr>
+          <w:b/>
+          <w:bCs/>
+        </w:rPr>
+        <w:t>.</w:t>
+      </w:r>
+      <w:r>
+        <w:rPr>
+          <w:b/>
+          <w:bCs/>
+        </w:rPr>
+        <w:t xml:space="preserve"> </w:t>
+      </w:r>
+      <w:r>
+        <w:rPr>
+          <w:b/>
+          <w:bCs/>
+        </w:rPr>
+        <w:t xml:space="preserve">Acuerdos </w:t>
+      </w:r>
+      <w:r>
+        <w:rPr>
+          <w:b/>
+          <w:bCs/>
+        </w:rPr>
+        <w:t>y reglas d</w:t>
+      </w:r>
+      <w:r>
+        <w:rPr>
+          <w:b/>
+          <w:bCs/>
+        </w:rPr>
+        <w:t>e clase</w:t>
+      </w:r>
+      <w:r>
+        <w:rPr>
+          <w:b/>
+          <w:bCs/>
+        </w:rPr>
+        <w:t>:</w:t>
+      </w:r>
+      <w:r>
+        <w:rPr>
+          <w:b/>
+          <w:bCs/>
+        </w:rPr>
+        <w:t xml:space="preserve"> </w:t>
+      </w:r>
     </w:p>
     <w:p>
       <w:pPr>
         <w:rPr>
-          <w:b/>
-          <w:bCs/>
-        </w:rPr>
-      </w:pPr>
+          <w:rFonts w:eastAsiaTheme="minorEastAsia"/>
+          <w:iCs/>
+          <w:color w:val="000000" w:themeColor="text1"/>
+        </w:rPr>
+      </w:pPr>
+      <w:r>
+        <w:rPr>
+          <w:rFonts w:eastAsiaTheme="minorEastAsia"/>
+          <w:iCs/>
+          <w:color w:val="000000" w:themeColor="text1"/>
+        </w:rPr>
+        <w:t>R</w:t>
+      </w:r>
+      <w:r>
+        <w:rPr>
+          <w:rFonts w:eastAsiaTheme="minorEastAsia"/>
+          <w:iCs/>
+          <w:color w:val="000000" w:themeColor="text1"/>
+        </w:rPr>
+        <w:t>ecuerde que</w:t>
+      </w:r>
+      <w:r>
+        <w:rPr>
+          <w:rFonts w:eastAsiaTheme="minorEastAsia"/>
+          <w:iCs/>
+          <w:color w:val="000000" w:themeColor="text1"/>
+        </w:rPr>
+        <w:t xml:space="preserve"> por</w:t>
+      </w:r>
+      <w:r>
+        <w:rPr>
+          <w:rFonts w:eastAsiaTheme="minorEastAsia"/>
+          <w:iCs/>
+          <w:color w:val="000000" w:themeColor="text1"/>
+        </w:rPr>
+        <w:t xml:space="preserve"> reglamento </w:t>
+      </w:r>
+      <w:r>
+        <w:rPr>
+          <w:rFonts w:eastAsiaTheme="minorEastAsia"/>
+          <w:iCs/>
+          <w:color w:val="000000" w:themeColor="text1"/>
+        </w:rPr>
+        <w:t xml:space="preserve">estudiantil se ha establecido que el límite de </w:t>
+      </w:r>
+      <w:r>
+        <w:rPr>
+          <w:rFonts w:eastAsiaTheme="minorEastAsia"/>
+          <w:iCs/>
+          <w:color w:val="000000" w:themeColor="text1"/>
+        </w:rPr>
+        <w:t xml:space="preserve">inasistencia </w:t>
+      </w:r>
+      <w:r>
+        <w:rPr>
+          <w:rFonts w:eastAsiaTheme="minorEastAsia"/>
+          <w:iCs/>
+          <w:color w:val="000000" w:themeColor="text1"/>
+        </w:rPr>
+        <w:t xml:space="preserve">en </w:t>
+      </w:r>
+      <w:r>
+        <w:rPr>
+          <w:rFonts w:eastAsiaTheme="minorEastAsia"/>
+          <w:iCs/>
+          <w:color w:val="000000" w:themeColor="text1"/>
+        </w:rPr>
+        <w:t xml:space="preserve">pregrado </w:t>
+      </w:r>
+      <w:r>
+        <w:rPr>
+          <w:rFonts w:eastAsiaTheme="minorEastAsia"/>
+          <w:iCs/>
+          <w:color w:val="000000" w:themeColor="text1"/>
+        </w:rPr>
+        <w:t xml:space="preserve">es </w:t>
+      </w:r>
+      <w:r>
+        <w:rPr>
+          <w:rFonts w:eastAsiaTheme="minorEastAsia"/>
+          <w:iCs/>
+          <w:color w:val="000000" w:themeColor="text1"/>
+        </w:rPr>
+        <w:t>20%</w:t>
+      </w:r>
+      <w:r>
+        <w:rPr>
+          <w:rFonts w:eastAsiaTheme="minorEastAsia"/>
+          <w:iCs/>
+          <w:color w:val="000000" w:themeColor="text1"/>
+        </w:rPr>
+        <w:t xml:space="preserve">, </w:t>
+      </w:r>
+      <w:r>
+        <w:rPr>
+          <w:rFonts w:eastAsiaTheme="minorEastAsia"/>
+          <w:iCs/>
+          <w:color w:val="000000" w:themeColor="text1"/>
+        </w:rPr>
+        <w:t xml:space="preserve">10% en </w:t>
+      </w:r>
+      <w:r>
+        <w:rPr>
+          <w:rFonts w:eastAsiaTheme="minorEastAsia"/>
+          <w:iCs/>
+          <w:color w:val="000000" w:themeColor="text1"/>
+        </w:rPr>
+        <w:t xml:space="preserve">prácticas </w:t>
+      </w:r>
+      <w:r>
+        <w:rPr>
+          <w:rFonts w:eastAsiaTheme="minorEastAsia"/>
+          <w:iCs/>
+          <w:color w:val="000000" w:themeColor="text1"/>
+        </w:rPr>
+        <w:t>clínicas</w:t>
+      </w:r>
+      <w:r>
+        <w:rPr>
+          <w:rFonts w:eastAsiaTheme="minorEastAsia"/>
+          <w:iCs/>
+          <w:color w:val="000000" w:themeColor="text1"/>
+        </w:rPr>
+        <w:t xml:space="preserve"> </w:t>
+      </w:r>
+      <w:r>
+        <w:rPr>
+          <w:rFonts w:eastAsiaTheme="minorEastAsia"/>
+          <w:iCs/>
+          <w:color w:val="000000" w:themeColor="text1"/>
+        </w:rPr>
+        <w:t>y</w:t>
+      </w:r>
+      <w:r>
+        <w:rPr>
+          <w:rFonts w:eastAsiaTheme="minorEastAsia"/>
+          <w:iCs/>
+          <w:color w:val="000000" w:themeColor="text1"/>
+        </w:rPr>
+        <w:t xml:space="preserve"> </w:t>
+      </w:r>
+      <w:r>
+        <w:rPr>
+          <w:rFonts w:eastAsiaTheme="minorEastAsia"/>
+          <w:iCs/>
+          <w:color w:val="000000" w:themeColor="text1"/>
+        </w:rPr>
+        <w:t>posgrado</w:t>
+      </w:r>
+      <w:r>
+        <w:rPr>
+          <w:rFonts w:eastAsiaTheme="minorEastAsia"/>
+          <w:iCs/>
+          <w:color w:val="000000" w:themeColor="text1"/>
+        </w:rPr>
+        <w:t xml:space="preserve"> </w:t>
+      </w:r>
+      <w:r>
+        <w:rPr>
+          <w:rFonts w:eastAsiaTheme="minorEastAsia"/>
+          <w:iCs/>
+          <w:color w:val="000000" w:themeColor="text1"/>
+        </w:rPr>
+        <w:t>30%</w:t>
+      </w:r>
+      <w:r>
+        <w:rPr>
+          <w:rFonts w:eastAsiaTheme="minorEastAsia"/>
+          <w:iCs/>
+          <w:color w:val="000000" w:themeColor="text1"/>
+        </w:rPr>
+        <w:t xml:space="preserve">. </w:t>
+      </w:r>
     </w:p>
     <w:p>
       <w:pPr>
         <w:rPr>
-          <w:b/>
-          <w:bCs/>
-        </w:rPr>
-      </w:pPr>
-      <w:r>
-        <w:rPr>
-          <w:b/>
-          <w:bCs/>
-        </w:rPr>
-        <w:lastRenderedPageBreak/>
-        <w:t>7</w:t>
-      </w:r>
-      <w:r>
-        <w:rPr>
-          <w:b/>
-          <w:bCs/>
-        </w:rPr>
-        <w:t>.</w:t>
-      </w:r>
-      <w:r>
-        <w:rPr>
-          <w:b/>
-          <w:bCs/>
-        </w:rPr>
-        <w:t xml:space="preserve"> </w:t>
-      </w:r>
-      <w:r>
-        <w:rPr>
-          <w:b/>
-          <w:bCs/>
-        </w:rPr>
-        <w:t xml:space="preserve">Acuerdos </w:t>
-      </w:r>
-      <w:r>
-        <w:rPr>
-          <w:b/>
-          <w:bCs/>
-        </w:rPr>
-        <w:t>y reglas d</w:t>
-      </w:r>
-      <w:r>
-        <w:rPr>
-          <w:b/>
-          <w:bCs/>
-        </w:rPr>
-        <w:t>e clase</w:t>
-      </w:r>
-      <w:r>
-        <w:rPr>
-          <w:b/>
-          <w:bCs/>
-        </w:rPr>
-        <w:t>:</w:t>
-      </w:r>
-      <w:r>
-        <w:rPr>
-          <w:b/>
-          <w:bCs/>
-        </w:rPr>
-        <w:t xml:space="preserve"> </w:t>
+          <w:color w:val="7F7F7F" w:themeColor="text1" w:themeTint="80"/>
+        </w:rPr>
+      </w:pPr>
+      <w:r>
+        <w:t>Acuerdos Particulares y Reglas de Clase:</w:t>
+      </w:r>
+      <w:r>
+        <w:br/>
+        <w:t>- Horario Oficial: Las clases se desarrollan los viernes de 10:00 AM a 1:00 PM en el salón L55.</w:t>
+      </w:r>
+      <w:r>
+        <w:br/>
+        <w:t xml:space="preserve">- Puntualidad: El ingreso a tiempo es fundamental debido a la alta carga práctica de los talleres (Pair </w:t>
+      </w:r>
+      <w:proofErr w:type="spellStart"/>
+      <w:r>
+        <w:t>Programming</w:t>
+      </w:r>
+      <w:proofErr w:type="spellEnd"/>
+      <w:r>
+        <w:t>).</w:t>
+      </w:r>
+      <w:r>
+        <w:br/>
+        <w:t>- Descanso Cognitivo: Para evitar fatiga técnica, se realizará una pausa de 20 minutos a las 11:30 AM.</w:t>
+      </w:r>
+      <w:r>
+        <w:br/>
+        <w:t>- Estrategia EMI: La participación en las actividades en inglés es obligatoria y sumará puntos de participación.</w:t>
+      </w:r>
+      <w:r>
+        <w:br/>
+        <w:t xml:space="preserve">- Uso Ético de IA: Fomentamos el uso de </w:t>
+      </w:r>
+      <w:proofErr w:type="spellStart"/>
+      <w:r>
+        <w:t>LLMNotebook</w:t>
+      </w:r>
+      <w:proofErr w:type="spellEnd"/>
+      <w:r>
+        <w:t xml:space="preserve"> y </w:t>
+      </w:r>
+      <w:proofErr w:type="spellStart"/>
+      <w:r>
+        <w:t>ChatGPT</w:t>
+      </w:r>
+      <w:proofErr w:type="spellEnd"/>
+      <w:r>
+        <w:t xml:space="preserve"> como asistentes de codificación (</w:t>
+      </w:r>
+      <w:proofErr w:type="spellStart"/>
+      <w:r>
+        <w:t>Copilot</w:t>
+      </w:r>
+      <w:proofErr w:type="spellEnd"/>
+      <w:r>
+        <w:t>) y exploración crítica, mas no para plagio. Toda respuesta generada por IA debe ser sustentada por el estudiante.</w:t>
       </w:r>
     </w:p>
     <w:p>
       <w:pPr>
-        <w:rPr>
-          <w:rFonts w:eastAsiaTheme="minorEastAsia"/>
-          <w:iCs/>
-          <w:color w:val="000000" w:themeColor="text1"/>
-        </w:rPr>
-      </w:pPr>
-      <w:r>
-        <w:rPr>
-          <w:rFonts w:eastAsiaTheme="minorEastAsia"/>
-          <w:iCs/>
-          <w:color w:val="000000" w:themeColor="text1"/>
-        </w:rPr>
-        <w:t>R</w:t>
-      </w:r>
-      <w:r>
-        <w:rPr>
-          <w:rFonts w:eastAsiaTheme="minorEastAsia"/>
-          <w:iCs/>
-          <w:color w:val="000000" w:themeColor="text1"/>
-        </w:rPr>
-        <w:t>ecuerde que</w:t>
-      </w:r>
-      <w:r>
-        <w:rPr>
-          <w:rFonts w:eastAsiaTheme="minorEastAsia"/>
-          <w:iCs/>
-          <w:color w:val="000000" w:themeColor="text1"/>
-        </w:rPr>
-        <w:t xml:space="preserve"> por</w:t>
-      </w:r>
-      <w:r>
-        <w:rPr>
-          <w:rFonts w:eastAsiaTheme="minorEastAsia"/>
-          <w:iCs/>
-          <w:color w:val="000000" w:themeColor="text1"/>
-        </w:rPr>
-        <w:t xml:space="preserve"> reglamento </w:t>
-      </w:r>
-      <w:r>
-        <w:rPr>
-          <w:rFonts w:eastAsiaTheme="minorEastAsia"/>
-          <w:iCs/>
-          <w:color w:val="000000" w:themeColor="text1"/>
-        </w:rPr>
-        <w:t xml:space="preserve">estudiantil se ha establecido que el límite de </w:t>
-      </w:r>
-      <w:r>
-        <w:rPr>
-          <w:rFonts w:eastAsiaTheme="minorEastAsia"/>
-          <w:iCs/>
-          <w:color w:val="000000" w:themeColor="text1"/>
-        </w:rPr>
-        <w:t xml:space="preserve">inasistencia </w:t>
-      </w:r>
-      <w:r>
-        <w:rPr>
-          <w:rFonts w:eastAsiaTheme="minorEastAsia"/>
-          <w:iCs/>
-          <w:color w:val="000000" w:themeColor="text1"/>
-        </w:rPr>
-        <w:t xml:space="preserve">en </w:t>
-      </w:r>
-      <w:r>
-        <w:rPr>
-          <w:rFonts w:eastAsiaTheme="minorEastAsia"/>
-          <w:iCs/>
-          <w:color w:val="000000" w:themeColor="text1"/>
-        </w:rPr>
-        <w:t xml:space="preserve">pregrado </w:t>
-      </w:r>
-      <w:r>
-        <w:rPr>
-          <w:rFonts w:eastAsiaTheme="minorEastAsia"/>
-          <w:iCs/>
-          <w:color w:val="000000" w:themeColor="text1"/>
-        </w:rPr>
-        <w:t xml:space="preserve">es </w:t>
-      </w:r>
-      <w:r>
-        <w:rPr>
-          <w:rFonts w:eastAsiaTheme="minorEastAsia"/>
-          <w:iCs/>
-          <w:color w:val="000000" w:themeColor="text1"/>
-        </w:rPr>
-        <w:t>20%</w:t>
-      </w:r>
-      <w:r>
-        <w:rPr>
-          <w:rFonts w:eastAsiaTheme="minorEastAsia"/>
-          <w:iCs/>
-          <w:color w:val="000000" w:themeColor="text1"/>
-        </w:rPr>
-        <w:t xml:space="preserve">, </w:t>
-      </w:r>
-      <w:r>
-        <w:rPr>
-          <w:rFonts w:eastAsiaTheme="minorEastAsia"/>
-          <w:iCs/>
-          <w:color w:val="000000" w:themeColor="text1"/>
-        </w:rPr>
-        <w:t xml:space="preserve">10% en </w:t>
-      </w:r>
-      <w:r>
-        <w:rPr>
-          <w:rFonts w:eastAsiaTheme="minorEastAsia"/>
-          <w:iCs/>
-          <w:color w:val="000000" w:themeColor="text1"/>
-        </w:rPr>
-        <w:t xml:space="preserve">prácticas </w:t>
-      </w:r>
-      <w:r>
-        <w:rPr>
-          <w:rFonts w:eastAsiaTheme="minorEastAsia"/>
-          <w:iCs/>
-          <w:color w:val="000000" w:themeColor="text1"/>
-        </w:rPr>
-        <w:t>clínicas</w:t>
-      </w:r>
-      <w:r>
-        <w:rPr>
-          <w:rFonts w:eastAsiaTheme="minorEastAsia"/>
-          <w:iCs/>
-          <w:color w:val="000000" w:themeColor="text1"/>
-        </w:rPr>
-        <w:t xml:space="preserve"> </w:t>
-      </w:r>
-      <w:r>
-        <w:rPr>
-          <w:rFonts w:eastAsiaTheme="minorEastAsia"/>
-          <w:iCs/>
-          <w:color w:val="000000" w:themeColor="text1"/>
-        </w:rPr>
-        <w:t>y</w:t>
-      </w:r>
-      <w:r>
-        <w:rPr>
-          <w:rFonts w:eastAsiaTheme="minorEastAsia"/>
-          <w:iCs/>
-          <w:color w:val="000000" w:themeColor="text1"/>
-        </w:rPr>
-        <w:t xml:space="preserve"> </w:t>
-      </w:r>
-      <w:r>
-        <w:rPr>
-          <w:rFonts w:eastAsiaTheme="minorEastAsia"/>
-          <w:iCs/>
-          <w:color w:val="000000" w:themeColor="text1"/>
-        </w:rPr>
-        <w:t>posgrado</w:t>
-      </w:r>
-      <w:r>
-        <w:rPr>
-          <w:rFonts w:eastAsiaTheme="minorEastAsia"/>
-          <w:iCs/>
-          <w:color w:val="000000" w:themeColor="text1"/>
-        </w:rPr>
-        <w:t xml:space="preserve"> </w:t>
-      </w:r>
-      <w:r>
-        <w:rPr>
-          <w:rFonts w:eastAsiaTheme="minorEastAsia"/>
-          <w:iCs/>
-          <w:color w:val="000000" w:themeColor="text1"/>
-        </w:rPr>
-        <w:t>30%</w:t>
-      </w:r>
-      <w:r>
-        <w:rPr>
-          <w:rFonts w:eastAsiaTheme="minorEastAsia"/>
-          <w:iCs/>
-          <w:color w:val="000000" w:themeColor="text1"/>
-        </w:rPr>
-        <w:t xml:space="preserve">. </w:t>
-      </w:r>
-    </w:p>
-    <w:p>
-      <w:pPr>
-        <w:rPr>
-          <w:color w:val="7F7F7F" w:themeColor="text1" w:themeTint="80"/>
-        </w:rPr>
-      </w:pPr>
-      <w:r>
-        <w:t>Acuerdos Particulares y Reglas de Clase:</w:t>
-        <w:br/>
-        <w:t>- Horario Oficial: Las clases se desarrollan los viernes de 10:00 AM a 1:00 PM en el salón L55.</w:t>
-        <w:br/>
-        <w:t>- Puntualidad: El ingreso a tiempo es fundamental debido a la alta carga práctica de los talleres (Pair Programming).</w:t>
-        <w:br/>
-        <w:t>- Descanso Cognitivo: Para evitar fatiga técnica, se realizará una pausa de 20 minutos a las 11:30 AM.</w:t>
-        <w:br/>
-        <w:t>- Estrategia EMI: La participación en las actividades en inglés es obligatoria y sumará puntos de participación.</w:t>
-        <w:br/>
-        <w:t>- Uso Ético de IA: Fomentamos el uso de LLMNotebook y ChatGPT como asistentes de codificación (Copilot) y exploración crítica, mas no para plagio. Toda respuesta generada por IA debe ser sustentada por el estudiante.</w:t>
-      </w:r>
-    </w:p>
-    <w:p>
-      <w:pPr>
-        <w:pStyle w:val="Prrafodelista"/>
+        <w:pStyle w:val="ListParagraph"/>
         <w:numPr>
           <w:ilvl w:val="0"/>
           <w:numId w:val="15"/>
@@ -2554,11 +3127,10 @@
           <w:color w:val="7F7F7F" w:themeColor="text1" w:themeTint="80"/>
         </w:rPr>
       </w:pPr>
-      <w:r/>
     </w:p>
     <w:p>
       <w:pPr>
-        <w:pStyle w:val="Prrafodelista"/>
+        <w:pStyle w:val="ListParagraph"/>
         <w:numPr>
           <w:ilvl w:val="0"/>
           <w:numId w:val="15"/>
@@ -2567,11 +3139,10 @@
           <w:color w:val="7F7F7F" w:themeColor="text1" w:themeTint="80"/>
         </w:rPr>
       </w:pPr>
-      <w:r/>
     </w:p>
     <w:p>
       <w:pPr>
-        <w:pStyle w:val="Prrafodelista"/>
+        <w:pStyle w:val="ListParagraph"/>
         <w:numPr>
           <w:ilvl w:val="0"/>
           <w:numId w:val="15"/>
@@ -2580,11 +3151,10 @@
           <w:color w:val="7F7F7F" w:themeColor="text1" w:themeTint="80"/>
         </w:rPr>
       </w:pPr>
-      <w:r/>
     </w:p>
     <w:p>
       <w:pPr>
-        <w:pStyle w:val="Prrafodelista"/>
+        <w:pStyle w:val="ListParagraph"/>
         <w:numPr>
           <w:ilvl w:val="0"/>
           <w:numId w:val="15"/>
@@ -2593,11 +3163,10 @@
           <w:color w:val="7F7F7F" w:themeColor="text1" w:themeTint="80"/>
         </w:rPr>
       </w:pPr>
-      <w:r/>
     </w:p>
     <w:p>
       <w:pPr>
-        <w:pStyle w:val="Prrafodelista"/>
+        <w:pStyle w:val="ListParagraph"/>
         <w:numPr>
           <w:ilvl w:val="0"/>
           <w:numId w:val="15"/>
@@ -2606,11 +3175,10 @@
           <w:color w:val="7F7F7F" w:themeColor="text1" w:themeTint="80"/>
         </w:rPr>
       </w:pPr>
-      <w:r/>
     </w:p>
     <w:p>
       <w:pPr>
-        <w:pStyle w:val="Prrafodelista"/>
+        <w:pStyle w:val="ListParagraph"/>
         <w:numPr>
           <w:ilvl w:val="0"/>
           <w:numId w:val="15"/>
@@ -2619,11 +3187,10 @@
           <w:color w:val="7F7F7F" w:themeColor="text1" w:themeTint="80"/>
         </w:rPr>
       </w:pPr>
-      <w:r/>
     </w:p>
     <w:p>
       <w:pPr>
-        <w:pStyle w:val="Prrafodelista"/>
+        <w:pStyle w:val="ListParagraph"/>
         <w:ind w:left="1440"/>
         <w:rPr>
           <w:color w:val="7F7F7F" w:themeColor="text1" w:themeTint="80"/>
@@ -2706,7 +3273,7 @@
     </w:p>
     <w:p>
       <w:pPr>
-        <w:pStyle w:val="Prrafodelista"/>
+        <w:pStyle w:val="ListParagraph"/>
         <w:numPr>
           <w:ilvl w:val="0"/>
           <w:numId w:val="23"/>
@@ -2718,7 +3285,7 @@
     </w:p>
     <w:p>
       <w:pPr>
-        <w:pStyle w:val="Prrafodelista"/>
+        <w:pStyle w:val="ListParagraph"/>
         <w:numPr>
           <w:ilvl w:val="0"/>
           <w:numId w:val="23"/>
@@ -2730,7 +3297,7 @@
     </w:p>
     <w:p>
       <w:pPr>
-        <w:pStyle w:val="Prrafodelista"/>
+        <w:pStyle w:val="ListParagraph"/>
         <w:numPr>
           <w:ilvl w:val="0"/>
           <w:numId w:val="23"/>
@@ -2742,19 +3309,20 @@
     </w:p>
     <w:p>
       <w:pPr>
-        <w:pStyle w:val="Prrafodelista"/>
+        <w:pStyle w:val="ListParagraph"/>
         <w:numPr>
           <w:ilvl w:val="0"/>
           <w:numId w:val="23"/>
         </w:numPr>
       </w:pPr>
       <w:r>
+        <w:lastRenderedPageBreak/>
         <w:t>Acoger y cumplir las normas institucionales establecidas en el PEI, el Código de Ética, los reglamentos académicos y otras políticas clave de la UNAB, como las de género, convivencia, propiedad intelectual, y ética en la investigación.</w:t>
       </w:r>
     </w:p>
     <w:p>
       <w:pPr>
-        <w:pStyle w:val="Prrafodelista"/>
+        <w:pStyle w:val="ListParagraph"/>
         <w:numPr>
           <w:ilvl w:val="0"/>
           <w:numId w:val="23"/>
@@ -2838,7 +3406,7 @@
     </w:p>
     <w:p>
       <w:pPr>
-        <w:pStyle w:val="Prrafodelista"/>
+        <w:pStyle w:val="ListParagraph"/>
         <w:ind w:left="0"/>
       </w:pPr>
       <w:r>
@@ -2876,19 +3444,15 @@
         <w:t xml:space="preserve">es una herramienta que puede transformar la educación, la investigación, la gestión y la relación con la sociedad. Sostenemos el principio de que la tecnología debe estar subordinada al juicio humano y que su uso e implementación </w:t>
       </w:r>
       <w:r>
-        <w:t xml:space="preserve">debe ser siempre ético, transparente y contextualizo y estar guiado por la inclusión, el pensamiento crítico y el respeto por la persona, en coherencia con nuestra misión </w:t>
-      </w:r>
-      <w:r>
-        <w:lastRenderedPageBreak/>
-        <w:t xml:space="preserve">educativa. Este curso sigue </w:t>
+        <w:t xml:space="preserve">debe ser siempre ético, transparente y contextualizo y estar guiado por la inclusión, el pensamiento crítico y el respeto por la persona, en coherencia con nuestra misión educativa. Este curso sigue </w:t>
       </w:r>
       <w:r>
         <w:t xml:space="preserve">los lineamientos de la universidad para el uso de la IA que se encuentran disponibles en </w:t>
       </w:r>
-      <w:hyperlink r:id="rId13" w:history="1">
+      <w:hyperlink r:id="rId11" w:history="1">
         <w:r>
           <w:rPr>
-            <w:rStyle w:val="Hipervnculo"/>
+            <w:rStyle w:val="Hyperlink"/>
           </w:rPr>
           <w:t>https://unabdigital.unab.edu.co/landing-ia.html</w:t>
         </w:r>
@@ -2896,13 +3460,13 @@
     </w:p>
     <w:p>
       <w:pPr>
-        <w:pStyle w:val="Prrafodelista"/>
+        <w:pStyle w:val="ListParagraph"/>
         <w:ind w:left="0"/>
       </w:pPr>
     </w:p>
     <w:p>
       <w:pPr>
-        <w:pStyle w:val="Prrafodelista"/>
+        <w:pStyle w:val="ListParagraph"/>
         <w:ind w:left="0"/>
       </w:pPr>
       <w:r>
@@ -2911,7 +3475,7 @@
     </w:p>
     <w:p>
       <w:pPr>
-        <w:pStyle w:val="Prrafodelista"/>
+        <w:pStyle w:val="ListParagraph"/>
         <w:numPr>
           <w:ilvl w:val="0"/>
           <w:numId w:val="25"/>
@@ -2927,7 +3491,7 @@
     </w:p>
     <w:p>
       <w:pPr>
-        <w:pStyle w:val="Prrafodelista"/>
+        <w:pStyle w:val="ListParagraph"/>
         <w:numPr>
           <w:ilvl w:val="0"/>
           <w:numId w:val="25"/>
@@ -2943,7 +3507,7 @@
     </w:p>
     <w:p>
       <w:pPr>
-        <w:pStyle w:val="Prrafodelista"/>
+        <w:pStyle w:val="ListParagraph"/>
         <w:numPr>
           <w:ilvl w:val="0"/>
           <w:numId w:val="25"/>
@@ -2959,7 +3523,7 @@
     </w:p>
     <w:p>
       <w:pPr>
-        <w:pStyle w:val="Prrafodelista"/>
+        <w:pStyle w:val="ListParagraph"/>
         <w:numPr>
           <w:ilvl w:val="0"/>
           <w:numId w:val="25"/>
@@ -2975,7 +3539,7 @@
     </w:p>
     <w:p>
       <w:pPr>
-        <w:pStyle w:val="Prrafodelista"/>
+        <w:pStyle w:val="ListParagraph"/>
         <w:numPr>
           <w:ilvl w:val="0"/>
           <w:numId w:val="25"/>
@@ -2991,7 +3555,7 @@
     </w:p>
     <w:p>
       <w:pPr>
-        <w:pStyle w:val="Prrafodelista"/>
+        <w:pStyle w:val="ListParagraph"/>
         <w:numPr>
           <w:ilvl w:val="0"/>
           <w:numId w:val="25"/>
@@ -3007,7 +3571,7 @@
     </w:p>
     <w:p>
       <w:pPr>
-        <w:pStyle w:val="Prrafodelista"/>
+        <w:pStyle w:val="ListParagraph"/>
         <w:numPr>
           <w:ilvl w:val="0"/>
           <w:numId w:val="25"/>
@@ -3023,7 +3587,7 @@
     </w:p>
     <w:p>
       <w:pPr>
-        <w:pStyle w:val="Prrafodelista"/>
+        <w:pStyle w:val="ListParagraph"/>
         <w:numPr>
           <w:ilvl w:val="0"/>
           <w:numId w:val="25"/>
@@ -3039,7 +3603,7 @@
     </w:p>
     <w:p>
       <w:pPr>
-        <w:pStyle w:val="Prrafodelista"/>
+        <w:pStyle w:val="ListParagraph"/>
         <w:numPr>
           <w:ilvl w:val="0"/>
           <w:numId w:val="25"/>
@@ -3055,7 +3619,7 @@
     </w:p>
     <w:p>
       <w:pPr>
-        <w:pStyle w:val="Prrafodelista"/>
+        <w:pStyle w:val="ListParagraph"/>
         <w:numPr>
           <w:ilvl w:val="0"/>
           <w:numId w:val="25"/>
@@ -3071,7 +3635,7 @@
     </w:p>
     <w:p>
       <w:pPr>
-        <w:pStyle w:val="Prrafodelista"/>
+        <w:pStyle w:val="ListParagraph"/>
         <w:ind w:left="0"/>
         <w:rPr>
           <w:rFonts w:eastAsiaTheme="minorEastAsia"/>
@@ -3081,7 +3645,7 @@
     </w:p>
     <w:p>
       <w:pPr>
-        <w:pStyle w:val="Prrafodelista"/>
+        <w:pStyle w:val="ListParagraph"/>
         <w:ind w:left="0"/>
       </w:pPr>
       <w:r>
@@ -3094,12 +3658,20 @@
         <w:t>obligatorio citar el uso de la IA</w:t>
       </w:r>
       <w:r>
-        <w:t xml:space="preserve"> en todos los casos, esto significa declarar: qué herramienta(s) fueron empleadas, para qué o en qué momento, con qué prompts, la versión del modelo usado y qué aportes hizo el estudiante (análisis, decisiones, evidencias, síntesis, verificación de fuentes, entre otros).</w:t>
+        <w:t xml:space="preserve"> en todos los casos, esto significa declarar: qué herramienta(s) fueron empleadas, para qué o en qué momento, con qué </w:t>
+      </w:r>
+      <w:proofErr w:type="spellStart"/>
+      <w:r>
+        <w:t>prompts</w:t>
+      </w:r>
+      <w:proofErr w:type="spellEnd"/>
+      <w:r>
+        <w:t>, la versión del modelo usado y qué aportes hizo el estudiante (análisis, decisiones, evidencias, síntesis, verificación de fuentes, entre otros).</w:t>
       </w:r>
     </w:p>
     <w:p>
       <w:pPr>
-        <w:pStyle w:val="Prrafodelista"/>
+        <w:pStyle w:val="ListParagraph"/>
         <w:rPr>
           <w:rFonts w:eastAsiaTheme="minorEastAsia"/>
           <w:color w:val="000000" w:themeColor="text1"/>
@@ -3108,7 +3680,7 @@
     </w:p>
     <w:p>
       <w:pPr>
-        <w:pStyle w:val="Prrafodelista"/>
+        <w:pStyle w:val="ListParagraph"/>
         <w:rPr>
           <w:rFonts w:eastAsiaTheme="minorEastAsia"/>
           <w:color w:val="000000" w:themeColor="text1"/>
@@ -3117,7 +3689,7 @@
     </w:p>
     <w:p>
       <w:pPr>
-        <w:pStyle w:val="Prrafodelista"/>
+        <w:pStyle w:val="ListParagraph"/>
         <w:rPr>
           <w:rFonts w:eastAsiaTheme="minorEastAsia"/>
           <w:b/>
@@ -3135,7 +3707,7 @@
     </w:p>
     <w:p>
       <w:pPr>
-        <w:pStyle w:val="Prrafodelista"/>
+        <w:pStyle w:val="ListParagraph"/>
         <w:rPr>
           <w:rFonts w:eastAsiaTheme="minorEastAsia"/>
           <w:b/>
@@ -3300,12 +3872,13 @@
           <w:rFonts w:eastAsiaTheme="minorEastAsia"/>
           <w:color w:val="000000" w:themeColor="text1"/>
         </w:rPr>
+        <w:lastRenderedPageBreak/>
         <w:t xml:space="preserve">Si necesitas mentoría comunícate a: </w:t>
       </w:r>
-      <w:hyperlink r:id="rId14" w:history="1">
+      <w:hyperlink r:id="rId12" w:history="1">
         <w:r>
           <w:rPr>
-            <w:rStyle w:val="Hipervnculo"/>
+            <w:rStyle w:val="Hyperlink"/>
             <w:rFonts w:eastAsiaTheme="minorEastAsia"/>
           </w:rPr>
           <w:t>meta_dexe@unab.edu.co</w:t>
@@ -3379,10 +3952,10 @@
         </w:rPr>
         <w:t xml:space="preserve">cate a: </w:t>
       </w:r>
-      <w:hyperlink r:id="rId15" w:history="1">
+      <w:hyperlink r:id="rId13" w:history="1">
         <w:r>
           <w:rPr>
-            <w:rStyle w:val="Hipervnculo"/>
+            <w:rStyle w:val="Hyperlink"/>
             <w:rFonts w:eastAsiaTheme="minorEastAsia"/>
           </w:rPr>
           <w:t>apoyoacademico_dexe@unab.edu.co</w:t>
@@ -3391,7 +3964,7 @@
     </w:p>
     <w:p>
       <w:pPr>
-        <w:pStyle w:val="Prrafodelista"/>
+        <w:pStyle w:val="ListParagraph"/>
         <w:ind w:left="1416"/>
         <w:rPr>
           <w:rFonts w:eastAsiaTheme="minorEastAsia"/>
@@ -3412,11 +3985,21 @@
           <w:b/>
           <w:color w:val="000000" w:themeColor="text1"/>
         </w:rPr>
-        <w:t>-Programa EntreSeres</w:t>
-      </w:r>
+        <w:t xml:space="preserve">-Programa </w:t>
+      </w:r>
+      <w:proofErr w:type="spellStart"/>
       <w:r>
         <w:rPr>
           <w:rFonts w:eastAsiaTheme="minorEastAsia"/>
+          <w:b/>
+          <w:color w:val="000000" w:themeColor="text1"/>
+        </w:rPr>
+        <w:t>EntreSeres</w:t>
+      </w:r>
+      <w:proofErr w:type="spellEnd"/>
+      <w:r>
+        <w:rPr>
+          <w:rFonts w:eastAsiaTheme="minorEastAsia"/>
           <w:color w:val="000000" w:themeColor="text1"/>
         </w:rPr>
         <w:t>. Si haces parte de una población de especial protección constitucional, como personas con discapacidad, víctimas del conflicto armado, personas con orientaciones sexuales e identidades de género diversas, comunidades afrodescendientes, indígenas, raizales, palenqueras u otros grupos que requieran apoyos para favorecer su participación y permanencia en la vida universitaria, puedes acceder a</w:t>
@@ -3440,15 +4023,7 @@
           <w:rFonts w:eastAsiaTheme="minorEastAsia"/>
           <w:color w:val="000000" w:themeColor="text1"/>
         </w:rPr>
-        <w:t xml:space="preserve"> </w:t>
-      </w:r>
-      <w:r>
-        <w:rPr>
-          <w:rFonts w:eastAsiaTheme="minorEastAsia"/>
-          <w:color w:val="000000" w:themeColor="text1"/>
-        </w:rPr>
-        <w:lastRenderedPageBreak/>
-        <w:t xml:space="preserve">que te </w:t>
+        <w:t xml:space="preserve"> que te </w:t>
       </w:r>
       <w:r>
         <w:rPr>
@@ -3470,19 +4045,35 @@
           <w:rFonts w:eastAsiaTheme="minorEastAsia"/>
           <w:color w:val="000000" w:themeColor="text1"/>
         </w:rPr>
-        <w:t>Si quieres participar en EntreSeres comunícate a</w:t>
-      </w:r>
+        <w:t xml:space="preserve">Si quieres participar en </w:t>
+      </w:r>
+      <w:proofErr w:type="spellStart"/>
       <w:r>
         <w:rPr>
           <w:rFonts w:eastAsiaTheme="minorEastAsia"/>
           <w:color w:val="000000" w:themeColor="text1"/>
         </w:rPr>
+        <w:t>EntreSeres</w:t>
+      </w:r>
+      <w:proofErr w:type="spellEnd"/>
+      <w:r>
+        <w:rPr>
+          <w:rFonts w:eastAsiaTheme="minorEastAsia"/>
+          <w:color w:val="000000" w:themeColor="text1"/>
+        </w:rPr>
+        <w:t xml:space="preserve"> comunícate a</w:t>
+      </w:r>
+      <w:r>
+        <w:rPr>
+          <w:rFonts w:eastAsiaTheme="minorEastAsia"/>
+          <w:color w:val="000000" w:themeColor="text1"/>
+        </w:rPr>
         <w:t xml:space="preserve"> través del correo </w:t>
       </w:r>
-      <w:hyperlink r:id="rId16" w:history="1">
+      <w:hyperlink r:id="rId14" w:history="1">
         <w:r>
           <w:rPr>
-            <w:rStyle w:val="Hipervnculo"/>
+            <w:rStyle w:val="Hyperlink"/>
             <w:rFonts w:eastAsiaTheme="minorEastAsia"/>
           </w:rPr>
           <w:t>entreseres@unab.edu.co</w:t>
@@ -3525,8 +4116,8 @@
       </w:r>
     </w:p>
     <w:sectPr>
-      <w:headerReference w:type="default" r:id="rId17"/>
-      <w:footerReference w:type="default" r:id="rId18"/>
+      <w:headerReference w:type="default" r:id="rId15"/>
+      <w:footerReference w:type="default" r:id="rId16"/>
       <w:pgSz w:w="12240" w:h="15840"/>
       <w:pgMar w:top="720" w:right="720" w:bottom="720" w:left="720" w:header="170" w:footer="708" w:gutter="0"/>
       <w:cols w:space="708"/>
@@ -3537,7 +4128,7 @@
 </file>
 
 <file path=word/endnotes.xml><?xml version="1.0" encoding="utf-8"?>
-<w:endnotes xmlns:wpc="http://schemas.microsoft.com/office/word/2010/wordprocessingCanvas" xmlns:cx="http://schemas.microsoft.com/office/drawing/2014/chartex" xmlns:cx1="http://schemas.microsoft.com/office/drawing/2015/9/8/chartex" xmlns:cx2="http://schemas.microsoft.com/office/drawing/2015/10/21/chartex" xmlns:cx3="http://schemas.microsoft.com/office/drawing/2016/5/9/chartex" xmlns:cx4="http://schemas.microsoft.com/office/drawing/2016/5/10/chartex" xmlns:cx5="http://schemas.microsoft.com/office/drawing/2016/5/11/chartex" xmlns:cx6="http://schemas.microsoft.com/office/drawing/2016/5/12/chartex" xmlns:cx7="http://schemas.microsoft.com/office/drawing/2016/5/13/chartex" xmlns:cx8="http://schemas.microsoft.com/office/drawing/2016/5/14/chartex" xmlns:mc="http://schemas.openxmlformats.org/markup-compatibility/2006" xmlns:aink="http://schemas.microsoft.com/office/drawing/2016/ink" xmlns:am3d="http://schemas.microsoft.com/office/drawing/2017/model3d" xmlns:o="urn:schemas-microsoft-com:office:office" xmlns:oel="http://schemas.microsoft.com/office/2019/extlst" xmlns:r="http://schemas.openxmlformats.org/officeDocument/2006/relationships" xmlns:m="http://schemas.openxmlformats.org/officeDocument/2006/math" xmlns:v="urn:schemas-microsoft-com:vml" xmlns:wp14="http://schemas.microsoft.com/office/word/2010/wordprocessingDrawing" xmlns:wp="http://schemas.openxmlformats.org/drawingml/2006/wordprocessingDrawing" xmlns:w10="urn:schemas-microsoft-com:office:word" xmlns:w="http://schemas.openxmlformats.org/wordprocessingml/2006/main" xmlns:w14="http://schemas.microsoft.com/office/word/2010/wordml" xmlns:w15="http://schemas.microsoft.com/office/word/2012/wordml" xmlns:w16cex="http://schemas.microsoft.com/office/word/2018/wordml/cex" xmlns:w16cid="http://schemas.microsoft.com/office/word/2016/wordml/cid" xmlns:w16="http://schemas.microsoft.com/office/word/2018/wordml" xmlns:w16du="http://schemas.microsoft.com/office/word/2023/wordml/word16du" xmlns:w16sdtdh="http://schemas.microsoft.com/office/word/2020/wordml/sdtdatahash" xmlns:w16sdtfl="http://schemas.microsoft.com/office/word/2024/wordml/sdtformatlock" xmlns:w16se="http://schemas.microsoft.com/office/word/2015/wordml/symex" xmlns:wpg="http://schemas.microsoft.com/office/word/2010/wordprocessingGroup" xmlns:wpi="http://schemas.microsoft.com/office/word/2010/wordprocessingInk" xmlns:wne="http://schemas.microsoft.com/office/word/2006/wordml" xmlns:wps="http://schemas.microsoft.com/office/word/2010/wordprocessingShape" mc:Ignorable="w14 w15 w16se w16cid w16 w16cex w16sdtdh w16sdtfl w16du wp14">
+<w:endnotes xmlns:wpc="http://schemas.microsoft.com/office/word/2010/wordprocessingCanvas" xmlns:cx="http://schemas.microsoft.com/office/drawing/2014/chartex" xmlns:cx1="http://schemas.microsoft.com/office/drawing/2015/9/8/chartex" xmlns:cx2="http://schemas.microsoft.com/office/drawing/2015/10/21/chartex" xmlns:cx3="http://schemas.microsoft.com/office/drawing/2016/5/9/chartex" xmlns:cx4="http://schemas.microsoft.com/office/drawing/2016/5/10/chartex" xmlns:cx5="http://schemas.microsoft.com/office/drawing/2016/5/11/chartex" xmlns:cx6="http://schemas.microsoft.com/office/drawing/2016/5/12/chartex" xmlns:cx7="http://schemas.microsoft.com/office/drawing/2016/5/13/chartex" xmlns:cx8="http://schemas.microsoft.com/office/drawing/2016/5/14/chartex" xmlns:mc="http://schemas.openxmlformats.org/markup-compatibility/2006" xmlns:aink="http://schemas.microsoft.com/office/drawing/2016/ink" xmlns:am3d="http://schemas.microsoft.com/office/drawing/2017/model3d" xmlns:o="urn:schemas-microsoft-com:office:office" xmlns:oel="http://schemas.microsoft.com/office/2019/extlst" xmlns:r="http://schemas.openxmlformats.org/officeDocument/2006/relationships" xmlns:m="http://schemas.openxmlformats.org/officeDocument/2006/math" xmlns:v="urn:schemas-microsoft-com:vml" xmlns:wp14="http://schemas.microsoft.com/office/word/2010/wordprocessingDrawing" xmlns:wp="http://schemas.openxmlformats.org/drawingml/2006/wordprocessingDrawing" xmlns:w10="urn:schemas-microsoft-com:office:word" xmlns:w="http://schemas.openxmlformats.org/wordprocessingml/2006/main" xmlns:w14="http://schemas.microsoft.com/office/word/2010/wordml" xmlns:w15="http://schemas.microsoft.com/office/word/2012/wordml" xmlns:w16cei="http://schemas.microsoft.com/office/word/2026/wordml/cei" xmlns:w16cex="http://schemas.microsoft.com/office/word/2018/wordml/cex" xmlns:w16cid="http://schemas.microsoft.com/office/word/2016/wordml/cid" xmlns:w16="http://schemas.microsoft.com/office/word/2018/wordml" xmlns:w16du="http://schemas.microsoft.com/office/word/2023/wordml/word16du" xmlns:w16sdtdh="http://schemas.microsoft.com/office/word/2020/wordml/sdtdatahash" xmlns:w16sdtfl="http://schemas.microsoft.com/office/word/2024/wordml/sdtformatlock" xmlns:w16se="http://schemas.microsoft.com/office/word/2015/wordml/symex" xmlns:wpg="http://schemas.microsoft.com/office/word/2010/wordprocessingGroup" xmlns:wpi="http://schemas.microsoft.com/office/word/2010/wordprocessingInk" xmlns:wne="http://schemas.microsoft.com/office/word/2006/wordml" xmlns:wps="http://schemas.microsoft.com/office/word/2010/wordprocessingShape" mc:Ignorable="w14 w15 w16se w16cid w16 w16cex w16sdtdh w16sdtfl w16du wp14">
   <w:endnote w:type="separator" w:id="-1">
     <w:p>
       <w:pPr>
@@ -3562,7 +4153,7 @@
 </file>
 
 <file path=word/footer1.xml><?xml version="1.0" encoding="utf-8"?>
-<w:ftr xmlns:wpc="http://schemas.microsoft.com/office/word/2010/wordprocessingCanvas" xmlns:cx="http://schemas.microsoft.com/office/drawing/2014/chartex" xmlns:cx1="http://schemas.microsoft.com/office/drawing/2015/9/8/chartex" xmlns:cx2="http://schemas.microsoft.com/office/drawing/2015/10/21/chartex" xmlns:cx3="http://schemas.microsoft.com/office/drawing/2016/5/9/chartex" xmlns:cx4="http://schemas.microsoft.com/office/drawing/2016/5/10/chartex" xmlns:cx5="http://schemas.microsoft.com/office/drawing/2016/5/11/chartex" xmlns:cx6="http://schemas.microsoft.com/office/drawing/2016/5/12/chartex" xmlns:cx7="http://schemas.microsoft.com/office/drawing/2016/5/13/chartex" xmlns:cx8="http://schemas.microsoft.com/office/drawing/2016/5/14/chartex" xmlns:mc="http://schemas.openxmlformats.org/markup-compatibility/2006" xmlns:aink="http://schemas.microsoft.com/office/drawing/2016/ink" xmlns:am3d="http://schemas.microsoft.com/office/drawing/2017/model3d" xmlns:o="urn:schemas-microsoft-com:office:office" xmlns:oel="http://schemas.microsoft.com/office/2019/extlst" xmlns:r="http://schemas.openxmlformats.org/officeDocument/2006/relationships" xmlns:m="http://schemas.openxmlformats.org/officeDocument/2006/math" xmlns:v="urn:schemas-microsoft-com:vml" xmlns:wp14="http://schemas.microsoft.com/office/word/2010/wordprocessingDrawing" xmlns:wp="http://schemas.openxmlformats.org/drawingml/2006/wordprocessingDrawing" xmlns:w10="urn:schemas-microsoft-com:office:word" xmlns:w="http://schemas.openxmlformats.org/wordprocessingml/2006/main" xmlns:w14="http://schemas.microsoft.com/office/word/2010/wordml" xmlns:w15="http://schemas.microsoft.com/office/word/2012/wordml" xmlns:w16cex="http://schemas.microsoft.com/office/word/2018/wordml/cex" xmlns:w16cid="http://schemas.microsoft.com/office/word/2016/wordml/cid" xmlns:w16="http://schemas.microsoft.com/office/word/2018/wordml" xmlns:w16du="http://schemas.microsoft.com/office/word/2023/wordml/word16du" xmlns:w16sdtdh="http://schemas.microsoft.com/office/word/2020/wordml/sdtdatahash" xmlns:w16sdtfl="http://schemas.microsoft.com/office/word/2024/wordml/sdtformatlock" xmlns:w16se="http://schemas.microsoft.com/office/word/2015/wordml/symex" xmlns:wpg="http://schemas.microsoft.com/office/word/2010/wordprocessingGroup" xmlns:wpi="http://schemas.microsoft.com/office/word/2010/wordprocessingInk" xmlns:wne="http://schemas.microsoft.com/office/word/2006/wordml" xmlns:wps="http://schemas.microsoft.com/office/word/2010/wordprocessingShape" mc:Ignorable="w14 w15 w16se w16cid w16 w16cex w16sdtdh w16sdtfl w16du wp14">
+<w:ftr xmlns:wpc="http://schemas.microsoft.com/office/word/2010/wordprocessingCanvas" xmlns:cx="http://schemas.microsoft.com/office/drawing/2014/chartex" xmlns:cx1="http://schemas.microsoft.com/office/drawing/2015/9/8/chartex" xmlns:cx2="http://schemas.microsoft.com/office/drawing/2015/10/21/chartex" xmlns:cx3="http://schemas.microsoft.com/office/drawing/2016/5/9/chartex" xmlns:cx4="http://schemas.microsoft.com/office/drawing/2016/5/10/chartex" xmlns:cx5="http://schemas.microsoft.com/office/drawing/2016/5/11/chartex" xmlns:cx6="http://schemas.microsoft.com/office/drawing/2016/5/12/chartex" xmlns:cx7="http://schemas.microsoft.com/office/drawing/2016/5/13/chartex" xmlns:cx8="http://schemas.microsoft.com/office/drawing/2016/5/14/chartex" xmlns:mc="http://schemas.openxmlformats.org/markup-compatibility/2006" xmlns:aink="http://schemas.microsoft.com/office/drawing/2016/ink" xmlns:am3d="http://schemas.microsoft.com/office/drawing/2017/model3d" xmlns:o="urn:schemas-microsoft-com:office:office" xmlns:oel="http://schemas.microsoft.com/office/2019/extlst" xmlns:r="http://schemas.openxmlformats.org/officeDocument/2006/relationships" xmlns:m="http://schemas.openxmlformats.org/officeDocument/2006/math" xmlns:v="urn:schemas-microsoft-com:vml" xmlns:wp14="http://schemas.microsoft.com/office/word/2010/wordprocessingDrawing" xmlns:wp="http://schemas.openxmlformats.org/drawingml/2006/wordprocessingDrawing" xmlns:w10="urn:schemas-microsoft-com:office:word" xmlns:w="http://schemas.openxmlformats.org/wordprocessingml/2006/main" xmlns:w14="http://schemas.microsoft.com/office/word/2010/wordml" xmlns:w15="http://schemas.microsoft.com/office/word/2012/wordml" xmlns:w16cei="http://schemas.microsoft.com/office/word/2026/wordml/cei" xmlns:w16cex="http://schemas.microsoft.com/office/word/2018/wordml/cex" xmlns:w16cid="http://schemas.microsoft.com/office/word/2016/wordml/cid" xmlns:w16="http://schemas.microsoft.com/office/word/2018/wordml" xmlns:w16du="http://schemas.microsoft.com/office/word/2023/wordml/word16du" xmlns:w16sdtdh="http://schemas.microsoft.com/office/word/2020/wordml/sdtdatahash" xmlns:w16sdtfl="http://schemas.microsoft.com/office/word/2024/wordml/sdtformatlock" xmlns:w16se="http://schemas.microsoft.com/office/word/2015/wordml/symex" xmlns:wpg="http://schemas.microsoft.com/office/word/2010/wordprocessingGroup" xmlns:wpi="http://schemas.microsoft.com/office/word/2010/wordprocessingInk" xmlns:wne="http://schemas.microsoft.com/office/word/2006/wordml" xmlns:wps="http://schemas.microsoft.com/office/word/2010/wordprocessingShape" mc:Ignorable="w14 w15 w16se w16cid w16 w16cex w16sdtdh w16sdtfl w16du wp14">
   <w:sdt>
     <w:sdtPr>
       <w:id w:val="1584268083"/>
@@ -3574,7 +4165,7 @@
     <w:sdtContent>
       <w:p>
         <w:pPr>
-          <w:pStyle w:val="Piedepgina"/>
+          <w:pStyle w:val="Footer"/>
           <w:jc w:val="right"/>
         </w:pPr>
         <w:r>
@@ -3600,7 +4191,7 @@
   </w:sdt>
   <w:p>
     <w:pPr>
-      <w:pStyle w:val="Piedepgina"/>
+      <w:pStyle w:val="Footer"/>
       <w:jc w:val="center"/>
       <w:rPr>
         <w:sz w:val="20"/>
@@ -3638,7 +4229,7 @@
   </w:p>
   <w:p>
     <w:pPr>
-      <w:pStyle w:val="Piedepgina"/>
+      <w:pStyle w:val="Footer"/>
       <w:jc w:val="center"/>
       <w:rPr>
         <w:sz w:val="20"/>
@@ -3655,7 +4246,7 @@
   </w:p>
   <w:p>
     <w:pPr>
-      <w:pStyle w:val="Piedepgina"/>
+      <w:pStyle w:val="Footer"/>
       <w:jc w:val="center"/>
       <w:rPr>
         <w:sz w:val="20"/>
@@ -3667,7 +4258,7 @@
 </file>
 
 <file path=word/footnotes.xml><?xml version="1.0" encoding="utf-8"?>
-<w:footnotes xmlns:wpc="http://schemas.microsoft.com/office/word/2010/wordprocessingCanvas" xmlns:cx="http://schemas.microsoft.com/office/drawing/2014/chartex" xmlns:cx1="http://schemas.microsoft.com/office/drawing/2015/9/8/chartex" xmlns:cx2="http://schemas.microsoft.com/office/drawing/2015/10/21/chartex" xmlns:cx3="http://schemas.microsoft.com/office/drawing/2016/5/9/chartex" xmlns:cx4="http://schemas.microsoft.com/office/drawing/2016/5/10/chartex" xmlns:cx5="http://schemas.microsoft.com/office/drawing/2016/5/11/chartex" xmlns:cx6="http://schemas.microsoft.com/office/drawing/2016/5/12/chartex" xmlns:cx7="http://schemas.microsoft.com/office/drawing/2016/5/13/chartex" xmlns:cx8="http://schemas.microsoft.com/office/drawing/2016/5/14/chartex" xmlns:mc="http://schemas.openxmlformats.org/markup-compatibility/2006" xmlns:aink="http://schemas.microsoft.com/office/drawing/2016/ink" xmlns:am3d="http://schemas.microsoft.com/office/drawing/2017/model3d" xmlns:o="urn:schemas-microsoft-com:office:office" xmlns:oel="http://schemas.microsoft.com/office/2019/extlst" xmlns:r="http://schemas.openxmlformats.org/officeDocument/2006/relationships" xmlns:m="http://schemas.openxmlformats.org/officeDocument/2006/math" xmlns:v="urn:schemas-microsoft-com:vml" xmlns:wp14="http://schemas.microsoft.com/office/word/2010/wordprocessingDrawing" xmlns:wp="http://schemas.openxmlformats.org/drawingml/2006/wordprocessingDrawing" xmlns:w10="urn:schemas-microsoft-com:office:word" xmlns:w="http://schemas.openxmlformats.org/wordprocessingml/2006/main" xmlns:w14="http://schemas.microsoft.com/office/word/2010/wordml" xmlns:w15="http://schemas.microsoft.com/office/word/2012/wordml" xmlns:w16cex="http://schemas.microsoft.com/office/word/2018/wordml/cex" xmlns:w16cid="http://schemas.microsoft.com/office/word/2016/wordml/cid" xmlns:w16="http://schemas.microsoft.com/office/word/2018/wordml" xmlns:w16du="http://schemas.microsoft.com/office/word/2023/wordml/word16du" xmlns:w16sdtdh="http://schemas.microsoft.com/office/word/2020/wordml/sdtdatahash" xmlns:w16sdtfl="http://schemas.microsoft.com/office/word/2024/wordml/sdtformatlock" xmlns:w16se="http://schemas.microsoft.com/office/word/2015/wordml/symex" xmlns:wpg="http://schemas.microsoft.com/office/word/2010/wordprocessingGroup" xmlns:wpi="http://schemas.microsoft.com/office/word/2010/wordprocessingInk" xmlns:wne="http://schemas.microsoft.com/office/word/2006/wordml" xmlns:wps="http://schemas.microsoft.com/office/word/2010/wordprocessingShape" mc:Ignorable="w14 w15 w16se w16cid w16 w16cex w16sdtdh w16sdtfl w16du wp14">
+<w:footnotes xmlns:wpc="http://schemas.microsoft.com/office/word/2010/wordprocessingCanvas" xmlns:cx="http://schemas.microsoft.com/office/drawing/2014/chartex" xmlns:cx1="http://schemas.microsoft.com/office/drawing/2015/9/8/chartex" xmlns:cx2="http://schemas.microsoft.com/office/drawing/2015/10/21/chartex" xmlns:cx3="http://schemas.microsoft.com/office/drawing/2016/5/9/chartex" xmlns:cx4="http://schemas.microsoft.com/office/drawing/2016/5/10/chartex" xmlns:cx5="http://schemas.microsoft.com/office/drawing/2016/5/11/chartex" xmlns:cx6="http://schemas.microsoft.com/office/drawing/2016/5/12/chartex" xmlns:cx7="http://schemas.microsoft.com/office/drawing/2016/5/13/chartex" xmlns:cx8="http://schemas.microsoft.com/office/drawing/2016/5/14/chartex" xmlns:mc="http://schemas.openxmlformats.org/markup-compatibility/2006" xmlns:aink="http://schemas.microsoft.com/office/drawing/2016/ink" xmlns:am3d="http://schemas.microsoft.com/office/drawing/2017/model3d" xmlns:o="urn:schemas-microsoft-com:office:office" xmlns:oel="http://schemas.microsoft.com/office/2019/extlst" xmlns:r="http://schemas.openxmlformats.org/officeDocument/2006/relationships" xmlns:m="http://schemas.openxmlformats.org/officeDocument/2006/math" xmlns:v="urn:schemas-microsoft-com:vml" xmlns:wp14="http://schemas.microsoft.com/office/word/2010/wordprocessingDrawing" xmlns:wp="http://schemas.openxmlformats.org/drawingml/2006/wordprocessingDrawing" xmlns:w10="urn:schemas-microsoft-com:office:word" xmlns:w="http://schemas.openxmlformats.org/wordprocessingml/2006/main" xmlns:w14="http://schemas.microsoft.com/office/word/2010/wordml" xmlns:w15="http://schemas.microsoft.com/office/word/2012/wordml" xmlns:w16cei="http://schemas.microsoft.com/office/word/2026/wordml/cei" xmlns:w16cex="http://schemas.microsoft.com/office/word/2018/wordml/cex" xmlns:w16cid="http://schemas.microsoft.com/office/word/2016/wordml/cid" xmlns:w16="http://schemas.microsoft.com/office/word/2018/wordml" xmlns:w16du="http://schemas.microsoft.com/office/word/2023/wordml/word16du" xmlns:w16sdtdh="http://schemas.microsoft.com/office/word/2020/wordml/sdtdatahash" xmlns:w16sdtfl="http://schemas.microsoft.com/office/word/2024/wordml/sdtformatlock" xmlns:w16se="http://schemas.microsoft.com/office/word/2015/wordml/symex" xmlns:wpg="http://schemas.microsoft.com/office/word/2010/wordprocessingGroup" xmlns:wpi="http://schemas.microsoft.com/office/word/2010/wordprocessingInk" xmlns:wne="http://schemas.microsoft.com/office/word/2006/wordml" xmlns:wps="http://schemas.microsoft.com/office/word/2010/wordprocessingShape" mc:Ignorable="w14 w15 w16se w16cid w16 w16cex w16sdtdh w16sdtfl w16du wp14">
   <w:footnote w:type="separator" w:id="-1">
     <w:p>
       <w:pPr>
@@ -3692,10 +4283,10 @@
 </file>
 
 <file path=word/header1.xml><?xml version="1.0" encoding="utf-8"?>
-<w:hdr xmlns:wpc="http://schemas.microsoft.com/office/word/2010/wordprocessingCanvas" xmlns:cx="http://schemas.microsoft.com/office/drawing/2014/chartex" xmlns:cx1="http://schemas.microsoft.com/office/drawing/2015/9/8/chartex" xmlns:cx2="http://schemas.microsoft.com/office/drawing/2015/10/21/chartex" xmlns:cx3="http://schemas.microsoft.com/office/drawing/2016/5/9/chartex" xmlns:cx4="http://schemas.microsoft.com/office/drawing/2016/5/10/chartex" xmlns:cx5="http://schemas.microsoft.com/office/drawing/2016/5/11/chartex" xmlns:cx6="http://schemas.microsoft.com/office/drawing/2016/5/12/chartex" xmlns:cx7="http://schemas.microsoft.com/office/drawing/2016/5/13/chartex" xmlns:cx8="http://schemas.microsoft.com/office/drawing/2016/5/14/chartex" xmlns:mc="http://schemas.openxmlformats.org/markup-compatibility/2006" xmlns:aink="http://schemas.microsoft.com/office/drawing/2016/ink" xmlns:am3d="http://schemas.microsoft.com/office/drawing/2017/model3d" xmlns:o="urn:schemas-microsoft-com:office:office" xmlns:oel="http://schemas.microsoft.com/office/2019/extlst" xmlns:r="http://schemas.openxmlformats.org/officeDocument/2006/relationships" xmlns:m="http://schemas.openxmlformats.org/officeDocument/2006/math" xmlns:v="urn:schemas-microsoft-com:vml" xmlns:wp14="http://schemas.microsoft.com/office/word/2010/wordprocessingDrawing" xmlns:wp="http://schemas.openxmlformats.org/drawingml/2006/wordprocessingDrawing" xmlns:w10="urn:schemas-microsoft-com:office:word" xmlns:w="http://schemas.openxmlformats.org/wordprocessingml/2006/main" xmlns:w14="http://schemas.microsoft.com/office/word/2010/wordml" xmlns:w15="http://schemas.microsoft.com/office/word/2012/wordml" xmlns:w16cex="http://schemas.microsoft.com/office/word/2018/wordml/cex" xmlns:w16cid="http://schemas.microsoft.com/office/word/2016/wordml/cid" xmlns:w16="http://schemas.microsoft.com/office/word/2018/wordml" xmlns:w16du="http://schemas.microsoft.com/office/word/2023/wordml/word16du" xmlns:w16sdtdh="http://schemas.microsoft.com/office/word/2020/wordml/sdtdatahash" xmlns:w16sdtfl="http://schemas.microsoft.com/office/word/2024/wordml/sdtformatlock" xmlns:w16se="http://schemas.microsoft.com/office/word/2015/wordml/symex" xmlns:wpg="http://schemas.microsoft.com/office/word/2010/wordprocessingGroup" xmlns:wpi="http://schemas.microsoft.com/office/word/2010/wordprocessingInk" xmlns:wne="http://schemas.microsoft.com/office/word/2006/wordml" xmlns:wps="http://schemas.microsoft.com/office/word/2010/wordprocessingShape" mc:Ignorable="w14 w15 w16se w16cid w16 w16cex w16sdtdh w16sdtfl w16du wp14">
+<w:hdr xmlns:wpc="http://schemas.microsoft.com/office/word/2010/wordprocessingCanvas" xmlns:cx="http://schemas.microsoft.com/office/drawing/2014/chartex" xmlns:cx1="http://schemas.microsoft.com/office/drawing/2015/9/8/chartex" xmlns:cx2="http://schemas.microsoft.com/office/drawing/2015/10/21/chartex" xmlns:cx3="http://schemas.microsoft.com/office/drawing/2016/5/9/chartex" xmlns:cx4="http://schemas.microsoft.com/office/drawing/2016/5/10/chartex" xmlns:cx5="http://schemas.microsoft.com/office/drawing/2016/5/11/chartex" xmlns:cx6="http://schemas.microsoft.com/office/drawing/2016/5/12/chartex" xmlns:cx7="http://schemas.microsoft.com/office/drawing/2016/5/13/chartex" xmlns:cx8="http://schemas.microsoft.com/office/drawing/2016/5/14/chartex" xmlns:mc="http://schemas.openxmlformats.org/markup-compatibility/2006" xmlns:aink="http://schemas.microsoft.com/office/drawing/2016/ink" xmlns:am3d="http://schemas.microsoft.com/office/drawing/2017/model3d" xmlns:o="urn:schemas-microsoft-com:office:office" xmlns:oel="http://schemas.microsoft.com/office/2019/extlst" xmlns:r="http://schemas.openxmlformats.org/officeDocument/2006/relationships" xmlns:m="http://schemas.openxmlformats.org/officeDocument/2006/math" xmlns:v="urn:schemas-microsoft-com:vml" xmlns:wp14="http://schemas.microsoft.com/office/word/2010/wordprocessingDrawing" xmlns:wp="http://schemas.openxmlformats.org/drawingml/2006/wordprocessingDrawing" xmlns:w10="urn:schemas-microsoft-com:office:word" xmlns:w="http://schemas.openxmlformats.org/wordprocessingml/2006/main" xmlns:w14="http://schemas.microsoft.com/office/word/2010/wordml" xmlns:w15="http://schemas.microsoft.com/office/word/2012/wordml" xmlns:w16cei="http://schemas.microsoft.com/office/word/2026/wordml/cei" xmlns:w16cex="http://schemas.microsoft.com/office/word/2018/wordml/cex" xmlns:w16cid="http://schemas.microsoft.com/office/word/2016/wordml/cid" xmlns:w16="http://schemas.microsoft.com/office/word/2018/wordml" xmlns:w16du="http://schemas.microsoft.com/office/word/2023/wordml/word16du" xmlns:w16sdtdh="http://schemas.microsoft.com/office/word/2020/wordml/sdtdatahash" xmlns:w16sdtfl="http://schemas.microsoft.com/office/word/2024/wordml/sdtformatlock" xmlns:w16se="http://schemas.microsoft.com/office/word/2015/wordml/symex" xmlns:wpg="http://schemas.microsoft.com/office/word/2010/wordprocessingGroup" xmlns:wpi="http://schemas.microsoft.com/office/word/2010/wordprocessingInk" xmlns:wne="http://schemas.microsoft.com/office/word/2006/wordml" xmlns:wps="http://schemas.microsoft.com/office/word/2010/wordprocessingShape" mc:Ignorable="w14 w15 w16se w16cid w16 w16cex w16sdtdh w16sdtfl w16du wp14">
   <w:p>
     <w:pPr>
-      <w:pStyle w:val="Encabezado"/>
+      <w:pStyle w:val="Header"/>
       <w:jc w:val="right"/>
       <w:rPr>
         <w:sz w:val="28"/>
@@ -3771,7 +4362,7 @@
   </w:p>
   <w:p>
     <w:pPr>
-      <w:pStyle w:val="Encabezado"/>
+      <w:pStyle w:val="Header"/>
       <w:tabs>
         <w:tab w:val="clear" w:pos="4419"/>
         <w:tab w:val="clear" w:pos="8838"/>
@@ -3797,7 +4388,7 @@
 </file>
 
 <file path=word/numbering.xml><?xml version="1.0" encoding="utf-8"?>
-<w:numbering xmlns:wpc="http://schemas.microsoft.com/office/word/2010/wordprocessingCanvas" xmlns:cx="http://schemas.microsoft.com/office/drawing/2014/chartex" xmlns:cx1="http://schemas.microsoft.com/office/drawing/2015/9/8/chartex" xmlns:cx2="http://schemas.microsoft.com/office/drawing/2015/10/21/chartex" xmlns:cx3="http://schemas.microsoft.com/office/drawing/2016/5/9/chartex" xmlns:cx4="http://schemas.microsoft.com/office/drawing/2016/5/10/chartex" xmlns:cx5="http://schemas.microsoft.com/office/drawing/2016/5/11/chartex" xmlns:cx6="http://schemas.microsoft.com/office/drawing/2016/5/12/chartex" xmlns:cx7="http://schemas.microsoft.com/office/drawing/2016/5/13/chartex" xmlns:cx8="http://schemas.microsoft.com/office/drawing/2016/5/14/chartex" xmlns:mc="http://schemas.openxmlformats.org/markup-compatibility/2006" xmlns:aink="http://schemas.microsoft.com/office/drawing/2016/ink" xmlns:am3d="http://schemas.microsoft.com/office/drawing/2017/model3d" xmlns:o="urn:schemas-microsoft-com:office:office" xmlns:oel="http://schemas.microsoft.com/office/2019/extlst" xmlns:r="http://schemas.openxmlformats.org/officeDocument/2006/relationships" xmlns:m="http://schemas.openxmlformats.org/officeDocument/2006/math" xmlns:v="urn:schemas-microsoft-com:vml" xmlns:wp14="http://schemas.microsoft.com/office/word/2010/wordprocessingDrawing" xmlns:wp="http://schemas.openxmlformats.org/drawingml/2006/wordprocessingDrawing" xmlns:w10="urn:schemas-microsoft-com:office:word" xmlns:w="http://schemas.openxmlformats.org/wordprocessingml/2006/main" xmlns:w14="http://schemas.microsoft.com/office/word/2010/wordml" xmlns:w15="http://schemas.microsoft.com/office/word/2012/wordml" xmlns:w16cex="http://schemas.microsoft.com/office/word/2018/wordml/cex" xmlns:w16cid="http://schemas.microsoft.com/office/word/2016/wordml/cid" xmlns:w16="http://schemas.microsoft.com/office/word/2018/wordml" xmlns:w16du="http://schemas.microsoft.com/office/word/2023/wordml/word16du" xmlns:w16sdtdh="http://schemas.microsoft.com/office/word/2020/wordml/sdtdatahash" xmlns:w16sdtfl="http://schemas.microsoft.com/office/word/2024/wordml/sdtformatlock" xmlns:w16se="http://schemas.microsoft.com/office/word/2015/wordml/symex" xmlns:wpg="http://schemas.microsoft.com/office/word/2010/wordprocessingGroup" xmlns:wpi="http://schemas.microsoft.com/office/word/2010/wordprocessingInk" xmlns:wne="http://schemas.microsoft.com/office/word/2006/wordml" xmlns:wps="http://schemas.microsoft.com/office/word/2010/wordprocessingShape" mc:Ignorable="w14 w15 w16se w16cid w16 w16cex w16sdtdh w16sdtfl w16du wp14">
+<w:numbering xmlns:wpc="http://schemas.microsoft.com/office/word/2010/wordprocessingCanvas" xmlns:cx="http://schemas.microsoft.com/office/drawing/2014/chartex" xmlns:cx1="http://schemas.microsoft.com/office/drawing/2015/9/8/chartex" xmlns:cx2="http://schemas.microsoft.com/office/drawing/2015/10/21/chartex" xmlns:cx3="http://schemas.microsoft.com/office/drawing/2016/5/9/chartex" xmlns:cx4="http://schemas.microsoft.com/office/drawing/2016/5/10/chartex" xmlns:cx5="http://schemas.microsoft.com/office/drawing/2016/5/11/chartex" xmlns:cx6="http://schemas.microsoft.com/office/drawing/2016/5/12/chartex" xmlns:cx7="http://schemas.microsoft.com/office/drawing/2016/5/13/chartex" xmlns:cx8="http://schemas.microsoft.com/office/drawing/2016/5/14/chartex" xmlns:mc="http://schemas.openxmlformats.org/markup-compatibility/2006" xmlns:aink="http://schemas.microsoft.com/office/drawing/2016/ink" xmlns:am3d="http://schemas.microsoft.com/office/drawing/2017/model3d" xmlns:o="urn:schemas-microsoft-com:office:office" xmlns:oel="http://schemas.microsoft.com/office/2019/extlst" xmlns:r="http://schemas.openxmlformats.org/officeDocument/2006/relationships" xmlns:m="http://schemas.openxmlformats.org/officeDocument/2006/math" xmlns:v="urn:schemas-microsoft-com:vml" xmlns:wp14="http://schemas.microsoft.com/office/word/2010/wordprocessingDrawing" xmlns:wp="http://schemas.openxmlformats.org/drawingml/2006/wordprocessingDrawing" xmlns:w10="urn:schemas-microsoft-com:office:word" xmlns:w="http://schemas.openxmlformats.org/wordprocessingml/2006/main" xmlns:w14="http://schemas.microsoft.com/office/word/2010/wordml" xmlns:w15="http://schemas.microsoft.com/office/word/2012/wordml" xmlns:w16cei="http://schemas.microsoft.com/office/word/2026/wordml/cei" xmlns:w16cex="http://schemas.microsoft.com/office/word/2018/wordml/cex" xmlns:w16cid="http://schemas.microsoft.com/office/word/2016/wordml/cid" xmlns:w16="http://schemas.microsoft.com/office/word/2018/wordml" xmlns:w16du="http://schemas.microsoft.com/office/word/2023/wordml/word16du" xmlns:w16sdtdh="http://schemas.microsoft.com/office/word/2020/wordml/sdtdatahash" xmlns:w16sdtfl="http://schemas.microsoft.com/office/word/2024/wordml/sdtformatlock" xmlns:w16se="http://schemas.microsoft.com/office/word/2015/wordml/symex" xmlns:wpg="http://schemas.microsoft.com/office/word/2010/wordprocessingGroup" xmlns:wpi="http://schemas.microsoft.com/office/word/2010/wordprocessingInk" xmlns:wne="http://schemas.microsoft.com/office/word/2006/wordml" xmlns:wps="http://schemas.microsoft.com/office/word/2010/wordprocessingShape" mc:Ignorable="w14 w15 w16se w16cid w16 w16cex w16sdtdh w16sdtfl w16du wp14">
   <w:abstractNum w:abstractNumId="0" w15:restartNumberingAfterBreak="0">
     <w:nsid w:val="0229E7E7"/>
     <w:multiLevelType w:val="hybridMultilevel"/>
@@ -6699,11 +7290,11 @@
     <w:name w:val="Normal"/>
     <w:qFormat/>
   </w:style>
-  <w:style w:type="paragraph" w:styleId="Ttulo1">
+  <w:style w:type="paragraph" w:styleId="Heading1">
     <w:name w:val="heading 1"/>
     <w:basedOn w:val="Normal"/>
     <w:next w:val="Normal"/>
-    <w:link w:val="Ttulo1Car"/>
+    <w:link w:val="Heading1Char"/>
     <w:uiPriority w:val="9"/>
     <w:qFormat/>
     <w:rsid w:val="00B0223C"/>
@@ -6720,11 +7311,11 @@
       <w:szCs w:val="40"/>
     </w:rPr>
   </w:style>
-  <w:style w:type="paragraph" w:styleId="Ttulo2">
+  <w:style w:type="paragraph" w:styleId="Heading2">
     <w:name w:val="heading 2"/>
     <w:basedOn w:val="Normal"/>
     <w:next w:val="Normal"/>
-    <w:link w:val="Ttulo2Car"/>
+    <w:link w:val="Heading2Char"/>
     <w:uiPriority w:val="9"/>
     <w:semiHidden/>
     <w:unhideWhenUsed/>
@@ -6743,11 +7334,11 @@
       <w:szCs w:val="32"/>
     </w:rPr>
   </w:style>
-  <w:style w:type="paragraph" w:styleId="Ttulo3">
+  <w:style w:type="paragraph" w:styleId="Heading3">
     <w:name w:val="heading 3"/>
     <w:basedOn w:val="Normal"/>
     <w:next w:val="Normal"/>
-    <w:link w:val="Ttulo3Car"/>
+    <w:link w:val="Heading3Char"/>
     <w:uiPriority w:val="9"/>
     <w:semiHidden/>
     <w:unhideWhenUsed/>
@@ -6766,11 +7357,11 @@
       <w:szCs w:val="28"/>
     </w:rPr>
   </w:style>
-  <w:style w:type="paragraph" w:styleId="Ttulo4">
+  <w:style w:type="paragraph" w:styleId="Heading4">
     <w:name w:val="heading 4"/>
     <w:basedOn w:val="Normal"/>
     <w:next w:val="Normal"/>
-    <w:link w:val="Ttulo4Car"/>
+    <w:link w:val="Heading4Char"/>
     <w:uiPriority w:val="9"/>
     <w:semiHidden/>
     <w:unhideWhenUsed/>
@@ -6789,11 +7380,11 @@
       <w:color w:val="2F5496" w:themeColor="accent1" w:themeShade="BF"/>
     </w:rPr>
   </w:style>
-  <w:style w:type="paragraph" w:styleId="Ttulo5">
+  <w:style w:type="paragraph" w:styleId="Heading5">
     <w:name w:val="heading 5"/>
     <w:basedOn w:val="Normal"/>
     <w:next w:val="Normal"/>
-    <w:link w:val="Ttulo5Car"/>
+    <w:link w:val="Heading5Char"/>
     <w:uiPriority w:val="9"/>
     <w:semiHidden/>
     <w:unhideWhenUsed/>
@@ -6810,11 +7401,11 @@
       <w:color w:val="2F5496" w:themeColor="accent1" w:themeShade="BF"/>
     </w:rPr>
   </w:style>
-  <w:style w:type="paragraph" w:styleId="Ttulo6">
+  <w:style w:type="paragraph" w:styleId="Heading6">
     <w:name w:val="heading 6"/>
     <w:basedOn w:val="Normal"/>
     <w:next w:val="Normal"/>
-    <w:link w:val="Ttulo6Car"/>
+    <w:link w:val="Heading6Char"/>
     <w:uiPriority w:val="9"/>
     <w:semiHidden/>
     <w:unhideWhenUsed/>
@@ -6833,11 +7424,11 @@
       <w:color w:val="595959" w:themeColor="text1" w:themeTint="A6"/>
     </w:rPr>
   </w:style>
-  <w:style w:type="paragraph" w:styleId="Ttulo7">
+  <w:style w:type="paragraph" w:styleId="Heading7">
     <w:name w:val="heading 7"/>
     <w:basedOn w:val="Normal"/>
     <w:next w:val="Normal"/>
-    <w:link w:val="Ttulo7Car"/>
+    <w:link w:val="Heading7Char"/>
     <w:uiPriority w:val="9"/>
     <w:semiHidden/>
     <w:unhideWhenUsed/>
@@ -6854,11 +7445,11 @@
       <w:color w:val="595959" w:themeColor="text1" w:themeTint="A6"/>
     </w:rPr>
   </w:style>
-  <w:style w:type="paragraph" w:styleId="Ttulo8">
+  <w:style w:type="paragraph" w:styleId="Heading8">
     <w:name w:val="heading 8"/>
     <w:basedOn w:val="Normal"/>
     <w:next w:val="Normal"/>
-    <w:link w:val="Ttulo8Car"/>
+    <w:link w:val="Heading8Char"/>
     <w:uiPriority w:val="9"/>
     <w:semiHidden/>
     <w:unhideWhenUsed/>
@@ -6877,11 +7468,11 @@
       <w:color w:val="272727" w:themeColor="text1" w:themeTint="D8"/>
     </w:rPr>
   </w:style>
-  <w:style w:type="paragraph" w:styleId="Ttulo9">
+  <w:style w:type="paragraph" w:styleId="Heading9">
     <w:name w:val="heading 9"/>
     <w:basedOn w:val="Normal"/>
     <w:next w:val="Normal"/>
-    <w:link w:val="Ttulo9Car"/>
+    <w:link w:val="Heading9Char"/>
     <w:uiPriority w:val="9"/>
     <w:semiHidden/>
     <w:unhideWhenUsed/>
@@ -6898,13 +7489,13 @@
       <w:color w:val="272727" w:themeColor="text1" w:themeTint="D8"/>
     </w:rPr>
   </w:style>
-  <w:style w:type="character" w:default="1" w:styleId="Fuentedeprrafopredeter">
+  <w:style w:type="character" w:default="1" w:styleId="DefaultParagraphFont">
     <w:name w:val="Default Paragraph Font"/>
     <w:uiPriority w:val="1"/>
     <w:semiHidden/>
     <w:unhideWhenUsed/>
   </w:style>
-  <w:style w:type="table" w:default="1" w:styleId="Tablanormal">
+  <w:style w:type="table" w:default="1" w:styleId="TableNormal">
     <w:name w:val="Normal Table"/>
     <w:uiPriority w:val="99"/>
     <w:semiHidden/>
@@ -6919,16 +7510,16 @@
       </w:tblCellMar>
     </w:tblPr>
   </w:style>
-  <w:style w:type="numbering" w:default="1" w:styleId="Sinlista">
+  <w:style w:type="numbering" w:default="1" w:styleId="NoList">
     <w:name w:val="No List"/>
     <w:uiPriority w:val="99"/>
     <w:semiHidden/>
     <w:unhideWhenUsed/>
   </w:style>
-  <w:style w:type="character" w:customStyle="1" w:styleId="Ttulo1Car">
-    <w:name w:val="Título 1 Car"/>
-    <w:basedOn w:val="Fuentedeprrafopredeter"/>
-    <w:link w:val="Ttulo1"/>
+  <w:style w:type="character" w:customStyle="1" w:styleId="Heading1Char">
+    <w:name w:val="Heading 1 Char"/>
+    <w:basedOn w:val="DefaultParagraphFont"/>
+    <w:link w:val="Heading1"/>
     <w:uiPriority w:val="9"/>
     <w:rsid w:val="00B0223C"/>
     <w:rPr>
@@ -6938,10 +7529,10 @@
       <w:szCs w:val="40"/>
     </w:rPr>
   </w:style>
-  <w:style w:type="character" w:customStyle="1" w:styleId="Ttulo2Car">
-    <w:name w:val="Título 2 Car"/>
-    <w:basedOn w:val="Fuentedeprrafopredeter"/>
-    <w:link w:val="Ttulo2"/>
+  <w:style w:type="character" w:customStyle="1" w:styleId="Heading2Char">
+    <w:name w:val="Heading 2 Char"/>
+    <w:basedOn w:val="DefaultParagraphFont"/>
+    <w:link w:val="Heading2"/>
     <w:uiPriority w:val="9"/>
     <w:semiHidden/>
     <w:rsid w:val="00B0223C"/>
@@ -6952,10 +7543,10 @@
       <w:szCs w:val="32"/>
     </w:rPr>
   </w:style>
-  <w:style w:type="character" w:customStyle="1" w:styleId="Ttulo3Car">
-    <w:name w:val="Título 3 Car"/>
-    <w:basedOn w:val="Fuentedeprrafopredeter"/>
-    <w:link w:val="Ttulo3"/>
+  <w:style w:type="character" w:customStyle="1" w:styleId="Heading3Char">
+    <w:name w:val="Heading 3 Char"/>
+    <w:basedOn w:val="DefaultParagraphFont"/>
+    <w:link w:val="Heading3"/>
     <w:uiPriority w:val="9"/>
     <w:semiHidden/>
     <w:rsid w:val="00B0223C"/>
@@ -6966,10 +7557,10 @@
       <w:szCs w:val="28"/>
     </w:rPr>
   </w:style>
-  <w:style w:type="character" w:customStyle="1" w:styleId="Ttulo4Car">
-    <w:name w:val="Título 4 Car"/>
-    <w:basedOn w:val="Fuentedeprrafopredeter"/>
-    <w:link w:val="Ttulo4"/>
+  <w:style w:type="character" w:customStyle="1" w:styleId="Heading4Char">
+    <w:name w:val="Heading 4 Char"/>
+    <w:basedOn w:val="DefaultParagraphFont"/>
+    <w:link w:val="Heading4"/>
     <w:uiPriority w:val="9"/>
     <w:semiHidden/>
     <w:rsid w:val="00B0223C"/>
@@ -6980,10 +7571,10 @@
       <w:color w:val="2F5496" w:themeColor="accent1" w:themeShade="BF"/>
     </w:rPr>
   </w:style>
-  <w:style w:type="character" w:customStyle="1" w:styleId="Ttulo5Car">
-    <w:name w:val="Título 5 Car"/>
-    <w:basedOn w:val="Fuentedeprrafopredeter"/>
-    <w:link w:val="Ttulo5"/>
+  <w:style w:type="character" w:customStyle="1" w:styleId="Heading5Char">
+    <w:name w:val="Heading 5 Char"/>
+    <w:basedOn w:val="DefaultParagraphFont"/>
+    <w:link w:val="Heading5"/>
     <w:uiPriority w:val="9"/>
     <w:semiHidden/>
     <w:rsid w:val="00B0223C"/>
@@ -6992,10 +7583,10 @@
       <w:color w:val="2F5496" w:themeColor="accent1" w:themeShade="BF"/>
     </w:rPr>
   </w:style>
-  <w:style w:type="character" w:customStyle="1" w:styleId="Ttulo6Car">
-    <w:name w:val="Título 6 Car"/>
-    <w:basedOn w:val="Fuentedeprrafopredeter"/>
-    <w:link w:val="Ttulo6"/>
+  <w:style w:type="character" w:customStyle="1" w:styleId="Heading6Char">
+    <w:name w:val="Heading 6 Char"/>
+    <w:basedOn w:val="DefaultParagraphFont"/>
+    <w:link w:val="Heading6"/>
     <w:uiPriority w:val="9"/>
     <w:semiHidden/>
     <w:rsid w:val="00B0223C"/>
@@ -7006,10 +7597,10 @@
       <w:color w:val="595959" w:themeColor="text1" w:themeTint="A6"/>
     </w:rPr>
   </w:style>
-  <w:style w:type="character" w:customStyle="1" w:styleId="Ttulo7Car">
-    <w:name w:val="Título 7 Car"/>
-    <w:basedOn w:val="Fuentedeprrafopredeter"/>
-    <w:link w:val="Ttulo7"/>
+  <w:style w:type="character" w:customStyle="1" w:styleId="Heading7Char">
+    <w:name w:val="Heading 7 Char"/>
+    <w:basedOn w:val="DefaultParagraphFont"/>
+    <w:link w:val="Heading7"/>
     <w:uiPriority w:val="9"/>
     <w:semiHidden/>
     <w:rsid w:val="00B0223C"/>
@@ -7018,10 +7609,10 @@
       <w:color w:val="595959" w:themeColor="text1" w:themeTint="A6"/>
     </w:rPr>
   </w:style>
-  <w:style w:type="character" w:customStyle="1" w:styleId="Ttulo8Car">
-    <w:name w:val="Título 8 Car"/>
-    <w:basedOn w:val="Fuentedeprrafopredeter"/>
-    <w:link w:val="Ttulo8"/>
+  <w:style w:type="character" w:customStyle="1" w:styleId="Heading8Char">
+    <w:name w:val="Heading 8 Char"/>
+    <w:basedOn w:val="DefaultParagraphFont"/>
+    <w:link w:val="Heading8"/>
     <w:uiPriority w:val="9"/>
     <w:semiHidden/>
     <w:rsid w:val="00B0223C"/>
@@ -7032,10 +7623,10 @@
       <w:color w:val="272727" w:themeColor="text1" w:themeTint="D8"/>
     </w:rPr>
   </w:style>
-  <w:style w:type="character" w:customStyle="1" w:styleId="Ttulo9Car">
-    <w:name w:val="Título 9 Car"/>
-    <w:basedOn w:val="Fuentedeprrafopredeter"/>
-    <w:link w:val="Ttulo9"/>
+  <w:style w:type="character" w:customStyle="1" w:styleId="Heading9Char">
+    <w:name w:val="Heading 9 Char"/>
+    <w:basedOn w:val="DefaultParagraphFont"/>
+    <w:link w:val="Heading9"/>
     <w:uiPriority w:val="9"/>
     <w:semiHidden/>
     <w:rsid w:val="00B0223C"/>
@@ -7044,11 +7635,11 @@
       <w:color w:val="272727" w:themeColor="text1" w:themeTint="D8"/>
     </w:rPr>
   </w:style>
-  <w:style w:type="paragraph" w:styleId="Ttulo">
+  <w:style w:type="paragraph" w:styleId="Title">
     <w:name w:val="Title"/>
     <w:basedOn w:val="Normal"/>
     <w:next w:val="Normal"/>
-    <w:link w:val="TtuloCar"/>
+    <w:link w:val="TitleChar"/>
     <w:uiPriority w:val="10"/>
     <w:qFormat/>
     <w:rsid w:val="00B0223C"/>
@@ -7064,10 +7655,10 @@
       <w:szCs w:val="56"/>
     </w:rPr>
   </w:style>
-  <w:style w:type="character" w:customStyle="1" w:styleId="TtuloCar">
-    <w:name w:val="Título Car"/>
-    <w:basedOn w:val="Fuentedeprrafopredeter"/>
-    <w:link w:val="Ttulo"/>
+  <w:style w:type="character" w:customStyle="1" w:styleId="TitleChar">
+    <w:name w:val="Title Char"/>
+    <w:basedOn w:val="DefaultParagraphFont"/>
+    <w:link w:val="Title"/>
     <w:uiPriority w:val="10"/>
     <w:rsid w:val="00B0223C"/>
     <w:rPr>
@@ -7078,11 +7669,11 @@
       <w:szCs w:val="56"/>
     </w:rPr>
   </w:style>
-  <w:style w:type="paragraph" w:styleId="Subttulo">
+  <w:style w:type="paragraph" w:styleId="Subtitle">
     <w:name w:val="Subtitle"/>
     <w:basedOn w:val="Normal"/>
     <w:next w:val="Normal"/>
-    <w:link w:val="SubttuloCar"/>
+    <w:link w:val="SubtitleChar"/>
     <w:uiPriority w:val="11"/>
     <w:qFormat/>
     <w:rsid w:val="00B0223C"/>
@@ -7099,10 +7690,10 @@
       <w:szCs w:val="28"/>
     </w:rPr>
   </w:style>
-  <w:style w:type="character" w:customStyle="1" w:styleId="SubttuloCar">
-    <w:name w:val="Subtítulo Car"/>
-    <w:basedOn w:val="Fuentedeprrafopredeter"/>
-    <w:link w:val="Subttulo"/>
+  <w:style w:type="character" w:customStyle="1" w:styleId="SubtitleChar">
+    <w:name w:val="Subtitle Char"/>
+    <w:basedOn w:val="DefaultParagraphFont"/>
+    <w:link w:val="Subtitle"/>
     <w:uiPriority w:val="11"/>
     <w:rsid w:val="00B0223C"/>
     <w:rPr>
@@ -7113,11 +7704,11 @@
       <w:szCs w:val="28"/>
     </w:rPr>
   </w:style>
-  <w:style w:type="paragraph" w:styleId="Cita">
+  <w:style w:type="paragraph" w:styleId="Quote">
     <w:name w:val="Quote"/>
     <w:basedOn w:val="Normal"/>
     <w:next w:val="Normal"/>
-    <w:link w:val="CitaCar"/>
+    <w:link w:val="QuoteChar"/>
     <w:uiPriority w:val="29"/>
     <w:qFormat/>
     <w:rsid w:val="00B0223C"/>
@@ -7131,10 +7722,10 @@
       <w:color w:val="404040" w:themeColor="text1" w:themeTint="BF"/>
     </w:rPr>
   </w:style>
-  <w:style w:type="character" w:customStyle="1" w:styleId="CitaCar">
-    <w:name w:val="Cita Car"/>
-    <w:basedOn w:val="Fuentedeprrafopredeter"/>
-    <w:link w:val="Cita"/>
+  <w:style w:type="character" w:customStyle="1" w:styleId="QuoteChar">
+    <w:name w:val="Quote Char"/>
+    <w:basedOn w:val="DefaultParagraphFont"/>
+    <w:link w:val="Quote"/>
     <w:uiPriority w:val="29"/>
     <w:rsid w:val="00B0223C"/>
     <w:rPr>
@@ -7143,7 +7734,7 @@
       <w:color w:val="404040" w:themeColor="text1" w:themeTint="BF"/>
     </w:rPr>
   </w:style>
-  <w:style w:type="paragraph" w:styleId="Prrafodelista">
+  <w:style w:type="paragraph" w:styleId="ListParagraph">
     <w:name w:val="List Paragraph"/>
     <w:basedOn w:val="Normal"/>
     <w:uiPriority w:val="34"/>
@@ -7154,9 +7745,9 @@
       <w:contextualSpacing/>
     </w:pPr>
   </w:style>
-  <w:style w:type="character" w:styleId="nfasisintenso">
+  <w:style w:type="character" w:styleId="IntenseEmphasis">
     <w:name w:val="Intense Emphasis"/>
-    <w:basedOn w:val="Fuentedeprrafopredeter"/>
+    <w:basedOn w:val="DefaultParagraphFont"/>
     <w:uiPriority w:val="21"/>
     <w:qFormat/>
     <w:rsid w:val="00B0223C"/>
@@ -7166,11 +7757,11 @@
       <w:color w:val="2F5496" w:themeColor="accent1" w:themeShade="BF"/>
     </w:rPr>
   </w:style>
-  <w:style w:type="paragraph" w:styleId="Citadestacada">
+  <w:style w:type="paragraph" w:styleId="IntenseQuote">
     <w:name w:val="Intense Quote"/>
     <w:basedOn w:val="Normal"/>
     <w:next w:val="Normal"/>
-    <w:link w:val="CitadestacadaCar"/>
+    <w:link w:val="IntenseQuoteChar"/>
     <w:uiPriority w:val="30"/>
     <w:qFormat/>
     <w:rsid w:val="00B0223C"/>
@@ -7189,10 +7780,10 @@
       <w:color w:val="2F5496" w:themeColor="accent1" w:themeShade="BF"/>
     </w:rPr>
   </w:style>
-  <w:style w:type="character" w:customStyle="1" w:styleId="CitadestacadaCar">
-    <w:name w:val="Cita destacada Car"/>
-    <w:basedOn w:val="Fuentedeprrafopredeter"/>
-    <w:link w:val="Citadestacada"/>
+  <w:style w:type="character" w:customStyle="1" w:styleId="IntenseQuoteChar">
+    <w:name w:val="Intense Quote Char"/>
+    <w:basedOn w:val="DefaultParagraphFont"/>
+    <w:link w:val="IntenseQuote"/>
     <w:uiPriority w:val="30"/>
     <w:rsid w:val="00B0223C"/>
     <w:rPr>
@@ -7201,9 +7792,9 @@
       <w:color w:val="2F5496" w:themeColor="accent1" w:themeShade="BF"/>
     </w:rPr>
   </w:style>
-  <w:style w:type="character" w:styleId="Referenciaintensa">
+  <w:style w:type="character" w:styleId="IntenseReference">
     <w:name w:val="Intense Reference"/>
-    <w:basedOn w:val="Fuentedeprrafopredeter"/>
+    <w:basedOn w:val="DefaultParagraphFont"/>
     <w:uiPriority w:val="32"/>
     <w:qFormat/>
     <w:rsid w:val="00B0223C"/>
@@ -7215,9 +7806,9 @@
       <w:spacing w:val="5"/>
     </w:rPr>
   </w:style>
-  <w:style w:type="character" w:styleId="Hipervnculo">
+  <w:style w:type="character" w:styleId="Hyperlink">
     <w:name w:val="Hyperlink"/>
-    <w:basedOn w:val="Fuentedeprrafopredeter"/>
+    <w:basedOn w:val="DefaultParagraphFont"/>
     <w:uiPriority w:val="99"/>
     <w:unhideWhenUsed/>
     <w:rsid w:val="00B0223C"/>
@@ -7226,9 +7817,9 @@
       <w:u w:val="single"/>
     </w:rPr>
   </w:style>
-  <w:style w:type="character" w:styleId="Mencinsinresolver">
+  <w:style w:type="character" w:styleId="UnresolvedMention">
     <w:name w:val="Unresolved Mention"/>
-    <w:basedOn w:val="Fuentedeprrafopredeter"/>
+    <w:basedOn w:val="DefaultParagraphFont"/>
     <w:uiPriority w:val="99"/>
     <w:semiHidden/>
     <w:unhideWhenUsed/>
@@ -7238,10 +7829,10 @@
       <w:shd w:val="clear" w:color="auto" w:fill="E1DFDD"/>
     </w:rPr>
   </w:style>
-  <w:style w:type="paragraph" w:styleId="Textonotapie">
+  <w:style w:type="paragraph" w:styleId="FootnoteText">
     <w:name w:val="footnote text"/>
     <w:basedOn w:val="Normal"/>
-    <w:link w:val="TextonotapieCar"/>
+    <w:link w:val="FootnoteTextChar"/>
     <w:uiPriority w:val="99"/>
     <w:semiHidden/>
     <w:unhideWhenUsed/>
@@ -7254,10 +7845,10 @@
       <w:szCs w:val="20"/>
     </w:rPr>
   </w:style>
-  <w:style w:type="character" w:customStyle="1" w:styleId="TextonotapieCar">
-    <w:name w:val="Texto nota pie Car"/>
-    <w:basedOn w:val="Fuentedeprrafopredeter"/>
-    <w:link w:val="Textonotapie"/>
+  <w:style w:type="character" w:customStyle="1" w:styleId="FootnoteTextChar">
+    <w:name w:val="Footnote Text Char"/>
+    <w:basedOn w:val="DefaultParagraphFont"/>
+    <w:link w:val="FootnoteText"/>
     <w:uiPriority w:val="99"/>
     <w:semiHidden/>
     <w:rsid w:val="005C61AD"/>
@@ -7266,9 +7857,9 @@
       <w:szCs w:val="20"/>
     </w:rPr>
   </w:style>
-  <w:style w:type="character" w:styleId="Refdenotaalpie">
+  <w:style w:type="character" w:styleId="FootnoteReference">
     <w:name w:val="footnote reference"/>
-    <w:basedOn w:val="Fuentedeprrafopredeter"/>
+    <w:basedOn w:val="DefaultParagraphFont"/>
     <w:uiPriority w:val="99"/>
     <w:semiHidden/>
     <w:unhideWhenUsed/>
@@ -7277,9 +7868,9 @@
       <w:vertAlign w:val="superscript"/>
     </w:rPr>
   </w:style>
-  <w:style w:type="character" w:styleId="Textodelmarcadordeposicin">
+  <w:style w:type="character" w:styleId="PlaceholderText">
     <w:name w:val="Placeholder Text"/>
-    <w:basedOn w:val="Fuentedeprrafopredeter"/>
+    <w:basedOn w:val="DefaultParagraphFont"/>
     <w:uiPriority w:val="99"/>
     <w:semiHidden/>
     <w:rsid w:val="00D53702"/>
@@ -7287,9 +7878,9 @@
       <w:color w:val="666666"/>
     </w:rPr>
   </w:style>
-  <w:style w:type="character" w:styleId="Hipervnculovisitado">
+  <w:style w:type="character" w:styleId="FollowedHyperlink">
     <w:name w:val="FollowedHyperlink"/>
-    <w:basedOn w:val="Fuentedeprrafopredeter"/>
+    <w:basedOn w:val="DefaultParagraphFont"/>
     <w:uiPriority w:val="99"/>
     <w:semiHidden/>
     <w:unhideWhenUsed/>
@@ -7299,10 +7890,10 @@
       <w:u w:val="single"/>
     </w:rPr>
   </w:style>
-  <w:style w:type="paragraph" w:styleId="Encabezado">
+  <w:style w:type="paragraph" w:styleId="Header">
     <w:name w:val="header"/>
     <w:basedOn w:val="Normal"/>
-    <w:link w:val="EncabezadoCar"/>
+    <w:link w:val="HeaderChar"/>
     <w:uiPriority w:val="99"/>
     <w:unhideWhenUsed/>
     <w:rsid w:val="00A65499"/>
@@ -7314,17 +7905,17 @@
       <w:spacing w:after="0" w:line="240" w:lineRule="auto"/>
     </w:pPr>
   </w:style>
-  <w:style w:type="character" w:customStyle="1" w:styleId="EncabezadoCar">
-    <w:name w:val="Encabezado Car"/>
-    <w:basedOn w:val="Fuentedeprrafopredeter"/>
-    <w:link w:val="Encabezado"/>
+  <w:style w:type="character" w:customStyle="1" w:styleId="HeaderChar">
+    <w:name w:val="Header Char"/>
+    <w:basedOn w:val="DefaultParagraphFont"/>
+    <w:link w:val="Header"/>
     <w:uiPriority w:val="99"/>
     <w:rsid w:val="00A65499"/>
   </w:style>
-  <w:style w:type="paragraph" w:styleId="Piedepgina">
+  <w:style w:type="paragraph" w:styleId="Footer">
     <w:name w:val="footer"/>
     <w:basedOn w:val="Normal"/>
-    <w:link w:val="PiedepginaCar"/>
+    <w:link w:val="FooterChar"/>
     <w:uiPriority w:val="99"/>
     <w:unhideWhenUsed/>
     <w:rsid w:val="00A65499"/>
@@ -7336,17 +7927,17 @@
       <w:spacing w:after="0" w:line="240" w:lineRule="auto"/>
     </w:pPr>
   </w:style>
-  <w:style w:type="character" w:customStyle="1" w:styleId="PiedepginaCar">
-    <w:name w:val="Pie de página Car"/>
-    <w:basedOn w:val="Fuentedeprrafopredeter"/>
-    <w:link w:val="Piedepgina"/>
+  <w:style w:type="character" w:customStyle="1" w:styleId="FooterChar">
+    <w:name w:val="Footer Char"/>
+    <w:basedOn w:val="DefaultParagraphFont"/>
+    <w:link w:val="Footer"/>
     <w:uiPriority w:val="99"/>
     <w:rsid w:val="00A65499"/>
   </w:style>
-  <w:style w:type="paragraph" w:styleId="Textodeglobo">
+  <w:style w:type="paragraph" w:styleId="BalloonText">
     <w:name w:val="Balloon Text"/>
     <w:basedOn w:val="Normal"/>
-    <w:link w:val="TextodegloboCar"/>
+    <w:link w:val="BalloonTextChar"/>
     <w:uiPriority w:val="99"/>
     <w:semiHidden/>
     <w:unhideWhenUsed/>
@@ -7360,10 +7951,10 @@
       <w:szCs w:val="18"/>
     </w:rPr>
   </w:style>
-  <w:style w:type="character" w:customStyle="1" w:styleId="TextodegloboCar">
-    <w:name w:val="Texto de globo Car"/>
-    <w:basedOn w:val="Fuentedeprrafopredeter"/>
-    <w:link w:val="Textodeglobo"/>
+  <w:style w:type="character" w:customStyle="1" w:styleId="BalloonTextChar">
+    <w:name w:val="Balloon Text Char"/>
+    <w:basedOn w:val="DefaultParagraphFont"/>
+    <w:link w:val="BalloonText"/>
     <w:uiPriority w:val="99"/>
     <w:semiHidden/>
     <w:rsid w:val="003C57D0"/>
@@ -7377,7 +7968,7 @@
 </file>
 
 <file path=word/glossary/document.xml><?xml version="1.0" encoding="utf-8"?>
-<w:glossaryDocument xmlns:wpc="http://schemas.microsoft.com/office/word/2010/wordprocessingCanvas" xmlns:cx="http://schemas.microsoft.com/office/drawing/2014/chartex" xmlns:cx1="http://schemas.microsoft.com/office/drawing/2015/9/8/chartex" xmlns:cx2="http://schemas.microsoft.com/office/drawing/2015/10/21/chartex" xmlns:cx3="http://schemas.microsoft.com/office/drawing/2016/5/9/chartex" xmlns:cx4="http://schemas.microsoft.com/office/drawing/2016/5/10/chartex" xmlns:cx5="http://schemas.microsoft.com/office/drawing/2016/5/11/chartex" xmlns:cx6="http://schemas.microsoft.com/office/drawing/2016/5/12/chartex" xmlns:cx7="http://schemas.microsoft.com/office/drawing/2016/5/13/chartex" xmlns:cx8="http://schemas.microsoft.com/office/drawing/2016/5/14/chartex" xmlns:mc="http://schemas.openxmlformats.org/markup-compatibility/2006" xmlns:aink="http://schemas.microsoft.com/office/drawing/2016/ink" xmlns:am3d="http://schemas.microsoft.com/office/drawing/2017/model3d" xmlns:o="urn:schemas-microsoft-com:office:office" xmlns:oel="http://schemas.microsoft.com/office/2019/extlst" xmlns:r="http://schemas.openxmlformats.org/officeDocument/2006/relationships" xmlns:m="http://schemas.openxmlformats.org/officeDocument/2006/math" xmlns:v="urn:schemas-microsoft-com:vml" xmlns:wp14="http://schemas.microsoft.com/office/word/2010/wordprocessingDrawing" xmlns:wp="http://schemas.openxmlformats.org/drawingml/2006/wordprocessingDrawing" xmlns:w10="urn:schemas-microsoft-com:office:word" xmlns:w="http://schemas.openxmlformats.org/wordprocessingml/2006/main" xmlns:w14="http://schemas.microsoft.com/office/word/2010/wordml" xmlns:w15="http://schemas.microsoft.com/office/word/2012/wordml" xmlns:w16cex="http://schemas.microsoft.com/office/word/2018/wordml/cex" xmlns:w16cid="http://schemas.microsoft.com/office/word/2016/wordml/cid" xmlns:w16="http://schemas.microsoft.com/office/word/2018/wordml" xmlns:w16du="http://schemas.microsoft.com/office/word/2023/wordml/word16du" xmlns:w16sdtdh="http://schemas.microsoft.com/office/word/2020/wordml/sdtdatahash" xmlns:w16sdtfl="http://schemas.microsoft.com/office/word/2024/wordml/sdtformatlock" xmlns:w16se="http://schemas.microsoft.com/office/word/2015/wordml/symex" xmlns:wpg="http://schemas.microsoft.com/office/word/2010/wordprocessingGroup" xmlns:wpi="http://schemas.microsoft.com/office/word/2010/wordprocessingInk" xmlns:wne="http://schemas.microsoft.com/office/word/2006/wordml" xmlns:wps="http://schemas.microsoft.com/office/word/2010/wordprocessingShape" mc:Ignorable="w14 w15 w16se w16cid w16 w16cex w16sdtdh w16sdtfl w16du wp14">
+<w:glossaryDocument xmlns:wpc="http://schemas.microsoft.com/office/word/2010/wordprocessingCanvas" xmlns:cx="http://schemas.microsoft.com/office/drawing/2014/chartex" xmlns:cx1="http://schemas.microsoft.com/office/drawing/2015/9/8/chartex" xmlns:cx2="http://schemas.microsoft.com/office/drawing/2015/10/21/chartex" xmlns:cx3="http://schemas.microsoft.com/office/drawing/2016/5/9/chartex" xmlns:cx4="http://schemas.microsoft.com/office/drawing/2016/5/10/chartex" xmlns:cx5="http://schemas.microsoft.com/office/drawing/2016/5/11/chartex" xmlns:cx6="http://schemas.microsoft.com/office/drawing/2016/5/12/chartex" xmlns:cx7="http://schemas.microsoft.com/office/drawing/2016/5/13/chartex" xmlns:cx8="http://schemas.microsoft.com/office/drawing/2016/5/14/chartex" xmlns:mc="http://schemas.openxmlformats.org/markup-compatibility/2006" xmlns:aink="http://schemas.microsoft.com/office/drawing/2016/ink" xmlns:am3d="http://schemas.microsoft.com/office/drawing/2017/model3d" xmlns:o="urn:schemas-microsoft-com:office:office" xmlns:oel="http://schemas.microsoft.com/office/2019/extlst" xmlns:r="http://schemas.openxmlformats.org/officeDocument/2006/relationships" xmlns:m="http://schemas.openxmlformats.org/officeDocument/2006/math" xmlns:v="urn:schemas-microsoft-com:vml" xmlns:wp14="http://schemas.microsoft.com/office/word/2010/wordprocessingDrawing" xmlns:wp="http://schemas.openxmlformats.org/drawingml/2006/wordprocessingDrawing" xmlns:w10="urn:schemas-microsoft-com:office:word" xmlns:w="http://schemas.openxmlformats.org/wordprocessingml/2006/main" xmlns:w14="http://schemas.microsoft.com/office/word/2010/wordml" xmlns:w15="http://schemas.microsoft.com/office/word/2012/wordml" xmlns:w16cei="http://schemas.microsoft.com/office/word/2026/wordml/cei" xmlns:w16cex="http://schemas.microsoft.com/office/word/2018/wordml/cex" xmlns:w16cid="http://schemas.microsoft.com/office/word/2016/wordml/cid" xmlns:w16="http://schemas.microsoft.com/office/word/2018/wordml" xmlns:w16du="http://schemas.microsoft.com/office/word/2023/wordml/word16du" xmlns:w16sdtdh="http://schemas.microsoft.com/office/word/2020/wordml/sdtdatahash" xmlns:w16sdtfl="http://schemas.microsoft.com/office/word/2024/wordml/sdtformatlock" xmlns:w16se="http://schemas.microsoft.com/office/word/2015/wordml/symex" xmlns:wpg="http://schemas.microsoft.com/office/word/2010/wordprocessingGroup" xmlns:wpi="http://schemas.microsoft.com/office/word/2010/wordprocessingInk" xmlns:wne="http://schemas.microsoft.com/office/word/2006/wordml" xmlns:wps="http://schemas.microsoft.com/office/word/2010/wordprocessingShape" mc:Ignorable="w14 w15 w16se w16cid w16 w16cex w16sdtdh w16sdtfl w16du wp14">
   <w:docParts>
     <w:docPart>
       <w:docPartPr>
@@ -7401,36 +7992,7 @@
           </w:pPr>
           <w:r>
             <w:rPr>
-              <w:rStyle w:val="Textodelmarcadordeposicin"/>
-            </w:rPr>
-            <w:t>Elija un elemento.</w:t>
-          </w:r>
-        </w:p>
-      </w:docPartBody>
-    </w:docPart>
-    <w:docPart>
-      <w:docPartPr>
-        <w:name w:val="0F5457153D7A48E59AF431630B998C8C"/>
-        <w:category>
-          <w:name w:val="General"/>
-          <w:gallery w:val="placeholder"/>
-        </w:category>
-        <w:types>
-          <w:type w:val="bbPlcHdr"/>
-        </w:types>
-        <w:behaviors>
-          <w:behavior w:val="content"/>
-        </w:behaviors>
-        <w:guid w:val="{2F049648-5B9C-49E9-8C73-7F5140B886C5}"/>
-      </w:docPartPr>
-      <w:docPartBody>
-        <w:p>
-          <w:pPr>
-            <w:pStyle w:val="0F5457153D7A48E59AF431630B998C8C"/>
-          </w:pPr>
-          <w:r>
-            <w:rPr>
-              <w:rStyle w:val="Textodelmarcadordeposicin"/>
+              <w:rStyle w:val="PlaceholderText"/>
             </w:rPr>
             <w:t>Elija un elemento.</w:t>
           </w:r>
@@ -7573,6 +8135,7 @@
     <w:rsid w:val="003C1FEE"/>
     <w:rsid w:val="00425ED8"/>
     <w:rsid w:val="005162DC"/>
+    <w:rsid w:val="00533C80"/>
     <w:rsid w:val="005527CD"/>
     <w:rsid w:val="00575EF9"/>
     <w:rsid w:val="005B49E5"/>
@@ -7595,6 +8158,7 @@
     <w:rsid w:val="00A855DB"/>
     <w:rsid w:val="00AD0905"/>
     <w:rsid w:val="00BA6DC7"/>
+    <w:rsid w:val="00BC2F59"/>
     <w:rsid w:val="00BD3EA2"/>
     <w:rsid w:val="00C83BA2"/>
     <w:rsid w:val="00CF1F3E"/>
@@ -7624,8 +8188,8 @@
   </m:mathPr>
   <w:themeFontLang w:val="es-CO" w:eastAsia="ja-JP" w:bidi="ar-SA"/>
   <w:clrSchemeMapping w:bg1="light1" w:t1="dark1" w:bg2="light2" w:t2="dark2" w:accent1="accent1" w:accent2="accent2" w:accent3="accent3" w:accent4="accent4" w:accent5="accent5" w:accent6="accent6" w:hyperlink="hyperlink" w:followedHyperlink="followedHyperlink"/>
-  <w:decimalSymbol w:val=","/>
-  <w:listSeparator w:val=";"/>
+  <w:decimalSymbol w:val="."/>
+  <w:listSeparator w:val=","/>
   <w15:chartTrackingRefBased/>
 </w:settings>
 </file>
@@ -8031,13 +8595,13 @@
     <w:name w:val="Normal"/>
     <w:qFormat/>
   </w:style>
-  <w:style w:type="character" w:default="1" w:styleId="Fuentedeprrafopredeter">
+  <w:style w:type="character" w:default="1" w:styleId="DefaultParagraphFont">
     <w:name w:val="Default Paragraph Font"/>
     <w:uiPriority w:val="1"/>
     <w:semiHidden/>
     <w:unhideWhenUsed/>
   </w:style>
-  <w:style w:type="table" w:default="1" w:styleId="Tablanormal">
+  <w:style w:type="table" w:default="1" w:styleId="TableNormal">
     <w:name w:val="Normal Table"/>
     <w:uiPriority w:val="99"/>
     <w:semiHidden/>
@@ -8052,15 +8616,15 @@
       </w:tblCellMar>
     </w:tblPr>
   </w:style>
-  <w:style w:type="numbering" w:default="1" w:styleId="Sinlista">
+  <w:style w:type="numbering" w:default="1" w:styleId="NoList">
     <w:name w:val="No List"/>
     <w:uiPriority w:val="99"/>
     <w:semiHidden/>
     <w:unhideWhenUsed/>
   </w:style>
-  <w:style w:type="character" w:styleId="Textodelmarcadordeposicin">
+  <w:style w:type="character" w:styleId="PlaceholderText">
     <w:name w:val="Placeholder Text"/>
-    <w:basedOn w:val="Fuentedeprrafopredeter"/>
+    <w:basedOn w:val="DefaultParagraphFont"/>
     <w:uiPriority w:val="99"/>
     <w:semiHidden/>
     <w:rsid w:val="008D06CC"/>
@@ -8400,27 +8964,6 @@
 </file>
 
 <file path=customXml/item1.xml><?xml version="1.0" encoding="utf-8"?>
-<?mso-contentType ?>
-<FormTemplates xmlns="http://schemas.microsoft.com/sharepoint/v3/contenttype/forms">
-  <Display>DocumentLibraryForm</Display>
-  <Edit>DocumentLibraryForm</Edit>
-  <New>DocumentLibraryForm</New>
-</FormTemplates>
-</file>
-
-<file path=customXml/item2.xml><?xml version="1.0" encoding="utf-8"?>
-<p:properties xmlns:p="http://schemas.microsoft.com/office/2006/metadata/properties" xmlns:xsi="http://www.w3.org/2001/XMLSchema-instance" xmlns:pc="http://schemas.microsoft.com/office/infopath/2007/PartnerControls">
-  <documentManagement>
-    <_activity xmlns="66e13a6b-7d9a-4b15-b0f8-f6f14db1d2c1" xsi:nil="true"/>
-  </documentManagement>
-</p:properties>
-</file>
-
-<file path=customXml/item3.xml><?xml version="1.0" encoding="utf-8"?>
-<b:Sources xmlns:b="http://schemas.openxmlformats.org/officeDocument/2006/bibliography" xmlns="http://schemas.openxmlformats.org/officeDocument/2006/bibliography" SelectedStyle="\APASixthEditionOfficeOnline.xsl" StyleName="APA" Version="6"/>
-</file>
-
-<file path=customXml/item4.xml><?xml version="1.0" encoding="utf-8"?>
 <ct:contentTypeSchema xmlns:ct="http://schemas.microsoft.com/office/2006/metadata/contentType" xmlns:ma="http://schemas.microsoft.com/office/2006/metadata/properties/metaAttributes" ct:_="" ma:_="" ma:contentTypeName="Documento" ma:contentTypeID="0x01010088833D1D8AB7D24A9B5F46B140DFE9C1" ma:contentTypeVersion="13" ma:contentTypeDescription="Crear nuevo documento." ma:contentTypeScope="" ma:versionID="974c367f56bfabab87da413904a41243">
   <xsd:schema xmlns:xsd="http://www.w3.org/2001/XMLSchema" xmlns:xs="http://www.w3.org/2001/XMLSchema" xmlns:p="http://schemas.microsoft.com/office/2006/metadata/properties" xmlns:ns3="66e13a6b-7d9a-4b15-b0f8-f6f14db1d2c1" targetNamespace="http://schemas.microsoft.com/office/2006/metadata/properties" ma:root="true" ma:fieldsID="d9622a0d0f7c8a3685dc87e1536a1d32" ns3:_="">
     <xsd:import namespace="66e13a6b-7d9a-4b15-b0f8-f6f14db1d2c1"/>
@@ -8620,33 +9163,28 @@
 </ct:contentTypeSchema>
 </file>
 
-<file path=customXml/itemProps1.xml><?xml version="1.0" encoding="utf-8"?>
-<ds:datastoreItem xmlns:ds="http://schemas.openxmlformats.org/officeDocument/2006/customXml" ds:itemID="{98654C01-BC7D-49C6-9B89-6BB22AB9AD7D}">
-  <ds:schemaRefs>
-    <ds:schemaRef ds:uri="http://schemas.microsoft.com/sharepoint/v3/contenttype/forms"/>
-  </ds:schemaRefs>
-</ds:datastoreItem>
+<file path=customXml/item2.xml><?xml version="1.0" encoding="utf-8"?>
+<b:Sources xmlns:b="http://schemas.openxmlformats.org/officeDocument/2006/bibliography" xmlns="http://schemas.openxmlformats.org/officeDocument/2006/bibliography" SelectedStyle="\APASixthEditionOfficeOnline.xsl" StyleName="APA" Version="6"/>
 </file>
 
-<file path=customXml/itemProps2.xml><?xml version="1.0" encoding="utf-8"?>
-<ds:datastoreItem xmlns:ds="http://schemas.openxmlformats.org/officeDocument/2006/customXml" ds:itemID="{313D80A4-1011-4E08-B1E1-6C8621343D63}">
-  <ds:schemaRefs>
-    <ds:schemaRef ds:uri="http://schemas.microsoft.com/office/2006/metadata/properties"/>
-    <ds:schemaRef ds:uri="http://schemas.microsoft.com/office/infopath/2007/PartnerControls"/>
-    <ds:schemaRef ds:uri="66e13a6b-7d9a-4b15-b0f8-f6f14db1d2c1"/>
-  </ds:schemaRefs>
-</ds:datastoreItem>
+<file path=customXml/item3.xml><?xml version="1.0" encoding="utf-8"?>
+<p:properties xmlns:p="http://schemas.microsoft.com/office/2006/metadata/properties" xmlns:xsi="http://www.w3.org/2001/XMLSchema-instance" xmlns:pc="http://schemas.microsoft.com/office/infopath/2007/PartnerControls">
+  <documentManagement>
+    <_activity xmlns="66e13a6b-7d9a-4b15-b0f8-f6f14db1d2c1" xsi:nil="true"/>
+  </documentManagement>
+</p:properties>
 </file>
 
-<file path=customXml/itemProps3.xml><?xml version="1.0" encoding="utf-8"?>
-<ds:datastoreItem xmlns:ds="http://schemas.openxmlformats.org/officeDocument/2006/customXml" ds:itemID="{8F4D319A-E618-4CDC-B224-859E9167E0F4}">
-  <ds:schemaRefs>
-    <ds:schemaRef ds:uri="http://schemas.openxmlformats.org/officeDocument/2006/bibliography"/>
-  </ds:schemaRefs>
-</ds:datastoreItem>
+<file path=customXml/item4.xml><?xml version="1.0" encoding="utf-8"?>
+<?mso-contentType ?>
+<FormTemplates xmlns="http://schemas.microsoft.com/sharepoint/v3/contenttype/forms">
+  <Display>DocumentLibraryForm</Display>
+  <Edit>DocumentLibraryForm</Edit>
+  <New>DocumentLibraryForm</New>
+</FormTemplates>
 </file>
 
-<file path=customXml/itemProps4.xml><?xml version="1.0" encoding="utf-8"?>
+<file path=customXml/itemProps1.xml><?xml version="1.0" encoding="utf-8"?>
 <ds:datastoreItem xmlns:ds="http://schemas.openxmlformats.org/officeDocument/2006/customXml" ds:itemID="{0B97CC59-67B0-4068-82B6-87B6A36A45EE}">
   <ds:schemaRefs>
     <ds:schemaRef ds:uri="http://schemas.microsoft.com/office/2006/metadata/contentType"/>
@@ -8662,4 +9200,30 @@
     <ds:schemaRef ds:uri="http://schemas.microsoft.com/internal/obd"/>
   </ds:schemaRefs>
 </ds:datastoreItem>
+</file>
+
+<file path=customXml/itemProps2.xml><?xml version="1.0" encoding="utf-8"?>
+<ds:datastoreItem xmlns:ds="http://schemas.openxmlformats.org/officeDocument/2006/customXml" ds:itemID="{8F4D319A-E618-4CDC-B224-859E9167E0F4}">
+  <ds:schemaRefs>
+    <ds:schemaRef ds:uri="http://schemas.openxmlformats.org/officeDocument/2006/bibliography"/>
+  </ds:schemaRefs>
+</ds:datastoreItem>
+</file>
+
+<file path=customXml/itemProps3.xml><?xml version="1.0" encoding="utf-8"?>
+<ds:datastoreItem xmlns:ds="http://schemas.openxmlformats.org/officeDocument/2006/customXml" ds:itemID="{313D80A4-1011-4E08-B1E1-6C8621343D63}">
+  <ds:schemaRefs>
+    <ds:schemaRef ds:uri="http://schemas.microsoft.com/office/2006/metadata/properties"/>
+    <ds:schemaRef ds:uri="http://schemas.microsoft.com/office/infopath/2007/PartnerControls"/>
+    <ds:schemaRef ds:uri="66e13a6b-7d9a-4b15-b0f8-f6f14db1d2c1"/>
+  </ds:schemaRefs>
+</ds:datastoreItem>
+</file>
+
+<file path=customXml/itemProps4.xml><?xml version="1.0" encoding="utf-8"?>
+<ds:datastoreItem xmlns:ds="http://schemas.openxmlformats.org/officeDocument/2006/customXml" ds:itemID="{98654C01-BC7D-49C6-9B89-6BB22AB9AD7D}">
+  <ds:schemaRefs>
+    <ds:schemaRef ds:uri="http://schemas.microsoft.com/sharepoint/v3/contenttype/forms"/>
+  </ds:schemaRefs>
+</ds:datastoreItem>
 </file>
</xml_diff>